<commit_message>
Finished base UI. Background and basic navigation bar completed. Icons for the nav bar are a work in progress.
</commit_message>
<xml_diff>
--- a/Logs.docx
+++ b/Logs.docx
@@ -486,13 +486,8 @@
         </w:numPr>
       </w:pPr>
       <w:r>
-        <w:t xml:space="preserve">Able to send a MIDI </w:t>
-      </w:r>
-      <w:proofErr w:type="gramStart"/>
-      <w:r>
-        <w:t>CC(</w:t>
-      </w:r>
-      <w:proofErr w:type="gramEnd"/>
+        <w:t>Able to send a MIDI CC(</w:t>
+      </w:r>
       <w:r>
         <w:t>control change</w:t>
       </w:r>
@@ -629,7 +624,6 @@
         </w:rPr>
         <w:t xml:space="preserve">Setting up </w:t>
       </w:r>
-      <w:proofErr w:type="spellStart"/>
       <w:r>
         <w:rPr>
           <w:b/>
@@ -642,15 +636,7 @@
           <w:b/>
           <w:bCs/>
         </w:rPr>
-        <w:t>ediapipe</w:t>
-      </w:r>
-      <w:proofErr w:type="spellEnd"/>
-      <w:r>
-        <w:rPr>
-          <w:b/>
-          <w:bCs/>
-        </w:rPr>
-        <w:t xml:space="preserve"> for face-tracking</w:t>
+        <w:t>ediapipe for face-tracking</w:t>
       </w:r>
       <w:r>
         <w:rPr>
@@ -669,26 +655,10 @@
         </w:numPr>
       </w:pPr>
       <w:r>
-        <w:t xml:space="preserve">I will be using </w:t>
-      </w:r>
-      <w:proofErr w:type="spellStart"/>
-      <w:r>
-        <w:t>Mediapipe</w:t>
-      </w:r>
-      <w:proofErr w:type="spellEnd"/>
-      <w:r>
-        <w:t xml:space="preserve"> tasks with the face </w:t>
-      </w:r>
-      <w:proofErr w:type="spellStart"/>
-      <w:r>
-        <w:t>landmark</w:t>
-      </w:r>
-      <w:r>
-        <w:t>er</w:t>
-      </w:r>
-      <w:proofErr w:type="spellEnd"/>
-      <w:r>
-        <w:t xml:space="preserve"> model to allow the tracking of the lips.</w:t>
+        <w:t>I will be using Mediapipe tasks with the face landmark</w:t>
+      </w:r>
+      <w:r>
+        <w:t>er model to allow the tracking of the lips.</w:t>
       </w:r>
     </w:p>
     <w:p>
@@ -901,13 +871,8 @@
         </w:numPr>
       </w:pPr>
       <w:r>
-        <w:t>Mido in combination with python-</w:t>
-      </w:r>
-      <w:proofErr w:type="spellStart"/>
-      <w:r>
-        <w:t>rtmidi</w:t>
-      </w:r>
-      <w:proofErr w:type="spellEnd"/>
+        <w:t>Mido in combination with python-rtmidi</w:t>
+      </w:r>
     </w:p>
     <w:p>
       <w:pPr>
@@ -918,13 +883,8 @@
         </w:numPr>
       </w:pPr>
       <w:r>
-        <w:t>Just with python-</w:t>
-      </w:r>
-      <w:proofErr w:type="spellStart"/>
-      <w:r>
-        <w:t>rtmidi</w:t>
-      </w:r>
-      <w:proofErr w:type="spellEnd"/>
+        <w:t>Just with python-rtmidi</w:t>
+      </w:r>
     </w:p>
     <w:p>
       <w:pPr>
@@ -934,13 +894,8 @@
           <w:numId w:val="8"/>
         </w:numPr>
       </w:pPr>
-      <w:proofErr w:type="spellStart"/>
-      <w:r>
-        <w:t>Pygame’s</w:t>
-      </w:r>
-      <w:proofErr w:type="spellEnd"/>
-      <w:r>
-        <w:t xml:space="preserve"> </w:t>
+      <w:r>
+        <w:t xml:space="preserve">Pygame’s </w:t>
       </w:r>
       <w:r>
         <w:t>built in</w:t>
@@ -970,42 +925,16 @@
         <w:t xml:space="preserve">Mido </w:t>
       </w:r>
       <w:r>
-        <w:t>still uses python-</w:t>
-      </w:r>
-      <w:proofErr w:type="spellStart"/>
-      <w:r>
-        <w:t>rtmidi</w:t>
-      </w:r>
-      <w:proofErr w:type="spellEnd"/>
-      <w:r>
-        <w:t>, it just acts as a wrapper to make python-</w:t>
-      </w:r>
-      <w:proofErr w:type="spellStart"/>
-      <w:r>
-        <w:t>rtmidi</w:t>
-      </w:r>
-      <w:proofErr w:type="spellEnd"/>
-      <w:r>
-        <w:t xml:space="preserve"> easier to work with</w:t>
+        <w:t>still uses python-rtmidi</w:t>
+      </w:r>
+      <w:r>
+        <w:t>, it just acts as a wrapper to make python-rtmidi easier to work with</w:t>
       </w:r>
       <w:r>
         <w:t xml:space="preserve">. This and </w:t>
       </w:r>
-      <w:proofErr w:type="spellStart"/>
-      <w:r>
-        <w:t>Pygame</w:t>
-      </w:r>
-      <w:proofErr w:type="spellEnd"/>
-      <w:r>
-        <w:t xml:space="preserve"> MIDI are the simplest to use, but </w:t>
-      </w:r>
-      <w:proofErr w:type="spellStart"/>
-      <w:r>
-        <w:t>Pygame</w:t>
-      </w:r>
-      <w:proofErr w:type="spellEnd"/>
-      <w:r>
-        <w:t xml:space="preserve"> is less suited for my use case because</w:t>
+      <w:r>
+        <w:t>Pygame MIDI are the simplest to use, but Pygame is less suited for my use case because</w:t>
       </w:r>
       <w:r>
         <w:t xml:space="preserve"> it is primarily for game windows. </w:t>
@@ -1014,15 +943,7 @@
         <w:t>So,</w:t>
       </w:r>
       <w:r>
-        <w:t xml:space="preserve"> I will use Mido and python-</w:t>
-      </w:r>
-      <w:proofErr w:type="spellStart"/>
-      <w:r>
-        <w:t>rtmidi</w:t>
-      </w:r>
-      <w:proofErr w:type="spellEnd"/>
-      <w:r>
-        <w:t xml:space="preserve"> to send MIDI signals to my guitar plugin.</w:t>
+        <w:t xml:space="preserve"> I will use Mido and python-rtmidi to send MIDI signals to my guitar plugin.</w:t>
       </w:r>
     </w:p>
     <w:p>
@@ -1080,13 +1001,8 @@
           <w:numId w:val="8"/>
         </w:numPr>
       </w:pPr>
-      <w:proofErr w:type="gramStart"/>
-      <w:r>
-        <w:t>Reaper(</w:t>
-      </w:r>
-      <w:proofErr w:type="gramEnd"/>
-      <w:r>
-        <w:t xml:space="preserve">the audio software I’m using) cannot </w:t>
+      <w:r>
+        <w:t xml:space="preserve">Reaper(the audio software I’m using) cannot </w:t>
       </w:r>
       <w:r>
         <w:t xml:space="preserve">receive MIDI signals straight from </w:t>
@@ -1095,23 +1011,7 @@
         <w:t>P</w:t>
       </w:r>
       <w:r>
-        <w:t xml:space="preserve">ython, it </w:t>
-      </w:r>
-      <w:proofErr w:type="gramStart"/>
-      <w:r>
-        <w:t>has to</w:t>
-      </w:r>
-      <w:proofErr w:type="gramEnd"/>
-      <w:r>
-        <w:t xml:space="preserve"> pass through a virtual MIDI cable first. For the virtual MIDI cable, I will be using </w:t>
-      </w:r>
-      <w:proofErr w:type="spellStart"/>
-      <w:r>
-        <w:t>loopMIDI</w:t>
-      </w:r>
-      <w:proofErr w:type="spellEnd"/>
-      <w:r>
-        <w:t>.</w:t>
+        <w:t>ython, it has to pass through a virtual MIDI cable first. For the virtual MIDI cable, I will be using loopMIDI.</w:t>
       </w:r>
     </w:p>
     <w:p>
@@ -1249,15 +1149,7 @@
         <w:t xml:space="preserve">Having an issue where it says </w:t>
       </w:r>
       <w:r>
-        <w:t>there is no port named ‘</w:t>
-      </w:r>
-      <w:proofErr w:type="spellStart"/>
-      <w:r>
-        <w:t>pythonmidi</w:t>
-      </w:r>
-      <w:proofErr w:type="spellEnd"/>
-      <w:r>
-        <w:t xml:space="preserve">’ even though it is exactly what I named the </w:t>
+        <w:t xml:space="preserve">there is no port named ‘pythonmidi’ even though it is exactly what I named the </w:t>
       </w:r>
       <w:r>
         <w:t>virtual MIDI cable.</w:t>
@@ -1366,23 +1258,10 @@
         </w:numPr>
       </w:pPr>
       <w:r>
-        <w:t xml:space="preserve">Got Mido to the name of every open MIDI port on my laptop. And it turns out that the port is </w:t>
-      </w:r>
-      <w:proofErr w:type="gramStart"/>
-      <w:r>
-        <w:t>actually named</w:t>
-      </w:r>
-      <w:proofErr w:type="gramEnd"/>
-      <w:r>
-        <w:t xml:space="preserve"> ‘</w:t>
-      </w:r>
-      <w:proofErr w:type="spellStart"/>
-      <w:r>
-        <w:t>pythonmidi</w:t>
-      </w:r>
-      <w:proofErr w:type="spellEnd"/>
-      <w:r>
-        <w:t xml:space="preserve"> 1’</w:t>
+        <w:t>Got Mido to the name of every open MIDI port on my laptop. And it turns out that the port is actually named</w:t>
+      </w:r>
+      <w:r>
+        <w:t xml:space="preserve"> ‘pythonmidi 1’</w:t>
       </w:r>
     </w:p>
     <w:p>
@@ -1565,15 +1444,7 @@
         </w:numPr>
       </w:pPr>
       <w:r>
-        <w:t xml:space="preserve">Picture showing </w:t>
-      </w:r>
-      <w:proofErr w:type="spellStart"/>
-      <w:r>
-        <w:t>loopMIDI</w:t>
-      </w:r>
-      <w:proofErr w:type="spellEnd"/>
-      <w:r>
-        <w:t xml:space="preserve"> detecting the MIDI messages being sent through the virtual MIDI port:</w:t>
+        <w:t>Picture showing loopMIDI detecting the MIDI messages being sent through the virtual MIDI port:</w:t>
       </w:r>
     </w:p>
     <w:p>
@@ -1747,16 +1618,11 @@
       <w:r>
         <w:t xml:space="preserve">having </w:t>
       </w:r>
-      <w:proofErr w:type="gramStart"/>
       <w:r>
         <w:t>Reaper</w:t>
       </w:r>
       <w:r>
-        <w:t>(</w:t>
-      </w:r>
-      <w:proofErr w:type="gramEnd"/>
-      <w:r>
-        <w:t>my guitar software)</w:t>
+        <w:t>(my guitar software)</w:t>
       </w:r>
       <w:r>
         <w:t xml:space="preserve"> </w:t>
@@ -1813,15 +1679,7 @@
         <w:t xml:space="preserve">he guitar plugin should automatically detect the message and map it to </w:t>
       </w:r>
       <w:r>
-        <w:t xml:space="preserve">the pedal I have </w:t>
-      </w:r>
-      <w:proofErr w:type="gramStart"/>
-      <w:r>
-        <w:t>chosen,</w:t>
-      </w:r>
-      <w:proofErr w:type="gramEnd"/>
-      <w:r>
-        <w:t xml:space="preserve"> however</w:t>
+        <w:t>the pedal I have chosen, however</w:t>
       </w:r>
       <w:r>
         <w:t>,</w:t>
@@ -2287,13 +2145,8 @@
         <w:t>Duplicated the Python file</w:t>
       </w:r>
       <w:r>
-        <w:t xml:space="preserve"> with </w:t>
-      </w:r>
-      <w:proofErr w:type="spellStart"/>
-      <w:r>
-        <w:t>mediapipe</w:t>
-      </w:r>
-      <w:proofErr w:type="spellEnd"/>
+        <w:t xml:space="preserve"> with mediapipe</w:t>
+      </w:r>
       <w:r>
         <w:t xml:space="preserve">, I will use </w:t>
       </w:r>
@@ -2485,15 +2338,7 @@
         <w:t>is not affected by the minimum lip distance</w:t>
       </w:r>
       <w:r>
-        <w:t xml:space="preserve">. </w:t>
-      </w:r>
-      <w:proofErr w:type="gramStart"/>
-      <w:r>
-        <w:t>So</w:t>
-      </w:r>
-      <w:proofErr w:type="gramEnd"/>
-      <w:r>
-        <w:t xml:space="preserve"> it’s not very helpful.</w:t>
+        <w:t>. So it’s not very helpful.</w:t>
       </w:r>
     </w:p>
     <w:p>
@@ -3011,34 +2856,176 @@
         </w:numPr>
       </w:pPr>
       <w:r>
-        <w:t xml:space="preserve">Using </w:t>
-      </w:r>
-      <w:proofErr w:type="spellStart"/>
-      <w:proofErr w:type="gramStart"/>
-      <w:r>
-        <w:t>ui.tabs</w:t>
-      </w:r>
-      <w:proofErr w:type="spellEnd"/>
-      <w:proofErr w:type="gramEnd"/>
-      <w:r>
-        <w:t xml:space="preserve"> doesn’t quite give me the </w:t>
-      </w:r>
-      <w:r>
-        <w:t xml:space="preserve">look I </w:t>
-      </w:r>
-      <w:proofErr w:type="gramStart"/>
-      <w:r>
-        <w:t>want,</w:t>
-      </w:r>
-      <w:proofErr w:type="gramEnd"/>
-      <w:r>
-        <w:t xml:space="preserve"> I’m going to switch to using buttons so I can have more control over how they look.</w:t>
-      </w:r>
-    </w:p>
-    <w:p>
-      <w:pPr>
-        <w:pStyle w:val="ListParagraph"/>
-      </w:pPr>
+        <w:t xml:space="preserve">Using ui.tabs doesn’t quite give me the </w:t>
+      </w:r>
+      <w:r>
+        <w:t>look I want, I’m going to switch to using buttons so I can have more control over how they look.</w:t>
+      </w:r>
+    </w:p>
+    <w:p>
+      <w:pPr>
+        <w:pStyle w:val="ListParagraph"/>
+      </w:pPr>
+      <w:r>
+        <w:drawing>
+          <wp:inline distT="0" distB="0" distL="0" distR="0" wp14:anchorId="44991FD2" wp14:editId="58BC5B20">
+            <wp:extent cx="3644219" cy="2066376"/>
+            <wp:effectExtent l="0" t="0" r="0" b="0"/>
+            <wp:docPr id="1435066101" name="Picture 1"/>
+            <wp:cNvGraphicFramePr>
+              <a:graphicFrameLocks xmlns:a="http://schemas.openxmlformats.org/drawingml/2006/main" noChangeAspect="1"/>
+            </wp:cNvGraphicFramePr>
+            <a:graphic xmlns:a="http://schemas.openxmlformats.org/drawingml/2006/main">
+              <a:graphicData uri="http://schemas.openxmlformats.org/drawingml/2006/picture">
+                <pic:pic xmlns:pic="http://schemas.openxmlformats.org/drawingml/2006/picture">
+                  <pic:nvPicPr>
+                    <pic:cNvPr id="1435066101" name=""/>
+                    <pic:cNvPicPr/>
+                  </pic:nvPicPr>
+                  <pic:blipFill>
+                    <a:blip r:embed="rId36"/>
+                    <a:stretch>
+                      <a:fillRect/>
+                    </a:stretch>
+                  </pic:blipFill>
+                  <pic:spPr>
+                    <a:xfrm>
+                      <a:off x="0" y="0"/>
+                      <a:ext cx="3648607" cy="2068864"/>
+                    </a:xfrm>
+                    <a:prstGeom prst="rect">
+                      <a:avLst/>
+                    </a:prstGeom>
+                  </pic:spPr>
+                </pic:pic>
+              </a:graphicData>
+            </a:graphic>
+          </wp:inline>
+        </w:drawing>
+      </w:r>
+    </w:p>
+    <w:p>
+      <w:r>
+        <w:br w:type="page"/>
+      </w:r>
+    </w:p>
+    <w:p>
+      <w:pPr>
+        <w:pStyle w:val="ListParagraph"/>
+        <w:numPr>
+          <w:ilvl w:val="0"/>
+          <w:numId w:val="10"/>
+        </w:numPr>
+      </w:pPr>
+      <w:r>
+        <w:lastRenderedPageBreak/>
+        <w:t>Utilising flexbox</w:t>
+      </w:r>
+      <w:r>
+        <w:t xml:space="preserve"> grid to get buttons to fill up the navigation bar</w:t>
+      </w:r>
+    </w:p>
+    <w:p>
+      <w:pPr>
+        <w:pStyle w:val="ListParagraph"/>
+      </w:pPr>
+      <w:hyperlink r:id="rId37" w:history="1">
+        <w:r>
+          <w:rPr>
+            <w:rStyle w:val="Hyperlink"/>
+          </w:rPr>
+          <w:t>https://tailwindcss.com/docs/grid-column</w:t>
+        </w:r>
+      </w:hyperlink>
+    </w:p>
+    <w:p>
+      <w:pPr>
+        <w:pStyle w:val="ListParagraph"/>
+      </w:pPr>
+    </w:p>
+    <w:p>
+      <w:pPr>
+        <w:pStyle w:val="ListParagraph"/>
+      </w:pPr>
+      <w:r>
+        <w:drawing>
+          <wp:inline distT="0" distB="0" distL="0" distR="0" wp14:anchorId="36387847" wp14:editId="0CCB7228">
+            <wp:extent cx="4469409" cy="1823713"/>
+            <wp:effectExtent l="0" t="0" r="7620" b="5715"/>
+            <wp:docPr id="748271032" name="Picture 1"/>
+            <wp:cNvGraphicFramePr>
+              <a:graphicFrameLocks xmlns:a="http://schemas.openxmlformats.org/drawingml/2006/main" noChangeAspect="1"/>
+            </wp:cNvGraphicFramePr>
+            <a:graphic xmlns:a="http://schemas.openxmlformats.org/drawingml/2006/main">
+              <a:graphicData uri="http://schemas.openxmlformats.org/drawingml/2006/picture">
+                <pic:pic xmlns:pic="http://schemas.openxmlformats.org/drawingml/2006/picture">
+                  <pic:nvPicPr>
+                    <pic:cNvPr id="748271032" name=""/>
+                    <pic:cNvPicPr/>
+                  </pic:nvPicPr>
+                  <pic:blipFill>
+                    <a:blip r:embed="rId38"/>
+                    <a:stretch>
+                      <a:fillRect/>
+                    </a:stretch>
+                  </pic:blipFill>
+                  <pic:spPr>
+                    <a:xfrm>
+                      <a:off x="0" y="0"/>
+                      <a:ext cx="4484773" cy="1829982"/>
+                    </a:xfrm>
+                    <a:prstGeom prst="rect">
+                      <a:avLst/>
+                    </a:prstGeom>
+                  </pic:spPr>
+                </pic:pic>
+              </a:graphicData>
+            </a:graphic>
+          </wp:inline>
+        </w:drawing>
+      </w:r>
+    </w:p>
+    <w:p>
+      <w:pPr>
+        <w:ind w:firstLine="720"/>
+      </w:pPr>
+      <w:r>
+        <w:drawing>
+          <wp:inline distT="0" distB="0" distL="0" distR="0" wp14:anchorId="3F5049C3" wp14:editId="59962900">
+            <wp:extent cx="4589842" cy="1796578"/>
+            <wp:effectExtent l="0" t="0" r="1270" b="0"/>
+            <wp:docPr id="942470924" name="Picture 1"/>
+            <wp:cNvGraphicFramePr>
+              <a:graphicFrameLocks xmlns:a="http://schemas.openxmlformats.org/drawingml/2006/main" noChangeAspect="1"/>
+            </wp:cNvGraphicFramePr>
+            <a:graphic xmlns:a="http://schemas.openxmlformats.org/drawingml/2006/main">
+              <a:graphicData uri="http://schemas.openxmlformats.org/drawingml/2006/picture">
+                <pic:pic xmlns:pic="http://schemas.openxmlformats.org/drawingml/2006/picture">
+                  <pic:nvPicPr>
+                    <pic:cNvPr id="942470924" name=""/>
+                    <pic:cNvPicPr/>
+                  </pic:nvPicPr>
+                  <pic:blipFill>
+                    <a:blip r:embed="rId39"/>
+                    <a:stretch>
+                      <a:fillRect/>
+                    </a:stretch>
+                  </pic:blipFill>
+                  <pic:spPr>
+                    <a:xfrm>
+                      <a:off x="0" y="0"/>
+                      <a:ext cx="4596038" cy="1799003"/>
+                    </a:xfrm>
+                    <a:prstGeom prst="rect">
+                      <a:avLst/>
+                    </a:prstGeom>
+                  </pic:spPr>
+                </pic:pic>
+              </a:graphicData>
+            </a:graphic>
+          </wp:inline>
+        </w:drawing>
+      </w:r>
     </w:p>
     <w:sectPr>
       <w:pgSz w:w="11906" w:h="16838"/>
@@ -4009,7 +3996,7 @@
   <w:abstractNum w:abstractNumId="8" w15:restartNumberingAfterBreak="0">
     <w:nsid w:val="61AD7F38"/>
     <w:multiLevelType w:val="hybridMultilevel"/>
-    <w:tmpl w:val="BA721F30"/>
+    <w:tmpl w:val="0D20044C"/>
     <w:lvl w:ilvl="0" w:tplc="14090001">
       <w:start w:val="1"/>
       <w:numFmt w:val="bullet"/>
@@ -5264,6 +5251,29 @@
     <w:uiPriority w:val="99"/>
     <w:rsid w:val="00450872"/>
   </w:style>
+  <w:style w:type="character" w:styleId="Hyperlink">
+    <w:name w:val="Hyperlink"/>
+    <w:basedOn w:val="DefaultParagraphFont"/>
+    <w:uiPriority w:val="99"/>
+    <w:unhideWhenUsed/>
+    <w:rsid w:val="00AA015D"/>
+    <w:rPr>
+      <w:color w:val="467886" w:themeColor="hyperlink"/>
+      <w:u w:val="single"/>
+    </w:rPr>
+  </w:style>
+  <w:style w:type="character" w:styleId="UnresolvedMention">
+    <w:name w:val="Unresolved Mention"/>
+    <w:basedOn w:val="DefaultParagraphFont"/>
+    <w:uiPriority w:val="99"/>
+    <w:semiHidden/>
+    <w:unhideWhenUsed/>
+    <w:rsid w:val="00AA015D"/>
+    <w:rPr>
+      <w:color w:val="605E5C"/>
+      <w:shd w:val="clear" w:color="auto" w:fill="E1DFDD"/>
+    </w:rPr>
+  </w:style>
 </w:styles>
 </file>
 

</xml_diff>

<commit_message>
Wah gauge finished. Settings menu in progress.
</commit_message>
<xml_diff>
--- a/Logs.docx
+++ b/Logs.docx
@@ -1,6 +1,6 @@
 
 <file path=word/document.xml><?xml version="1.0" encoding="utf-8"?>
-<w:document xmlns:wpc="http://schemas.microsoft.com/office/word/2010/wordprocessingCanvas" xmlns:cx="http://schemas.microsoft.com/office/drawing/2014/chartex" xmlns:cx1="http://schemas.microsoft.com/office/drawing/2015/9/8/chartex" xmlns:cx2="http://schemas.microsoft.com/office/drawing/2015/10/21/chartex" xmlns:cx3="http://schemas.microsoft.com/office/drawing/2016/5/9/chartex" xmlns:cx4="http://schemas.microsoft.com/office/drawing/2016/5/10/chartex" xmlns:cx5="http://schemas.microsoft.com/office/drawing/2016/5/11/chartex" xmlns:cx6="http://schemas.microsoft.com/office/drawing/2016/5/12/chartex" xmlns:cx7="http://schemas.microsoft.com/office/drawing/2016/5/13/chartex" xmlns:cx8="http://schemas.microsoft.com/office/drawing/2016/5/14/chartex" xmlns:mc="http://schemas.openxmlformats.org/markup-compatibility/2006" xmlns:aink="http://schemas.microsoft.com/office/drawing/2016/ink" xmlns:am3d="http://schemas.microsoft.com/office/drawing/2017/model3d" xmlns:o="urn:schemas-microsoft-com:office:office" xmlns:oel="http://schemas.microsoft.com/office/2019/extlst" xmlns:r="http://schemas.openxmlformats.org/officeDocument/2006/relationships" xmlns:m="http://schemas.openxmlformats.org/officeDocument/2006/math" xmlns:v="urn:schemas-microsoft-com:vml" xmlns:wp14="http://schemas.microsoft.com/office/word/2010/wordprocessingDrawing" xmlns:wp="http://schemas.openxmlformats.org/drawingml/2006/wordprocessingDrawing" xmlns:w10="urn:schemas-microsoft-com:office:word" xmlns:w="http://schemas.openxmlformats.org/wordprocessingml/2006/main" xmlns:w14="http://schemas.microsoft.com/office/word/2010/wordml" xmlns:w15="http://schemas.microsoft.com/office/word/2012/wordml" xmlns:w16cex="http://schemas.microsoft.com/office/word/2018/wordml/cex" xmlns:w16cid="http://schemas.microsoft.com/office/word/2016/wordml/cid" xmlns:w16="http://schemas.microsoft.com/office/word/2018/wordml" xmlns:w16du="http://schemas.microsoft.com/office/word/2023/wordml/word16du" xmlns:w16sdtdh="http://schemas.microsoft.com/office/word/2020/wordml/sdtdatahash" xmlns:w16sdtfl="http://schemas.microsoft.com/office/word/2024/wordml/sdtformatlock" xmlns:w16se="http://schemas.microsoft.com/office/word/2015/wordml/symex" xmlns:wpg="http://schemas.microsoft.com/office/word/2010/wordprocessingGroup" xmlns:wpi="http://schemas.microsoft.com/office/word/2010/wordprocessingInk" xmlns:wne="http://schemas.microsoft.com/office/word/2006/wordml" xmlns:wps="http://schemas.microsoft.com/office/word/2010/wordprocessingShape" mc:Ignorable="w14 w15 w16se w16cid w16 w16cex w16sdtdh w16sdtfl w16du wp14">
+<w:document xmlns:wpc="http://schemas.microsoft.com/office/word/2010/wordprocessingCanvas" xmlns:cx="http://schemas.microsoft.com/office/drawing/2014/chartex" xmlns:cx1="http://schemas.microsoft.com/office/drawing/2015/9/8/chartex" xmlns:cx2="http://schemas.microsoft.com/office/drawing/2015/10/21/chartex" xmlns:cx3="http://schemas.microsoft.com/office/drawing/2016/5/9/chartex" xmlns:cx4="http://schemas.microsoft.com/office/drawing/2016/5/10/chartex" xmlns:cx5="http://schemas.microsoft.com/office/drawing/2016/5/11/chartex" xmlns:cx6="http://schemas.microsoft.com/office/drawing/2016/5/12/chartex" xmlns:cx7="http://schemas.microsoft.com/office/drawing/2016/5/13/chartex" xmlns:cx8="http://schemas.microsoft.com/office/drawing/2016/5/14/chartex" xmlns:mc="http://schemas.openxmlformats.org/markup-compatibility/2006" xmlns:aink="http://schemas.microsoft.com/office/drawing/2016/ink" xmlns:am3d="http://schemas.microsoft.com/office/drawing/2017/model3d" xmlns:o="urn:schemas-microsoft-com:office:office" xmlns:oel="http://schemas.microsoft.com/office/2019/extlst" xmlns:r="http://schemas.openxmlformats.org/officeDocument/2006/relationships" xmlns:m="http://schemas.openxmlformats.org/officeDocument/2006/math" xmlns:v="urn:schemas-microsoft-com:vml" xmlns:wp14="http://schemas.microsoft.com/office/word/2010/wordprocessingDrawing" xmlns:wp="http://schemas.openxmlformats.org/drawingml/2006/wordprocessingDrawing" xmlns:w10="urn:schemas-microsoft-com:office:word" xmlns:w="http://schemas.openxmlformats.org/wordprocessingml/2006/main" xmlns:w14="http://schemas.microsoft.com/office/word/2010/wordml" xmlns:w15="http://schemas.microsoft.com/office/word/2012/wordml" xmlns:w16cei="http://schemas.microsoft.com/office/word/2026/wordml/cei" xmlns:w16cex="http://schemas.microsoft.com/office/word/2018/wordml/cex" xmlns:w16cid="http://schemas.microsoft.com/office/word/2016/wordml/cid" xmlns:w16="http://schemas.microsoft.com/office/word/2018/wordml" xmlns:w16du="http://schemas.microsoft.com/office/word/2023/wordml/word16du" xmlns:w16sdtdh="http://schemas.microsoft.com/office/word/2020/wordml/sdtdatahash" xmlns:w16sdtfl="http://schemas.microsoft.com/office/word/2024/wordml/sdtformatlock" xmlns:w16se="http://schemas.microsoft.com/office/word/2015/wordml/symex" xmlns:wpg="http://schemas.microsoft.com/office/word/2010/wordprocessingGroup" xmlns:wpi="http://schemas.microsoft.com/office/word/2010/wordprocessingInk" xmlns:wne="http://schemas.microsoft.com/office/word/2006/wordml" xmlns:wps="http://schemas.microsoft.com/office/word/2010/wordprocessingShape" mc:Ignorable="w14 w15 w16se w16cid w16 w16cex w16sdtdh w16sdtfl w16du wp14">
   <w:body>
     <w:p>
       <w:pPr>
@@ -284,42 +284,13 @@
         </w:numPr>
       </w:pPr>
       <w:r>
-        <w:t>Create a game</w:t>
-      </w:r>
-    </w:p>
-    <w:p>
-      <w:pPr>
-        <w:pStyle w:val="ListParagraph"/>
-        <w:ind w:left="360"/>
-      </w:pPr>
-    </w:p>
-    <w:p>
-      <w:pPr>
-        <w:rPr>
-          <w:b/>
-          <w:bCs/>
-        </w:rPr>
-      </w:pPr>
-      <w:r>
-        <w:rPr>
-          <w:b/>
-          <w:bCs/>
-        </w:rPr>
-        <w:t xml:space="preserve">Educational </w:t>
-      </w:r>
-      <w:r>
-        <w:rPr>
-          <w:b/>
-          <w:bCs/>
-        </w:rPr>
-        <w:t>crypto investment</w:t>
-      </w:r>
-      <w:r>
-        <w:rPr>
-          <w:b/>
-          <w:bCs/>
-        </w:rPr>
-        <w:t xml:space="preserve"> app</w:t>
+        <w:t xml:space="preserve">Create a </w:t>
+      </w:r>
+      <w:r>
+        <w:t xml:space="preserve">unique </w:t>
+      </w:r>
+      <w:r>
+        <w:t>game</w:t>
       </w:r>
     </w:p>
     <w:p>
@@ -331,10 +302,15 @@
         </w:numPr>
       </w:pPr>
       <w:r>
-        <w:t>App to help students learn how investments work in Bitcoin, Ether</w:t>
-      </w:r>
-      <w:r>
-        <w:t>eum, and other cryptocurrencies change over time without risk of losing money.</w:t>
+        <w:t xml:space="preserve">Have it </w:t>
+      </w:r>
+      <w:proofErr w:type="gramStart"/>
+      <w:r>
+        <w:t>be</w:t>
+      </w:r>
+      <w:proofErr w:type="gramEnd"/>
+      <w:r>
+        <w:t xml:space="preserve"> educational</w:t>
       </w:r>
     </w:p>
     <w:p>
@@ -346,10 +322,7 @@
         </w:numPr>
       </w:pPr>
       <w:r>
-        <w:t>Uses an API to fetch real time stock data</w:t>
-      </w:r>
-      <w:r>
-        <w:t>.</w:t>
+        <w:t>Simple, easy to understand UI</w:t>
       </w:r>
     </w:p>
     <w:p>
@@ -361,10 +334,42 @@
         </w:numPr>
       </w:pPr>
       <w:r>
-        <w:t>Able to invest fake money</w:t>
-      </w:r>
-      <w:r>
-        <w:t>.</w:t>
+        <w:t>Very generic idea, not very interesting.</w:t>
+      </w:r>
+    </w:p>
+    <w:p>
+      <w:pPr>
+        <w:pStyle w:val="ListParagraph"/>
+        <w:ind w:left="360"/>
+      </w:pPr>
+    </w:p>
+    <w:p>
+      <w:pPr>
+        <w:rPr>
+          <w:b/>
+          <w:bCs/>
+        </w:rPr>
+      </w:pPr>
+      <w:r>
+        <w:rPr>
+          <w:b/>
+          <w:bCs/>
+        </w:rPr>
+        <w:t xml:space="preserve">Educational </w:t>
+      </w:r>
+      <w:r>
+        <w:rPr>
+          <w:b/>
+          <w:bCs/>
+        </w:rPr>
+        <w:t>crypto investment</w:t>
+      </w:r>
+      <w:r>
+        <w:rPr>
+          <w:b/>
+          <w:bCs/>
+        </w:rPr>
+        <w:t xml:space="preserve"> app</w:t>
       </w:r>
     </w:p>
     <w:p>
@@ -376,10 +381,10 @@
         </w:numPr>
       </w:pPr>
       <w:r>
-        <w:t>Able to see and compare</w:t>
-      </w:r>
-      <w:r>
-        <w:t xml:space="preserve"> investment values from various times.</w:t>
+        <w:t>App to help students learn how investments work in Bitcoin, Ether</w:t>
+      </w:r>
+      <w:r>
+        <w:t>eum, and other cryptocurrencies change over time without risk of losing money.</w:t>
       </w:r>
     </w:p>
     <w:p>
@@ -391,6 +396,51 @@
         </w:numPr>
       </w:pPr>
       <w:r>
+        <w:t>Uses an API to fetch real time stock data</w:t>
+      </w:r>
+      <w:r>
+        <w:t>.</w:t>
+      </w:r>
+    </w:p>
+    <w:p>
+      <w:pPr>
+        <w:pStyle w:val="ListParagraph"/>
+        <w:numPr>
+          <w:ilvl w:val="0"/>
+          <w:numId w:val="6"/>
+        </w:numPr>
+      </w:pPr>
+      <w:r>
+        <w:t>Able to invest fake money</w:t>
+      </w:r>
+      <w:r>
+        <w:t>.</w:t>
+      </w:r>
+    </w:p>
+    <w:p>
+      <w:pPr>
+        <w:pStyle w:val="ListParagraph"/>
+        <w:numPr>
+          <w:ilvl w:val="0"/>
+          <w:numId w:val="6"/>
+        </w:numPr>
+      </w:pPr>
+      <w:r>
+        <w:t>Able to see and compare</w:t>
+      </w:r>
+      <w:r>
+        <w:t xml:space="preserve"> investment values from various times.</w:t>
+      </w:r>
+    </w:p>
+    <w:p>
+      <w:pPr>
+        <w:pStyle w:val="ListParagraph"/>
+        <w:numPr>
+          <w:ilvl w:val="0"/>
+          <w:numId w:val="6"/>
+        </w:numPr>
+      </w:pPr>
+      <w:r>
         <w:t>Although</w:t>
       </w:r>
       <w:r>
@@ -486,8 +536,13 @@
         </w:numPr>
       </w:pPr>
       <w:r>
-        <w:t>Able to send a MIDI CC(</w:t>
-      </w:r>
+        <w:t xml:space="preserve">Able to send a MIDI </w:t>
+      </w:r>
+      <w:proofErr w:type="gramStart"/>
+      <w:r>
+        <w:t>CC(</w:t>
+      </w:r>
+      <w:proofErr w:type="gramEnd"/>
       <w:r>
         <w:t>control change</w:t>
       </w:r>
@@ -587,27 +642,177 @@
       <w:r>
         <w:t>User can drag a slider in the settings page to manually calibrate the mouth detection.</w:t>
       </w:r>
-      <w:r>
-        <w:rPr>
-          <w:b/>
-          <w:bCs/>
-        </w:rPr>
-        <w:br w:type="page"/>
-      </w:r>
-    </w:p>
-    <w:p>
-      <w:pPr>
-        <w:rPr>
-          <w:b/>
-          <w:bCs/>
-        </w:rPr>
-      </w:pPr>
-      <w:r>
-        <w:rPr>
-          <w:b/>
-          <w:bCs/>
-        </w:rPr>
-        <w:lastRenderedPageBreak/>
+    </w:p>
+    <w:p>
+      <w:pPr>
+        <w:pStyle w:val="ListParagraph"/>
+        <w:numPr>
+          <w:ilvl w:val="0"/>
+          <w:numId w:val="1"/>
+        </w:numPr>
+      </w:pPr>
+      <w:r>
+        <w:t>Responsive design, will f</w:t>
+      </w:r>
+      <w:r>
+        <w:t>it to desktop, tablet, and phone screens</w:t>
+      </w:r>
+    </w:p>
+    <w:p>
+      <w:pPr>
+        <w:rPr>
+          <w:b/>
+          <w:bCs/>
+        </w:rPr>
+      </w:pPr>
+    </w:p>
+    <w:p>
+      <w:pPr>
+        <w:rPr>
+          <w:b/>
+          <w:bCs/>
+        </w:rPr>
+      </w:pPr>
+      <w:r>
+        <w:rPr>
+          <w:b/>
+          <w:bCs/>
+        </w:rPr>
+        <w:t>Advanced techniques:</w:t>
+      </w:r>
+    </w:p>
+    <w:p>
+      <w:pPr>
+        <w:pStyle w:val="ListParagraph"/>
+        <w:numPr>
+          <w:ilvl w:val="0"/>
+          <w:numId w:val="14"/>
+        </w:numPr>
+      </w:pPr>
+      <w:r>
+        <w:t xml:space="preserve">Media queries – </w:t>
+      </w:r>
+      <w:r>
+        <w:t>The layout of the</w:t>
+      </w:r>
+      <w:r>
+        <w:t xml:space="preserve"> web app will change depending on what device is using it. Desktops with a horizontal screen will have </w:t>
+      </w:r>
+      <w:proofErr w:type="gramStart"/>
+      <w:r>
+        <w:t>all of</w:t>
+      </w:r>
+      <w:proofErr w:type="gramEnd"/>
+      <w:r>
+        <w:t xml:space="preserve"> the functions and settings on one page, whereas people using </w:t>
+      </w:r>
+      <w:r>
+        <w:t>phones will be shown a navigation bar on the bottom leading to each page.</w:t>
+      </w:r>
+    </w:p>
+    <w:p>
+      <w:pPr>
+        <w:pStyle w:val="ListParagraph"/>
+      </w:pPr>
+    </w:p>
+    <w:p>
+      <w:pPr>
+        <w:pStyle w:val="ListParagraph"/>
+        <w:numPr>
+          <w:ilvl w:val="0"/>
+          <w:numId w:val="14"/>
+        </w:numPr>
+      </w:pPr>
+      <w:r>
+        <w:t>External</w:t>
+      </w:r>
+    </w:p>
+    <w:p>
+      <w:pPr>
+        <w:rPr>
+          <w:b/>
+          <w:bCs/>
+        </w:rPr>
+      </w:pPr>
+    </w:p>
+    <w:p>
+      <w:pPr>
+        <w:rPr>
+          <w:b/>
+          <w:bCs/>
+        </w:rPr>
+      </w:pPr>
+    </w:p>
+    <w:p>
+      <w:pPr>
+        <w:rPr>
+          <w:b/>
+          <w:bCs/>
+        </w:rPr>
+      </w:pPr>
+    </w:p>
+    <w:p>
+      <w:pPr>
+        <w:rPr>
+          <w:b/>
+          <w:bCs/>
+        </w:rPr>
+      </w:pPr>
+    </w:p>
+    <w:p>
+      <w:pPr>
+        <w:rPr>
+          <w:b/>
+          <w:bCs/>
+        </w:rPr>
+      </w:pPr>
+    </w:p>
+    <w:p>
+      <w:pPr>
+        <w:rPr>
+          <w:b/>
+          <w:bCs/>
+        </w:rPr>
+      </w:pPr>
+    </w:p>
+    <w:p>
+      <w:pPr>
+        <w:rPr>
+          <w:b/>
+          <w:bCs/>
+        </w:rPr>
+      </w:pPr>
+    </w:p>
+    <w:p>
+      <w:pPr>
+        <w:rPr>
+          <w:b/>
+          <w:bCs/>
+        </w:rPr>
+      </w:pPr>
+    </w:p>
+    <w:p>
+      <w:pPr>
+        <w:rPr>
+          <w:b/>
+          <w:bCs/>
+        </w:rPr>
+      </w:pPr>
+    </w:p>
+    <w:p>
+      <w:pPr>
+        <w:rPr>
+          <w:b/>
+          <w:bCs/>
+        </w:rPr>
+      </w:pPr>
+    </w:p>
+    <w:p>
+      <w:r>
+        <w:rPr>
+          <w:b/>
+          <w:bCs/>
+        </w:rPr>
         <w:t>15/06/2026</w:t>
       </w:r>
       <w:r>
@@ -624,6 +829,7 @@
         </w:rPr>
         <w:t xml:space="preserve">Setting up </w:t>
       </w:r>
+      <w:proofErr w:type="spellStart"/>
       <w:r>
         <w:rPr>
           <w:b/>
@@ -636,7 +842,15 @@
           <w:b/>
           <w:bCs/>
         </w:rPr>
-        <w:t>ediapipe for face-tracking</w:t>
+        <w:t>ediapipe</w:t>
+      </w:r>
+      <w:proofErr w:type="spellEnd"/>
+      <w:r>
+        <w:rPr>
+          <w:b/>
+          <w:bCs/>
+        </w:rPr>
+        <w:t xml:space="preserve"> for face-tracking</w:t>
       </w:r>
       <w:r>
         <w:rPr>
@@ -655,13 +869,36 @@
         </w:numPr>
       </w:pPr>
       <w:r>
-        <w:t>I will be using Mediapipe tasks with the face landmark</w:t>
-      </w:r>
-      <w:r>
-        <w:t>er model to allow the tracking of the lips.</w:t>
-      </w:r>
-    </w:p>
-    <w:p>
+        <w:t xml:space="preserve">I will be using </w:t>
+      </w:r>
+      <w:proofErr w:type="spellStart"/>
+      <w:r>
+        <w:t>Mediapipe</w:t>
+      </w:r>
+      <w:proofErr w:type="spellEnd"/>
+      <w:r>
+        <w:t xml:space="preserve"> tasks with the face </w:t>
+      </w:r>
+      <w:proofErr w:type="spellStart"/>
+      <w:r>
+        <w:t>landmark</w:t>
+      </w:r>
+      <w:r>
+        <w:t>er</w:t>
+      </w:r>
+      <w:proofErr w:type="spellEnd"/>
+      <w:r>
+        <w:t xml:space="preserve"> model to allow the tracking of the lips.</w:t>
+      </w:r>
+    </w:p>
+    <w:p>
+      <w:r>
+        <w:rPr>
+          <w:noProof/>
+        </w:rPr>
+        <w:lastRenderedPageBreak/>
+        <w:t xml:space="preserve"> </w:t>
+      </w:r>
       <w:r>
         <w:rPr>
           <w:noProof/>
@@ -871,8 +1108,13 @@
         </w:numPr>
       </w:pPr>
       <w:r>
-        <w:t>Mido in combination with python-rtmidi</w:t>
-      </w:r>
+        <w:t>Mido in combination with python-</w:t>
+      </w:r>
+      <w:proofErr w:type="spellStart"/>
+      <w:r>
+        <w:t>rtmidi</w:t>
+      </w:r>
+      <w:proofErr w:type="spellEnd"/>
     </w:p>
     <w:p>
       <w:pPr>
@@ -883,8 +1125,13 @@
         </w:numPr>
       </w:pPr>
       <w:r>
-        <w:t>Just with python-rtmidi</w:t>
-      </w:r>
+        <w:t>Just with python-</w:t>
+      </w:r>
+      <w:proofErr w:type="spellStart"/>
+      <w:r>
+        <w:t>rtmidi</w:t>
+      </w:r>
+      <w:proofErr w:type="spellEnd"/>
     </w:p>
     <w:p>
       <w:pPr>
@@ -894,8 +1141,13 @@
           <w:numId w:val="8"/>
         </w:numPr>
       </w:pPr>
-      <w:r>
-        <w:t xml:space="preserve">Pygame’s </w:t>
+      <w:proofErr w:type="spellStart"/>
+      <w:r>
+        <w:t>Pygame’s</w:t>
+      </w:r>
+      <w:proofErr w:type="spellEnd"/>
+      <w:r>
+        <w:t xml:space="preserve"> </w:t>
       </w:r>
       <w:r>
         <w:t>built in</w:t>
@@ -925,16 +1177,42 @@
         <w:t xml:space="preserve">Mido </w:t>
       </w:r>
       <w:r>
-        <w:t>still uses python-rtmidi</w:t>
-      </w:r>
-      <w:r>
-        <w:t>, it just acts as a wrapper to make python-rtmidi easier to work with</w:t>
+        <w:t>still uses python-</w:t>
+      </w:r>
+      <w:proofErr w:type="spellStart"/>
+      <w:r>
+        <w:t>rtmidi</w:t>
+      </w:r>
+      <w:proofErr w:type="spellEnd"/>
+      <w:r>
+        <w:t>, it just acts as a wrapper to make python-</w:t>
+      </w:r>
+      <w:proofErr w:type="spellStart"/>
+      <w:r>
+        <w:t>rtmidi</w:t>
+      </w:r>
+      <w:proofErr w:type="spellEnd"/>
+      <w:r>
+        <w:t xml:space="preserve"> easier to work with</w:t>
       </w:r>
       <w:r>
         <w:t xml:space="preserve">. This and </w:t>
       </w:r>
-      <w:r>
-        <w:t>Pygame MIDI are the simplest to use, but Pygame is less suited for my use case because</w:t>
+      <w:proofErr w:type="spellStart"/>
+      <w:r>
+        <w:t>Pygame</w:t>
+      </w:r>
+      <w:proofErr w:type="spellEnd"/>
+      <w:r>
+        <w:t xml:space="preserve"> MIDI are the simplest to use, but </w:t>
+      </w:r>
+      <w:proofErr w:type="spellStart"/>
+      <w:r>
+        <w:t>Pygame</w:t>
+      </w:r>
+      <w:proofErr w:type="spellEnd"/>
+      <w:r>
+        <w:t xml:space="preserve"> is less suited for my use case because</w:t>
       </w:r>
       <w:r>
         <w:t xml:space="preserve"> it is primarily for game windows. </w:t>
@@ -943,7 +1221,15 @@
         <w:t>So,</w:t>
       </w:r>
       <w:r>
-        <w:t xml:space="preserve"> I will use Mido and python-rtmidi to send MIDI signals to my guitar plugin.</w:t>
+        <w:t xml:space="preserve"> I will use Mido and python-</w:t>
+      </w:r>
+      <w:proofErr w:type="spellStart"/>
+      <w:r>
+        <w:t>rtmidi</w:t>
+      </w:r>
+      <w:proofErr w:type="spellEnd"/>
+      <w:r>
+        <w:t xml:space="preserve"> to send MIDI signals to my guitar plugin.</w:t>
       </w:r>
     </w:p>
     <w:p>
@@ -954,7 +1240,6 @@
         <w:rPr>
           <w:noProof/>
         </w:rPr>
-        <w:lastRenderedPageBreak/>
         <w:drawing>
           <wp:inline distT="0" distB="0" distL="0" distR="0" wp14:anchorId="4DF2595F" wp14:editId="165876F9">
             <wp:extent cx="5731510" cy="981075"/>
@@ -1001,8 +1286,13 @@
           <w:numId w:val="8"/>
         </w:numPr>
       </w:pPr>
-      <w:r>
-        <w:t xml:space="preserve">Reaper(the audio software I’m using) cannot </w:t>
+      <w:proofErr w:type="gramStart"/>
+      <w:r>
+        <w:t>Reaper(</w:t>
+      </w:r>
+      <w:proofErr w:type="gramEnd"/>
+      <w:r>
+        <w:t xml:space="preserve">the audio software I’m using) cannot </w:t>
       </w:r>
       <w:r>
         <w:t xml:space="preserve">receive MIDI signals straight from </w:t>
@@ -1011,7 +1301,23 @@
         <w:t>P</w:t>
       </w:r>
       <w:r>
-        <w:t>ython, it has to pass through a virtual MIDI cable first. For the virtual MIDI cable, I will be using loopMIDI.</w:t>
+        <w:t xml:space="preserve">ython, it </w:t>
+      </w:r>
+      <w:proofErr w:type="gramStart"/>
+      <w:r>
+        <w:t>has to</w:t>
+      </w:r>
+      <w:proofErr w:type="gramEnd"/>
+      <w:r>
+        <w:t xml:space="preserve"> pass through a virtual MIDI cable first. For the virtual MIDI cable, I will be using </w:t>
+      </w:r>
+      <w:proofErr w:type="spellStart"/>
+      <w:r>
+        <w:t>loopMIDI</w:t>
+      </w:r>
+      <w:proofErr w:type="spellEnd"/>
+      <w:r>
+        <w:t>.</w:t>
       </w:r>
     </w:p>
     <w:p>
@@ -1149,7 +1455,15 @@
         <w:t xml:space="preserve">Having an issue where it says </w:t>
       </w:r>
       <w:r>
-        <w:t xml:space="preserve">there is no port named ‘pythonmidi’ even though it is exactly what I named the </w:t>
+        <w:t>there is no port named ‘</w:t>
+      </w:r>
+      <w:proofErr w:type="spellStart"/>
+      <w:r>
+        <w:t>pythonmidi</w:t>
+      </w:r>
+      <w:proofErr w:type="spellEnd"/>
+      <w:r>
+        <w:t xml:space="preserve">’ even though it is exactly what I named the </w:t>
       </w:r>
       <w:r>
         <w:t>virtual MIDI cable.</w:t>
@@ -1258,10 +1572,23 @@
         </w:numPr>
       </w:pPr>
       <w:r>
-        <w:t>Got Mido to the name of every open MIDI port on my laptop. And it turns out that the port is actually named</w:t>
-      </w:r>
-      <w:r>
-        <w:t xml:space="preserve"> ‘pythonmidi 1’</w:t>
+        <w:t xml:space="preserve">Got Mido to the name of every open MIDI port on my laptop. And it turns out that the port is </w:t>
+      </w:r>
+      <w:proofErr w:type="gramStart"/>
+      <w:r>
+        <w:t>actually named</w:t>
+      </w:r>
+      <w:proofErr w:type="gramEnd"/>
+      <w:r>
+        <w:t xml:space="preserve"> ‘</w:t>
+      </w:r>
+      <w:proofErr w:type="spellStart"/>
+      <w:r>
+        <w:t>pythonmidi</w:t>
+      </w:r>
+      <w:proofErr w:type="spellEnd"/>
+      <w:r>
+        <w:t xml:space="preserve"> 1’</w:t>
       </w:r>
     </w:p>
     <w:p>
@@ -1444,7 +1771,15 @@
         </w:numPr>
       </w:pPr>
       <w:r>
-        <w:t>Picture showing loopMIDI detecting the MIDI messages being sent through the virtual MIDI port:</w:t>
+        <w:t xml:space="preserve">Picture showing </w:t>
+      </w:r>
+      <w:proofErr w:type="spellStart"/>
+      <w:r>
+        <w:t>loopMIDI</w:t>
+      </w:r>
+      <w:proofErr w:type="spellEnd"/>
+      <w:r>
+        <w:t xml:space="preserve"> detecting the MIDI messages being sent through the virtual MIDI port:</w:t>
       </w:r>
     </w:p>
     <w:p>
@@ -1618,11 +1953,16 @@
       <w:r>
         <w:t xml:space="preserve">having </w:t>
       </w:r>
+      <w:proofErr w:type="gramStart"/>
       <w:r>
         <w:t>Reaper</w:t>
       </w:r>
       <w:r>
-        <w:t>(my guitar software)</w:t>
+        <w:t>(</w:t>
+      </w:r>
+      <w:proofErr w:type="gramEnd"/>
+      <w:r>
+        <w:t>my guitar software)</w:t>
       </w:r>
       <w:r>
         <w:t xml:space="preserve"> </w:t>
@@ -1679,7 +2019,15 @@
         <w:t xml:space="preserve">he guitar plugin should automatically detect the message and map it to </w:t>
       </w:r>
       <w:r>
-        <w:t>the pedal I have chosen, however</w:t>
+        <w:t xml:space="preserve">the pedal I have </w:t>
+      </w:r>
+      <w:proofErr w:type="gramStart"/>
+      <w:r>
+        <w:t>chosen,</w:t>
+      </w:r>
+      <w:proofErr w:type="gramEnd"/>
+      <w:r>
+        <w:t xml:space="preserve"> however</w:t>
       </w:r>
       <w:r>
         <w:t>,</w:t>
@@ -2145,8 +2493,13 @@
         <w:t>Duplicated the Python file</w:t>
       </w:r>
       <w:r>
-        <w:t xml:space="preserve"> with mediapipe</w:t>
-      </w:r>
+        <w:t xml:space="preserve"> with </w:t>
+      </w:r>
+      <w:proofErr w:type="spellStart"/>
+      <w:r>
+        <w:t>mediapipe</w:t>
+      </w:r>
+      <w:proofErr w:type="spellEnd"/>
       <w:r>
         <w:t xml:space="preserve">, I will use </w:t>
       </w:r>
@@ -2338,7 +2691,15 @@
         <w:t>is not affected by the minimum lip distance</w:t>
       </w:r>
       <w:r>
-        <w:t>. So it’s not very helpful.</w:t>
+        <w:t xml:space="preserve">. </w:t>
+      </w:r>
+      <w:proofErr w:type="gramStart"/>
+      <w:r>
+        <w:t>So</w:t>
+      </w:r>
+      <w:proofErr w:type="gramEnd"/>
+      <w:r>
+        <w:t xml:space="preserve"> it’s not very helpful.</w:t>
       </w:r>
     </w:p>
     <w:p>
@@ -2856,17 +3217,38 @@
         </w:numPr>
       </w:pPr>
       <w:r>
-        <w:t xml:space="preserve">Using ui.tabs doesn’t quite give me the </w:t>
-      </w:r>
-      <w:r>
-        <w:t>look I want, I’m going to switch to using buttons so I can have more control over how they look.</w:t>
-      </w:r>
-    </w:p>
-    <w:p>
-      <w:pPr>
-        <w:pStyle w:val="ListParagraph"/>
-      </w:pPr>
-      <w:r>
+        <w:t xml:space="preserve">Using </w:t>
+      </w:r>
+      <w:proofErr w:type="spellStart"/>
+      <w:proofErr w:type="gramStart"/>
+      <w:r>
+        <w:t>ui.tabs</w:t>
+      </w:r>
+      <w:proofErr w:type="spellEnd"/>
+      <w:proofErr w:type="gramEnd"/>
+      <w:r>
+        <w:t xml:space="preserve"> doesn’t quite give me the </w:t>
+      </w:r>
+      <w:r>
+        <w:t xml:space="preserve">look I </w:t>
+      </w:r>
+      <w:proofErr w:type="gramStart"/>
+      <w:r>
+        <w:t>want,</w:t>
+      </w:r>
+      <w:proofErr w:type="gramEnd"/>
+      <w:r>
+        <w:t xml:space="preserve"> I’m going to switch to using buttons so I can have more control over how they look.</w:t>
+      </w:r>
+    </w:p>
+    <w:p>
+      <w:pPr>
+        <w:pStyle w:val="ListParagraph"/>
+      </w:pPr>
+      <w:r>
+        <w:rPr>
+          <w:noProof/>
+        </w:rPr>
         <w:drawing>
           <wp:inline distT="0" distB="0" distL="0" distR="0" wp14:anchorId="44991FD2" wp14:editId="58BC5B20">
             <wp:extent cx="3644219" cy="2066376"/>
@@ -2948,6 +3330,9 @@
         <w:pStyle w:val="ListParagraph"/>
       </w:pPr>
       <w:r>
+        <w:rPr>
+          <w:noProof/>
+        </w:rPr>
         <w:drawing>
           <wp:inline distT="0" distB="0" distL="0" distR="0" wp14:anchorId="36387847" wp14:editId="0CCB7228">
             <wp:extent cx="4469409" cy="1823713"/>
@@ -2990,6 +3375,9 @@
         <w:ind w:firstLine="720"/>
       </w:pPr>
       <w:r>
+        <w:rPr>
+          <w:noProof/>
+        </w:rPr>
         <w:drawing>
           <wp:inline distT="0" distB="0" distL="0" distR="0" wp14:anchorId="3F5049C3" wp14:editId="59962900">
             <wp:extent cx="4589842" cy="1796578"/>
@@ -3027,6 +3415,1852 @@
         </w:drawing>
       </w:r>
     </w:p>
+    <w:p/>
+    <w:p>
+      <w:pPr>
+        <w:rPr>
+          <w:b/>
+          <w:bCs/>
+        </w:rPr>
+      </w:pPr>
+      <w:r>
+        <w:rPr>
+          <w:b/>
+          <w:bCs/>
+        </w:rPr>
+        <w:t>3/07/2026</w:t>
+      </w:r>
+      <w:r>
+        <w:rPr>
+          <w:b/>
+          <w:bCs/>
+        </w:rPr>
+        <w:t xml:space="preserve"> – Finalising </w:t>
+      </w:r>
+      <w:r>
+        <w:rPr>
+          <w:b/>
+          <w:bCs/>
+        </w:rPr>
+        <w:t>the basic UI layout</w:t>
+      </w:r>
+    </w:p>
+    <w:p>
+      <w:pPr>
+        <w:pStyle w:val="ListParagraph"/>
+        <w:numPr>
+          <w:ilvl w:val="0"/>
+          <w:numId w:val="10"/>
+        </w:numPr>
+      </w:pPr>
+      <w:r>
+        <w:t xml:space="preserve">Picked a </w:t>
+      </w:r>
+      <w:proofErr w:type="spellStart"/>
+      <w:r>
+        <w:t>color</w:t>
+      </w:r>
+      <w:proofErr w:type="spellEnd"/>
+      <w:r>
+        <w:t xml:space="preserve"> scheme and changed the background </w:t>
+      </w:r>
+      <w:proofErr w:type="spellStart"/>
+      <w:r>
+        <w:t>color</w:t>
+      </w:r>
+      <w:proofErr w:type="spellEnd"/>
+      <w:r>
+        <w:t>:</w:t>
+      </w:r>
+    </w:p>
+    <w:p>
+      <w:pPr>
+        <w:pStyle w:val="ListParagraph"/>
+      </w:pPr>
+      <w:r>
+        <w:rPr>
+          <w:noProof/>
+        </w:rPr>
+        <w:drawing>
+          <wp:inline distT="0" distB="0" distL="0" distR="0" wp14:anchorId="4B787099" wp14:editId="63F4F059">
+            <wp:extent cx="2395282" cy="868290"/>
+            <wp:effectExtent l="0" t="0" r="5080" b="8255"/>
+            <wp:docPr id="771240252" name="Picture 1"/>
+            <wp:cNvGraphicFramePr>
+              <a:graphicFrameLocks xmlns:a="http://schemas.openxmlformats.org/drawingml/2006/main" noChangeAspect="1"/>
+            </wp:cNvGraphicFramePr>
+            <a:graphic xmlns:a="http://schemas.openxmlformats.org/drawingml/2006/main">
+              <a:graphicData uri="http://schemas.openxmlformats.org/drawingml/2006/picture">
+                <pic:pic xmlns:pic="http://schemas.openxmlformats.org/drawingml/2006/picture">
+                  <pic:nvPicPr>
+                    <pic:cNvPr id="771240252" name=""/>
+                    <pic:cNvPicPr/>
+                  </pic:nvPicPr>
+                  <pic:blipFill>
+                    <a:blip r:embed="rId40"/>
+                    <a:stretch>
+                      <a:fillRect/>
+                    </a:stretch>
+                  </pic:blipFill>
+                  <pic:spPr>
+                    <a:xfrm>
+                      <a:off x="0" y="0"/>
+                      <a:ext cx="2404874" cy="871767"/>
+                    </a:xfrm>
+                    <a:prstGeom prst="rect">
+                      <a:avLst/>
+                    </a:prstGeom>
+                  </pic:spPr>
+                </pic:pic>
+              </a:graphicData>
+            </a:graphic>
+          </wp:inline>
+        </w:drawing>
+      </w:r>
+    </w:p>
+    <w:p>
+      <w:pPr>
+        <w:pStyle w:val="ListParagraph"/>
+      </w:pPr>
+      <w:r>
+        <w:rPr>
+          <w:noProof/>
+        </w:rPr>
+        <w:drawing>
+          <wp:inline distT="0" distB="0" distL="0" distR="0" wp14:anchorId="495687B7" wp14:editId="458ED74F">
+            <wp:extent cx="4717591" cy="392523"/>
+            <wp:effectExtent l="0" t="0" r="6985" b="7620"/>
+            <wp:docPr id="417168680" name="Picture 1"/>
+            <wp:cNvGraphicFramePr>
+              <a:graphicFrameLocks xmlns:a="http://schemas.openxmlformats.org/drawingml/2006/main" noChangeAspect="1"/>
+            </wp:cNvGraphicFramePr>
+            <a:graphic xmlns:a="http://schemas.openxmlformats.org/drawingml/2006/main">
+              <a:graphicData uri="http://schemas.openxmlformats.org/drawingml/2006/picture">
+                <pic:pic xmlns:pic="http://schemas.openxmlformats.org/drawingml/2006/picture">
+                  <pic:nvPicPr>
+                    <pic:cNvPr id="417168680" name=""/>
+                    <pic:cNvPicPr/>
+                  </pic:nvPicPr>
+                  <pic:blipFill>
+                    <a:blip r:embed="rId41"/>
+                    <a:stretch>
+                      <a:fillRect/>
+                    </a:stretch>
+                  </pic:blipFill>
+                  <pic:spPr>
+                    <a:xfrm>
+                      <a:off x="0" y="0"/>
+                      <a:ext cx="4819882" cy="401034"/>
+                    </a:xfrm>
+                    <a:prstGeom prst="rect">
+                      <a:avLst/>
+                    </a:prstGeom>
+                  </pic:spPr>
+                </pic:pic>
+              </a:graphicData>
+            </a:graphic>
+          </wp:inline>
+        </w:drawing>
+      </w:r>
+    </w:p>
+    <w:p>
+      <w:pPr>
+        <w:pStyle w:val="ListParagraph"/>
+        <w:numPr>
+          <w:ilvl w:val="0"/>
+          <w:numId w:val="10"/>
+        </w:numPr>
+        <w:rPr>
+          <w:b/>
+          <w:bCs/>
+        </w:rPr>
+      </w:pPr>
+      <w:r>
+        <w:t xml:space="preserve">Styled the buttons – removed drop shadow, changed the </w:t>
+      </w:r>
+      <w:proofErr w:type="spellStart"/>
+      <w:r>
+        <w:t>color</w:t>
+      </w:r>
+      <w:proofErr w:type="spellEnd"/>
+      <w:r>
+        <w:t xml:space="preserve">, </w:t>
+      </w:r>
+      <w:r>
+        <w:t>rounded only the top right and left button corners.</w:t>
+      </w:r>
+    </w:p>
+    <w:p>
+      <w:pPr>
+        <w:pStyle w:val="ListParagraph"/>
+      </w:pPr>
+      <w:r>
+        <w:rPr>
+          <w:noProof/>
+        </w:rPr>
+        <w:drawing>
+          <wp:inline distT="0" distB="0" distL="0" distR="0" wp14:anchorId="73B8960E" wp14:editId="35F19A88">
+            <wp:extent cx="4701354" cy="1544373"/>
+            <wp:effectExtent l="0" t="0" r="4445" b="0"/>
+            <wp:docPr id="1437631909" name="Picture 1"/>
+            <wp:cNvGraphicFramePr>
+              <a:graphicFrameLocks xmlns:a="http://schemas.openxmlformats.org/drawingml/2006/main" noChangeAspect="1"/>
+            </wp:cNvGraphicFramePr>
+            <a:graphic xmlns:a="http://schemas.openxmlformats.org/drawingml/2006/main">
+              <a:graphicData uri="http://schemas.openxmlformats.org/drawingml/2006/picture">
+                <pic:pic xmlns:pic="http://schemas.openxmlformats.org/drawingml/2006/picture">
+                  <pic:nvPicPr>
+                    <pic:cNvPr id="1437631909" name=""/>
+                    <pic:cNvPicPr/>
+                  </pic:nvPicPr>
+                  <pic:blipFill>
+                    <a:blip r:embed="rId42"/>
+                    <a:stretch>
+                      <a:fillRect/>
+                    </a:stretch>
+                  </pic:blipFill>
+                  <pic:spPr>
+                    <a:xfrm>
+                      <a:off x="0" y="0"/>
+                      <a:ext cx="4705013" cy="1545575"/>
+                    </a:xfrm>
+                    <a:prstGeom prst="rect">
+                      <a:avLst/>
+                    </a:prstGeom>
+                  </pic:spPr>
+                </pic:pic>
+              </a:graphicData>
+            </a:graphic>
+          </wp:inline>
+        </w:drawing>
+      </w:r>
+      <w:r>
+        <w:t xml:space="preserve"> </w:t>
+      </w:r>
+    </w:p>
+    <w:p>
+      <w:pPr>
+        <w:pStyle w:val="ListParagraph"/>
+        <w:numPr>
+          <w:ilvl w:val="0"/>
+          <w:numId w:val="10"/>
+        </w:numPr>
+      </w:pPr>
+      <w:r>
+        <w:br w:type="page"/>
+      </w:r>
+      <w:r>
+        <w:lastRenderedPageBreak/>
+        <w:t xml:space="preserve">The </w:t>
+      </w:r>
+      <w:r>
+        <w:t>navigation bar</w:t>
+      </w:r>
+      <w:r>
+        <w:t xml:space="preserve"> now looks like this:</w:t>
+      </w:r>
+    </w:p>
+    <w:p>
+      <w:pPr>
+        <w:pStyle w:val="ListParagraph"/>
+      </w:pPr>
+      <w:r>
+        <w:rPr>
+          <w:noProof/>
+        </w:rPr>
+        <w:drawing>
+          <wp:inline distT="0" distB="0" distL="0" distR="0" wp14:anchorId="6B53435D" wp14:editId="2917A93B">
+            <wp:extent cx="3016575" cy="2279309"/>
+            <wp:effectExtent l="0" t="0" r="0" b="6985"/>
+            <wp:docPr id="1344720530" name="Picture 1"/>
+            <wp:cNvGraphicFramePr>
+              <a:graphicFrameLocks xmlns:a="http://schemas.openxmlformats.org/drawingml/2006/main" noChangeAspect="1"/>
+            </wp:cNvGraphicFramePr>
+            <a:graphic xmlns:a="http://schemas.openxmlformats.org/drawingml/2006/main">
+              <a:graphicData uri="http://schemas.openxmlformats.org/drawingml/2006/picture">
+                <pic:pic xmlns:pic="http://schemas.openxmlformats.org/drawingml/2006/picture">
+                  <pic:nvPicPr>
+                    <pic:cNvPr id="1344720530" name=""/>
+                    <pic:cNvPicPr/>
+                  </pic:nvPicPr>
+                  <pic:blipFill>
+                    <a:blip r:embed="rId43"/>
+                    <a:stretch>
+                      <a:fillRect/>
+                    </a:stretch>
+                  </pic:blipFill>
+                  <pic:spPr>
+                    <a:xfrm>
+                      <a:off x="0" y="0"/>
+                      <a:ext cx="3021766" cy="2283232"/>
+                    </a:xfrm>
+                    <a:prstGeom prst="rect">
+                      <a:avLst/>
+                    </a:prstGeom>
+                  </pic:spPr>
+                </pic:pic>
+              </a:graphicData>
+            </a:graphic>
+          </wp:inline>
+        </w:drawing>
+      </w:r>
+    </w:p>
+    <w:p>
+      <w:pPr>
+        <w:pStyle w:val="ListParagraph"/>
+      </w:pPr>
+    </w:p>
+    <w:p>
+      <w:pPr>
+        <w:pStyle w:val="ListParagraph"/>
+        <w:numPr>
+          <w:ilvl w:val="0"/>
+          <w:numId w:val="10"/>
+        </w:numPr>
+      </w:pPr>
+      <w:r>
+        <w:t xml:space="preserve">The </w:t>
+      </w:r>
+      <w:r>
+        <w:t xml:space="preserve">bar </w:t>
+      </w:r>
+      <w:r>
+        <w:t xml:space="preserve">icons have not </w:t>
+      </w:r>
+      <w:r>
+        <w:t xml:space="preserve">been finished </w:t>
+      </w:r>
+      <w:proofErr w:type="gramStart"/>
+      <w:r>
+        <w:t>yet</w:t>
+      </w:r>
+      <w:proofErr w:type="gramEnd"/>
+      <w:r>
+        <w:t xml:space="preserve"> so I have not added them to the nav bar.</w:t>
+      </w:r>
+    </w:p>
+    <w:p/>
+    <w:p>
+      <w:pPr>
+        <w:rPr>
+          <w:b/>
+          <w:bCs/>
+        </w:rPr>
+      </w:pPr>
+      <w:r>
+        <w:rPr>
+          <w:b/>
+          <w:bCs/>
+        </w:rPr>
+        <w:t>2/07/2026</w:t>
+      </w:r>
+      <w:r>
+        <w:rPr>
+          <w:b/>
+          <w:bCs/>
+        </w:rPr>
+        <w:t xml:space="preserve"> – Beginning </w:t>
+      </w:r>
+      <w:r>
+        <w:rPr>
+          <w:b/>
+          <w:bCs/>
+        </w:rPr>
+        <w:t>to create the individual pages</w:t>
+      </w:r>
+    </w:p>
+    <w:p>
+      <w:pPr>
+        <w:pStyle w:val="ListParagraph"/>
+        <w:numPr>
+          <w:ilvl w:val="0"/>
+          <w:numId w:val="10"/>
+        </w:numPr>
+      </w:pPr>
+      <w:r>
+        <w:t xml:space="preserve">I believe it would be best that I </w:t>
+      </w:r>
+      <w:r>
+        <w:t xml:space="preserve">use one page for all the functions rather than a separate page for each. This means that my app wouldn’t have to load a </w:t>
+      </w:r>
+      <w:proofErr w:type="gramStart"/>
+      <w:r>
+        <w:t>complete</w:t>
+      </w:r>
+      <w:proofErr w:type="gramEnd"/>
+      <w:r>
+        <w:t xml:space="preserve"> new webpage, and it will hopefully run smooth</w:t>
+      </w:r>
+      <w:r>
+        <w:t>est</w:t>
+      </w:r>
+      <w:r>
+        <w:t>.</w:t>
+      </w:r>
+    </w:p>
+    <w:p>
+      <w:pPr>
+        <w:pStyle w:val="ListParagraph"/>
+        <w:numPr>
+          <w:ilvl w:val="0"/>
+          <w:numId w:val="10"/>
+        </w:numPr>
+      </w:pPr>
+      <w:r>
+        <w:t xml:space="preserve">I can do this by creating a container to show the content, </w:t>
+      </w:r>
+      <w:r>
+        <w:t xml:space="preserve">then </w:t>
+      </w:r>
+      <w:r>
+        <w:t>clearing it and then showing new content when another tab is selected.</w:t>
+      </w:r>
+    </w:p>
+    <w:p>
+      <w:pPr>
+        <w:pStyle w:val="ListParagraph"/>
+      </w:pPr>
+    </w:p>
+    <w:p>
+      <w:pPr>
+        <w:pStyle w:val="ListParagraph"/>
+      </w:pPr>
+      <w:r>
+        <w:rPr>
+          <w:noProof/>
+        </w:rPr>
+        <w:drawing>
+          <wp:inline distT="0" distB="0" distL="0" distR="0" wp14:anchorId="2B61ECC3" wp14:editId="1A657F98">
+            <wp:extent cx="4881707" cy="1587934"/>
+            <wp:effectExtent l="0" t="0" r="0" b="0"/>
+            <wp:docPr id="614621117" name="Picture 1"/>
+            <wp:cNvGraphicFramePr>
+              <a:graphicFrameLocks xmlns:a="http://schemas.openxmlformats.org/drawingml/2006/main" noChangeAspect="1"/>
+            </wp:cNvGraphicFramePr>
+            <a:graphic xmlns:a="http://schemas.openxmlformats.org/drawingml/2006/main">
+              <a:graphicData uri="http://schemas.openxmlformats.org/drawingml/2006/picture">
+                <pic:pic xmlns:pic="http://schemas.openxmlformats.org/drawingml/2006/picture">
+                  <pic:nvPicPr>
+                    <pic:cNvPr id="614621117" name=""/>
+                    <pic:cNvPicPr/>
+                  </pic:nvPicPr>
+                  <pic:blipFill>
+                    <a:blip r:embed="rId44"/>
+                    <a:stretch>
+                      <a:fillRect/>
+                    </a:stretch>
+                  </pic:blipFill>
+                  <pic:spPr>
+                    <a:xfrm>
+                      <a:off x="0" y="0"/>
+                      <a:ext cx="4972493" cy="1617465"/>
+                    </a:xfrm>
+                    <a:prstGeom prst="rect">
+                      <a:avLst/>
+                    </a:prstGeom>
+                  </pic:spPr>
+                </pic:pic>
+              </a:graphicData>
+            </a:graphic>
+          </wp:inline>
+        </w:drawing>
+      </w:r>
+      <w:r>
+        <w:rPr>
+          <w:noProof/>
+        </w:rPr>
+        <w:drawing>
+          <wp:inline distT="0" distB="0" distL="0" distR="0" wp14:anchorId="530C46A5" wp14:editId="28330839">
+            <wp:extent cx="4745959" cy="1202527"/>
+            <wp:effectExtent l="0" t="0" r="0" b="0"/>
+            <wp:docPr id="70100923" name="Picture 1"/>
+            <wp:cNvGraphicFramePr>
+              <a:graphicFrameLocks xmlns:a="http://schemas.openxmlformats.org/drawingml/2006/main" noChangeAspect="1"/>
+            </wp:cNvGraphicFramePr>
+            <a:graphic xmlns:a="http://schemas.openxmlformats.org/drawingml/2006/main">
+              <a:graphicData uri="http://schemas.openxmlformats.org/drawingml/2006/picture">
+                <pic:pic xmlns:pic="http://schemas.openxmlformats.org/drawingml/2006/picture">
+                  <pic:nvPicPr>
+                    <pic:cNvPr id="70100923" name=""/>
+                    <pic:cNvPicPr/>
+                  </pic:nvPicPr>
+                  <pic:blipFill>
+                    <a:blip r:embed="rId45"/>
+                    <a:stretch>
+                      <a:fillRect/>
+                    </a:stretch>
+                  </pic:blipFill>
+                  <pic:spPr>
+                    <a:xfrm>
+                      <a:off x="0" y="0"/>
+                      <a:ext cx="4759675" cy="1206002"/>
+                    </a:xfrm>
+                    <a:prstGeom prst="rect">
+                      <a:avLst/>
+                    </a:prstGeom>
+                  </pic:spPr>
+                </pic:pic>
+              </a:graphicData>
+            </a:graphic>
+          </wp:inline>
+        </w:drawing>
+      </w:r>
+    </w:p>
+    <w:p>
+      <w:pPr>
+        <w:ind w:firstLine="720"/>
+      </w:pPr>
+    </w:p>
+    <w:p>
+      <w:r>
+        <w:br w:type="page"/>
+      </w:r>
+    </w:p>
+    <w:p>
+      <w:pPr>
+        <w:pStyle w:val="ListParagraph"/>
+        <w:numPr>
+          <w:ilvl w:val="0"/>
+          <w:numId w:val="10"/>
+        </w:numPr>
+      </w:pPr>
+      <w:r>
+        <w:rPr>
+          <w:noProof/>
+        </w:rPr>
+        <w:lastRenderedPageBreak/>
+        <w:drawing>
+          <wp:anchor distT="0" distB="0" distL="114300" distR="114300" simplePos="0" relativeHeight="251658240" behindDoc="1" locked="0" layoutInCell="1" allowOverlap="1" wp14:anchorId="2FACC172" wp14:editId="77D65CE6">
+            <wp:simplePos x="0" y="0"/>
+            <wp:positionH relativeFrom="margin">
+              <wp:posOffset>3434080</wp:posOffset>
+            </wp:positionH>
+            <wp:positionV relativeFrom="paragraph">
+              <wp:posOffset>0</wp:posOffset>
+            </wp:positionV>
+            <wp:extent cx="1821815" cy="2948305"/>
+            <wp:effectExtent l="0" t="0" r="6985" b="4445"/>
+            <wp:wrapTight wrapText="bothSides">
+              <wp:wrapPolygon edited="0">
+                <wp:start x="0" y="0"/>
+                <wp:lineTo x="0" y="21493"/>
+                <wp:lineTo x="21457" y="21493"/>
+                <wp:lineTo x="21457" y="0"/>
+                <wp:lineTo x="0" y="0"/>
+              </wp:wrapPolygon>
+            </wp:wrapTight>
+            <wp:docPr id="629238852" name="Picture 1"/>
+            <wp:cNvGraphicFramePr>
+              <a:graphicFrameLocks xmlns:a="http://schemas.openxmlformats.org/drawingml/2006/main" noChangeAspect="1"/>
+            </wp:cNvGraphicFramePr>
+            <a:graphic xmlns:a="http://schemas.openxmlformats.org/drawingml/2006/main">
+              <a:graphicData uri="http://schemas.openxmlformats.org/drawingml/2006/picture">
+                <pic:pic xmlns:pic="http://schemas.openxmlformats.org/drawingml/2006/picture">
+                  <pic:nvPicPr>
+                    <pic:cNvPr id="629238852" name=""/>
+                    <pic:cNvPicPr/>
+                  </pic:nvPicPr>
+                  <pic:blipFill>
+                    <a:blip r:embed="rId46" cstate="print">
+                      <a:extLst>
+                        <a:ext uri="{28A0092B-C50C-407E-A947-70E740481C1C}">
+                          <a14:useLocalDpi xmlns:a14="http://schemas.microsoft.com/office/drawing/2010/main" val="0"/>
+                        </a:ext>
+                      </a:extLst>
+                    </a:blip>
+                    <a:stretch>
+                      <a:fillRect/>
+                    </a:stretch>
+                  </pic:blipFill>
+                  <pic:spPr>
+                    <a:xfrm>
+                      <a:off x="0" y="0"/>
+                      <a:ext cx="1821815" cy="2948305"/>
+                    </a:xfrm>
+                    <a:prstGeom prst="rect">
+                      <a:avLst/>
+                    </a:prstGeom>
+                  </pic:spPr>
+                </pic:pic>
+              </a:graphicData>
+            </a:graphic>
+            <wp14:sizeRelH relativeFrom="margin">
+              <wp14:pctWidth>0</wp14:pctWidth>
+            </wp14:sizeRelH>
+            <wp14:sizeRelV relativeFrom="margin">
+              <wp14:pctHeight>0</wp14:pctHeight>
+            </wp14:sizeRelV>
+          </wp:anchor>
+        </w:drawing>
+      </w:r>
+      <w:r>
+        <w:t xml:space="preserve">Clicking on each button in the nav bar will cause the text to change accordingly. I will </w:t>
+      </w:r>
+      <w:r>
+        <w:t>create UI for each tab in their respective function shown above.</w:t>
+      </w:r>
+    </w:p>
+    <w:p/>
+    <w:p/>
+    <w:p/>
+    <w:p/>
+    <w:p/>
+    <w:p/>
+    <w:p/>
+    <w:p/>
+    <w:p>
+      <w:pPr>
+        <w:rPr>
+          <w:b/>
+          <w:bCs/>
+        </w:rPr>
+      </w:pPr>
+      <w:r>
+        <w:rPr>
+          <w:b/>
+          <w:bCs/>
+        </w:rPr>
+        <w:t>29/07/2026</w:t>
+      </w:r>
+      <w:r>
+        <w:rPr>
+          <w:b/>
+          <w:bCs/>
+        </w:rPr>
+        <w:t xml:space="preserve"> – Working on the main page</w:t>
+      </w:r>
+    </w:p>
+    <w:p>
+      <w:pPr>
+        <w:pStyle w:val="ListParagraph"/>
+        <w:numPr>
+          <w:ilvl w:val="0"/>
+          <w:numId w:val="10"/>
+        </w:numPr>
+      </w:pPr>
+      <w:r>
+        <w:t>I’m not sure how I should create the</w:t>
+      </w:r>
+      <w:r>
+        <w:t xml:space="preserve"> gauge</w:t>
+      </w:r>
+      <w:r>
+        <w:t xml:space="preserve"> I want. It should be a </w:t>
+      </w:r>
+      <w:r>
+        <w:t>semi-</w:t>
+      </w:r>
+      <w:r>
+        <w:t xml:space="preserve">circular bar that updates depending on the percent of the </w:t>
+      </w:r>
+      <w:proofErr w:type="spellStart"/>
+      <w:r>
+        <w:t>wah</w:t>
+      </w:r>
+      <w:proofErr w:type="spellEnd"/>
+      <w:r>
+        <w:t>, however, the built</w:t>
+      </w:r>
+      <w:r>
+        <w:t>-</w:t>
+      </w:r>
+      <w:r>
+        <w:t>in</w:t>
+      </w:r>
+      <w:r>
+        <w:t xml:space="preserve"> displays</w:t>
+      </w:r>
+      <w:r>
+        <w:t xml:space="preserve"> such as </w:t>
+      </w:r>
+      <w:proofErr w:type="spellStart"/>
+      <w:proofErr w:type="gramStart"/>
+      <w:r>
+        <w:t>ui.highchart</w:t>
+      </w:r>
+      <w:proofErr w:type="spellEnd"/>
+      <w:proofErr w:type="gramEnd"/>
+      <w:r>
+        <w:t xml:space="preserve"> </w:t>
+      </w:r>
+      <w:r>
+        <w:t xml:space="preserve">and </w:t>
+      </w:r>
+      <w:proofErr w:type="spellStart"/>
+      <w:proofErr w:type="gramStart"/>
+      <w:r>
+        <w:t>ui.echart</w:t>
+      </w:r>
+      <w:proofErr w:type="spellEnd"/>
+      <w:proofErr w:type="gramEnd"/>
+      <w:r>
+        <w:t xml:space="preserve"> </w:t>
+      </w:r>
+      <w:r>
+        <w:t xml:space="preserve">don’t </w:t>
+      </w:r>
+      <w:r>
+        <w:t>look how I want them to look.</w:t>
+      </w:r>
+    </w:p>
+    <w:p>
+      <w:pPr>
+        <w:pStyle w:val="ListParagraph"/>
+        <w:numPr>
+          <w:ilvl w:val="0"/>
+          <w:numId w:val="10"/>
+        </w:numPr>
+      </w:pPr>
+      <w:r>
+        <w:t xml:space="preserve">Making it a semi-circle was too difficult for </w:t>
+      </w:r>
+      <w:proofErr w:type="gramStart"/>
+      <w:r>
+        <w:t>me,</w:t>
+      </w:r>
+      <w:proofErr w:type="gramEnd"/>
+      <w:r>
+        <w:t xml:space="preserve"> I’m going to use a full circle for the status bar to make it manageable.</w:t>
+      </w:r>
+    </w:p>
+    <w:p>
+      <w:pPr>
+        <w:pStyle w:val="ListParagraph"/>
+        <w:numPr>
+          <w:ilvl w:val="0"/>
+          <w:numId w:val="10"/>
+        </w:numPr>
+        <w:rPr>
+          <w:rStyle w:val="Hyperlink"/>
+          <w:color w:val="auto"/>
+          <w:u w:val="none"/>
+        </w:rPr>
+      </w:pPr>
+      <w:r>
+        <w:rPr>
+          <w:noProof/>
+        </w:rPr>
+        <w:drawing>
+          <wp:anchor distT="0" distB="0" distL="114300" distR="114300" simplePos="0" relativeHeight="251659264" behindDoc="0" locked="0" layoutInCell="1" allowOverlap="1" wp14:anchorId="1B1003B3" wp14:editId="60B48F6F">
+            <wp:simplePos x="0" y="0"/>
+            <wp:positionH relativeFrom="column">
+              <wp:posOffset>437128</wp:posOffset>
+            </wp:positionH>
+            <wp:positionV relativeFrom="paragraph">
+              <wp:posOffset>494433</wp:posOffset>
+            </wp:positionV>
+            <wp:extent cx="3697744" cy="2646513"/>
+            <wp:effectExtent l="0" t="0" r="0" b="1905"/>
+            <wp:wrapNone/>
+            <wp:docPr id="1096482210" name="Picture 1"/>
+            <wp:cNvGraphicFramePr>
+              <a:graphicFrameLocks xmlns:a="http://schemas.openxmlformats.org/drawingml/2006/main" noChangeAspect="1"/>
+            </wp:cNvGraphicFramePr>
+            <a:graphic xmlns:a="http://schemas.openxmlformats.org/drawingml/2006/main">
+              <a:graphicData uri="http://schemas.openxmlformats.org/drawingml/2006/picture">
+                <pic:pic xmlns:pic="http://schemas.openxmlformats.org/drawingml/2006/picture">
+                  <pic:nvPicPr>
+                    <pic:cNvPr id="1096482210" name=""/>
+                    <pic:cNvPicPr/>
+                  </pic:nvPicPr>
+                  <pic:blipFill>
+                    <a:blip r:embed="rId47" cstate="print">
+                      <a:extLst>
+                        <a:ext uri="{28A0092B-C50C-407E-A947-70E740481C1C}">
+                          <a14:useLocalDpi xmlns:a14="http://schemas.microsoft.com/office/drawing/2010/main" val="0"/>
+                        </a:ext>
+                      </a:extLst>
+                    </a:blip>
+                    <a:stretch>
+                      <a:fillRect/>
+                    </a:stretch>
+                  </pic:blipFill>
+                  <pic:spPr>
+                    <a:xfrm>
+                      <a:off x="0" y="0"/>
+                      <a:ext cx="3706361" cy="2652680"/>
+                    </a:xfrm>
+                    <a:prstGeom prst="rect">
+                      <a:avLst/>
+                    </a:prstGeom>
+                  </pic:spPr>
+                </pic:pic>
+              </a:graphicData>
+            </a:graphic>
+            <wp14:sizeRelH relativeFrom="margin">
+              <wp14:pctWidth>0</wp14:pctWidth>
+            </wp14:sizeRelH>
+            <wp14:sizeRelV relativeFrom="margin">
+              <wp14:pctHeight>0</wp14:pctHeight>
+            </wp14:sizeRelV>
+          </wp:anchor>
+        </w:drawing>
+      </w:r>
+      <w:r>
+        <w:t xml:space="preserve">I will use this website to generate a gauge: </w:t>
+      </w:r>
+      <w:hyperlink r:id="rId48" w:history="1">
+        <w:r>
+          <w:rPr>
+            <w:rStyle w:val="Hyperlink"/>
+          </w:rPr>
+          <w:t>https://nikitahl.github.io/svg-circle-progress-generator/</w:t>
+        </w:r>
+      </w:hyperlink>
+    </w:p>
+    <w:p/>
+    <w:p/>
+    <w:p/>
+    <w:p/>
+    <w:p/>
+    <w:p/>
+    <w:p/>
+    <w:p/>
+    <w:p/>
+    <w:p/>
+    <w:p/>
+    <w:p>
+      <w:pPr>
+        <w:pStyle w:val="ListParagraph"/>
+        <w:numPr>
+          <w:ilvl w:val="0"/>
+          <w:numId w:val="10"/>
+        </w:numPr>
+      </w:pPr>
+      <w:r>
+        <w:lastRenderedPageBreak/>
+        <w:t xml:space="preserve">Testing it </w:t>
+      </w:r>
+      <w:proofErr w:type="gramStart"/>
+      <w:r>
+        <w:t>separately, and</w:t>
+      </w:r>
+      <w:proofErr w:type="gramEnd"/>
+      <w:r>
+        <w:t xml:space="preserve"> trying to update the value in real time.</w:t>
+      </w:r>
+    </w:p>
+    <w:p>
+      <w:pPr>
+        <w:pStyle w:val="ListParagraph"/>
+      </w:pPr>
+      <w:r>
+        <w:rPr>
+          <w:noProof/>
+        </w:rPr>
+        <w:drawing>
+          <wp:inline distT="0" distB="0" distL="0" distR="0" wp14:anchorId="0D1FB4FF" wp14:editId="35CCCDCD">
+            <wp:extent cx="4754880" cy="1685754"/>
+            <wp:effectExtent l="0" t="0" r="7620" b="0"/>
+            <wp:docPr id="1397003218" name="Picture 1"/>
+            <wp:cNvGraphicFramePr>
+              <a:graphicFrameLocks xmlns:a="http://schemas.openxmlformats.org/drawingml/2006/main" noChangeAspect="1"/>
+            </wp:cNvGraphicFramePr>
+            <a:graphic xmlns:a="http://schemas.openxmlformats.org/drawingml/2006/main">
+              <a:graphicData uri="http://schemas.openxmlformats.org/drawingml/2006/picture">
+                <pic:pic xmlns:pic="http://schemas.openxmlformats.org/drawingml/2006/picture">
+                  <pic:nvPicPr>
+                    <pic:cNvPr id="1397003218" name=""/>
+                    <pic:cNvPicPr/>
+                  </pic:nvPicPr>
+                  <pic:blipFill>
+                    <a:blip r:embed="rId49"/>
+                    <a:stretch>
+                      <a:fillRect/>
+                    </a:stretch>
+                  </pic:blipFill>
+                  <pic:spPr>
+                    <a:xfrm>
+                      <a:off x="0" y="0"/>
+                      <a:ext cx="4781034" cy="1695027"/>
+                    </a:xfrm>
+                    <a:prstGeom prst="rect">
+                      <a:avLst/>
+                    </a:prstGeom>
+                  </pic:spPr>
+                </pic:pic>
+              </a:graphicData>
+            </a:graphic>
+          </wp:inline>
+        </w:drawing>
+      </w:r>
+    </w:p>
+    <w:p>
+      <w:pPr>
+        <w:ind w:firstLine="720"/>
+      </w:pPr>
+      <w:r>
+        <w:rPr>
+          <w:noProof/>
+        </w:rPr>
+        <w:drawing>
+          <wp:inline distT="0" distB="0" distL="0" distR="0" wp14:anchorId="3758A386" wp14:editId="78F2D4B4">
+            <wp:extent cx="1249550" cy="1195410"/>
+            <wp:effectExtent l="0" t="0" r="8255" b="5080"/>
+            <wp:docPr id="1335319340" name="Picture 1"/>
+            <wp:cNvGraphicFramePr>
+              <a:graphicFrameLocks xmlns:a="http://schemas.openxmlformats.org/drawingml/2006/main" noChangeAspect="1"/>
+            </wp:cNvGraphicFramePr>
+            <a:graphic xmlns:a="http://schemas.openxmlformats.org/drawingml/2006/main">
+              <a:graphicData uri="http://schemas.openxmlformats.org/drawingml/2006/picture">
+                <pic:pic xmlns:pic="http://schemas.openxmlformats.org/drawingml/2006/picture">
+                  <pic:nvPicPr>
+                    <pic:cNvPr id="1335319340" name=""/>
+                    <pic:cNvPicPr/>
+                  </pic:nvPicPr>
+                  <pic:blipFill>
+                    <a:blip r:embed="rId50"/>
+                    <a:stretch>
+                      <a:fillRect/>
+                    </a:stretch>
+                  </pic:blipFill>
+                  <pic:spPr>
+                    <a:xfrm>
+                      <a:off x="0" y="0"/>
+                      <a:ext cx="1256589" cy="1202144"/>
+                    </a:xfrm>
+                    <a:prstGeom prst="rect">
+                      <a:avLst/>
+                    </a:prstGeom>
+                  </pic:spPr>
+                </pic:pic>
+              </a:graphicData>
+            </a:graphic>
+          </wp:inline>
+        </w:drawing>
+      </w:r>
+    </w:p>
+    <w:p/>
+    <w:p>
+      <w:pPr>
+        <w:pStyle w:val="ListParagraph"/>
+        <w:numPr>
+          <w:ilvl w:val="0"/>
+          <w:numId w:val="15"/>
+        </w:numPr>
+      </w:pPr>
+      <w:r>
+        <w:t xml:space="preserve">The lines that control the value of the gauge are </w:t>
+      </w:r>
+      <w:r>
+        <w:t>“stroke-</w:t>
+      </w:r>
+      <w:proofErr w:type="spellStart"/>
+      <w:r>
+        <w:t>dashoffset</w:t>
+      </w:r>
+      <w:proofErr w:type="spellEnd"/>
+      <w:r>
+        <w:t xml:space="preserve">”, </w:t>
+      </w:r>
+      <w:r>
+        <w:t>the line that displays the value in the middle of the gauge.</w:t>
+      </w:r>
+    </w:p>
+    <w:p>
+      <w:pPr>
+        <w:pStyle w:val="ListParagraph"/>
+        <w:numPr>
+          <w:ilvl w:val="0"/>
+          <w:numId w:val="15"/>
+        </w:numPr>
+      </w:pPr>
+      <w:r>
+        <w:t>Stroke-</w:t>
+      </w:r>
+      <w:proofErr w:type="spellStart"/>
+      <w:r>
+        <w:t>dashoffset</w:t>
+      </w:r>
+      <w:proofErr w:type="spellEnd"/>
+      <w:r>
+        <w:t xml:space="preserve"> has a range of </w:t>
+      </w:r>
+      <w:r>
+        <w:t>0 to 722, so I will need to make sure a value of 100 corresponds to 722.</w:t>
+      </w:r>
+    </w:p>
+    <w:p>
+      <w:pPr>
+        <w:pStyle w:val="ListParagraph"/>
+      </w:pPr>
+      <w:r>
+        <w:rPr>
+          <w:noProof/>
+        </w:rPr>
+        <w:drawing>
+          <wp:inline distT="0" distB="0" distL="0" distR="0" wp14:anchorId="1F4CA2BD" wp14:editId="3626468F">
+            <wp:extent cx="4696894" cy="2361977"/>
+            <wp:effectExtent l="0" t="0" r="8890" b="635"/>
+            <wp:docPr id="865218620" name="Picture 1"/>
+            <wp:cNvGraphicFramePr>
+              <a:graphicFrameLocks xmlns:a="http://schemas.openxmlformats.org/drawingml/2006/main" noChangeAspect="1"/>
+            </wp:cNvGraphicFramePr>
+            <a:graphic xmlns:a="http://schemas.openxmlformats.org/drawingml/2006/main">
+              <a:graphicData uri="http://schemas.openxmlformats.org/drawingml/2006/picture">
+                <pic:pic xmlns:pic="http://schemas.openxmlformats.org/drawingml/2006/picture">
+                  <pic:nvPicPr>
+                    <pic:cNvPr id="865218620" name=""/>
+                    <pic:cNvPicPr/>
+                  </pic:nvPicPr>
+                  <pic:blipFill>
+                    <a:blip r:embed="rId51"/>
+                    <a:stretch>
+                      <a:fillRect/>
+                    </a:stretch>
+                  </pic:blipFill>
+                  <pic:spPr>
+                    <a:xfrm>
+                      <a:off x="0" y="0"/>
+                      <a:ext cx="4704869" cy="2365988"/>
+                    </a:xfrm>
+                    <a:prstGeom prst="rect">
+                      <a:avLst/>
+                    </a:prstGeom>
+                  </pic:spPr>
+                </pic:pic>
+              </a:graphicData>
+            </a:graphic>
+          </wp:inline>
+        </w:drawing>
+      </w:r>
+    </w:p>
+    <w:p>
+      <w:pPr>
+        <w:pStyle w:val="ListParagraph"/>
+        <w:numPr>
+          <w:ilvl w:val="0"/>
+          <w:numId w:val="15"/>
+        </w:numPr>
+      </w:pPr>
+      <w:r>
+        <w:t>Gauge now updates according to the value variable</w:t>
+      </w:r>
+      <w:r>
+        <w:t>.</w:t>
+      </w:r>
+    </w:p>
+    <w:p/>
+    <w:p>
+      <w:pPr>
+        <w:rPr>
+          <w:b/>
+          <w:bCs/>
+        </w:rPr>
+      </w:pPr>
+      <w:r>
+        <w:rPr>
+          <w:b/>
+          <w:bCs/>
+        </w:rPr>
+        <w:t>5/08/2026</w:t>
+      </w:r>
+      <w:r>
+        <w:rPr>
+          <w:b/>
+          <w:bCs/>
+        </w:rPr>
+        <w:t xml:space="preserve"> – Adding the gauge onto the </w:t>
+      </w:r>
+      <w:r>
+        <w:rPr>
+          <w:b/>
+          <w:bCs/>
+        </w:rPr>
+        <w:t>actual UI</w:t>
+      </w:r>
+    </w:p>
+    <w:p>
+      <w:r>
+        <w:t xml:space="preserve">Since the line of code to create the </w:t>
+      </w:r>
+      <w:r>
+        <w:t xml:space="preserve">element for the gauge is inside the homepage function, the gauge function </w:t>
+      </w:r>
+      <w:r>
+        <w:t xml:space="preserve">(which is outside) can’t access it. I fixed this </w:t>
+      </w:r>
+      <w:r>
+        <w:t>by adding an extra parameter in the gauge function.</w:t>
+      </w:r>
+    </w:p>
+    <w:p>
+      <w:r>
+        <w:rPr>
+          <w:noProof/>
+        </w:rPr>
+        <w:lastRenderedPageBreak/>
+        <w:drawing>
+          <wp:inline distT="0" distB="0" distL="0" distR="0" wp14:anchorId="7E4BC0FF" wp14:editId="5CF17278">
+            <wp:extent cx="5031430" cy="2744264"/>
+            <wp:effectExtent l="0" t="0" r="0" b="0"/>
+            <wp:docPr id="911439430" name="Picture 1"/>
+            <wp:cNvGraphicFramePr>
+              <a:graphicFrameLocks xmlns:a="http://schemas.openxmlformats.org/drawingml/2006/main" noChangeAspect="1"/>
+            </wp:cNvGraphicFramePr>
+            <a:graphic xmlns:a="http://schemas.openxmlformats.org/drawingml/2006/main">
+              <a:graphicData uri="http://schemas.openxmlformats.org/drawingml/2006/picture">
+                <pic:pic xmlns:pic="http://schemas.openxmlformats.org/drawingml/2006/picture">
+                  <pic:nvPicPr>
+                    <pic:cNvPr id="911439430" name=""/>
+                    <pic:cNvPicPr/>
+                  </pic:nvPicPr>
+                  <pic:blipFill>
+                    <a:blip r:embed="rId52"/>
+                    <a:stretch>
+                      <a:fillRect/>
+                    </a:stretch>
+                  </pic:blipFill>
+                  <pic:spPr>
+                    <a:xfrm>
+                      <a:off x="0" y="0"/>
+                      <a:ext cx="5035780" cy="2746636"/>
+                    </a:xfrm>
+                    <a:prstGeom prst="rect">
+                      <a:avLst/>
+                    </a:prstGeom>
+                  </pic:spPr>
+                </pic:pic>
+              </a:graphicData>
+            </a:graphic>
+          </wp:inline>
+        </w:drawing>
+      </w:r>
+    </w:p>
+    <w:p/>
+    <w:p>
+      <w:pPr>
+        <w:pStyle w:val="ListParagraph"/>
+        <w:numPr>
+          <w:ilvl w:val="0"/>
+          <w:numId w:val="15"/>
+        </w:numPr>
+      </w:pPr>
+      <w:r>
+        <w:t>Created a proper header</w:t>
+      </w:r>
+    </w:p>
+    <w:p>
+      <w:pPr>
+        <w:pStyle w:val="ListParagraph"/>
+      </w:pPr>
+      <w:r>
+        <w:rPr>
+          <w:noProof/>
+        </w:rPr>
+        <w:drawing>
+          <wp:inline distT="0" distB="0" distL="0" distR="0" wp14:anchorId="0A38EBD3" wp14:editId="60F5A499">
+            <wp:extent cx="5731510" cy="1287780"/>
+            <wp:effectExtent l="0" t="0" r="2540" b="7620"/>
+            <wp:docPr id="1611093146" name="Picture 1"/>
+            <wp:cNvGraphicFramePr>
+              <a:graphicFrameLocks xmlns:a="http://schemas.openxmlformats.org/drawingml/2006/main" noChangeAspect="1"/>
+            </wp:cNvGraphicFramePr>
+            <a:graphic xmlns:a="http://schemas.openxmlformats.org/drawingml/2006/main">
+              <a:graphicData uri="http://schemas.openxmlformats.org/drawingml/2006/picture">
+                <pic:pic xmlns:pic="http://schemas.openxmlformats.org/drawingml/2006/picture">
+                  <pic:nvPicPr>
+                    <pic:cNvPr id="1611093146" name=""/>
+                    <pic:cNvPicPr/>
+                  </pic:nvPicPr>
+                  <pic:blipFill>
+                    <a:blip r:embed="rId53"/>
+                    <a:stretch>
+                      <a:fillRect/>
+                    </a:stretch>
+                  </pic:blipFill>
+                  <pic:spPr>
+                    <a:xfrm>
+                      <a:off x="0" y="0"/>
+                      <a:ext cx="5731510" cy="1287780"/>
+                    </a:xfrm>
+                    <a:prstGeom prst="rect">
+                      <a:avLst/>
+                    </a:prstGeom>
+                  </pic:spPr>
+                </pic:pic>
+              </a:graphicData>
+            </a:graphic>
+          </wp:inline>
+        </w:drawing>
+      </w:r>
+    </w:p>
+    <w:p>
+      <w:pPr>
+        <w:ind w:firstLine="720"/>
+      </w:pPr>
+      <w:r>
+        <w:rPr>
+          <w:noProof/>
+        </w:rPr>
+        <w:drawing>
+          <wp:inline distT="0" distB="0" distL="0" distR="0" wp14:anchorId="4BC3BEBB" wp14:editId="63214278">
+            <wp:extent cx="5731510" cy="923290"/>
+            <wp:effectExtent l="0" t="0" r="2540" b="0"/>
+            <wp:docPr id="1078211455" name="Picture 1"/>
+            <wp:cNvGraphicFramePr>
+              <a:graphicFrameLocks xmlns:a="http://schemas.openxmlformats.org/drawingml/2006/main" noChangeAspect="1"/>
+            </wp:cNvGraphicFramePr>
+            <a:graphic xmlns:a="http://schemas.openxmlformats.org/drawingml/2006/main">
+              <a:graphicData uri="http://schemas.openxmlformats.org/drawingml/2006/picture">
+                <pic:pic xmlns:pic="http://schemas.openxmlformats.org/drawingml/2006/picture">
+                  <pic:nvPicPr>
+                    <pic:cNvPr id="1078211455" name=""/>
+                    <pic:cNvPicPr/>
+                  </pic:nvPicPr>
+                  <pic:blipFill>
+                    <a:blip r:embed="rId54"/>
+                    <a:stretch>
+                      <a:fillRect/>
+                    </a:stretch>
+                  </pic:blipFill>
+                  <pic:spPr>
+                    <a:xfrm>
+                      <a:off x="0" y="0"/>
+                      <a:ext cx="5731510" cy="923290"/>
+                    </a:xfrm>
+                    <a:prstGeom prst="rect">
+                      <a:avLst/>
+                    </a:prstGeom>
+                  </pic:spPr>
+                </pic:pic>
+              </a:graphicData>
+            </a:graphic>
+          </wp:inline>
+        </w:drawing>
+      </w:r>
+    </w:p>
+    <w:p>
+      <w:pPr>
+        <w:ind w:firstLine="720"/>
+      </w:pPr>
+      <w:r>
+        <w:rPr>
+          <w:noProof/>
+        </w:rPr>
+        <w:drawing>
+          <wp:inline distT="0" distB="0" distL="0" distR="0" wp14:anchorId="3931C089" wp14:editId="59C7FC35">
+            <wp:extent cx="5731510" cy="1397000"/>
+            <wp:effectExtent l="0" t="0" r="2540" b="0"/>
+            <wp:docPr id="1416733423" name="Picture 1"/>
+            <wp:cNvGraphicFramePr>
+              <a:graphicFrameLocks xmlns:a="http://schemas.openxmlformats.org/drawingml/2006/main" noChangeAspect="1"/>
+            </wp:cNvGraphicFramePr>
+            <a:graphic xmlns:a="http://schemas.openxmlformats.org/drawingml/2006/main">
+              <a:graphicData uri="http://schemas.openxmlformats.org/drawingml/2006/picture">
+                <pic:pic xmlns:pic="http://schemas.openxmlformats.org/drawingml/2006/picture">
+                  <pic:nvPicPr>
+                    <pic:cNvPr id="1416733423" name=""/>
+                    <pic:cNvPicPr/>
+                  </pic:nvPicPr>
+                  <pic:blipFill>
+                    <a:blip r:embed="rId55"/>
+                    <a:stretch>
+                      <a:fillRect/>
+                    </a:stretch>
+                  </pic:blipFill>
+                  <pic:spPr>
+                    <a:xfrm>
+                      <a:off x="0" y="0"/>
+                      <a:ext cx="5731510" cy="1397000"/>
+                    </a:xfrm>
+                    <a:prstGeom prst="rect">
+                      <a:avLst/>
+                    </a:prstGeom>
+                  </pic:spPr>
+                </pic:pic>
+              </a:graphicData>
+            </a:graphic>
+          </wp:inline>
+        </w:drawing>
+      </w:r>
+    </w:p>
+    <w:p>
+      <w:pPr>
+        <w:pStyle w:val="ListParagraph"/>
+        <w:numPr>
+          <w:ilvl w:val="0"/>
+          <w:numId w:val="15"/>
+        </w:numPr>
+      </w:pPr>
+      <w:r>
+        <w:rPr>
+          <w:noProof/>
+        </w:rPr>
+        <w:lastRenderedPageBreak/>
+        <w:drawing>
+          <wp:anchor distT="0" distB="0" distL="114300" distR="114300" simplePos="0" relativeHeight="251660288" behindDoc="1" locked="0" layoutInCell="1" allowOverlap="1" wp14:anchorId="7E9E7C92" wp14:editId="3C33BB89">
+            <wp:simplePos x="0" y="0"/>
+            <wp:positionH relativeFrom="column">
+              <wp:posOffset>3960588</wp:posOffset>
+            </wp:positionH>
+            <wp:positionV relativeFrom="paragraph">
+              <wp:posOffset>372</wp:posOffset>
+            </wp:positionV>
+            <wp:extent cx="1588135" cy="2720340"/>
+            <wp:effectExtent l="0" t="0" r="0" b="3810"/>
+            <wp:wrapTight wrapText="bothSides">
+              <wp:wrapPolygon edited="0">
+                <wp:start x="0" y="0"/>
+                <wp:lineTo x="0" y="21479"/>
+                <wp:lineTo x="21246" y="21479"/>
+                <wp:lineTo x="21246" y="0"/>
+                <wp:lineTo x="0" y="0"/>
+              </wp:wrapPolygon>
+            </wp:wrapTight>
+            <wp:docPr id="944702071" name="Picture 1"/>
+            <wp:cNvGraphicFramePr>
+              <a:graphicFrameLocks xmlns:a="http://schemas.openxmlformats.org/drawingml/2006/main" noChangeAspect="1"/>
+            </wp:cNvGraphicFramePr>
+            <a:graphic xmlns:a="http://schemas.openxmlformats.org/drawingml/2006/main">
+              <a:graphicData uri="http://schemas.openxmlformats.org/drawingml/2006/picture">
+                <pic:pic xmlns:pic="http://schemas.openxmlformats.org/drawingml/2006/picture">
+                  <pic:nvPicPr>
+                    <pic:cNvPr id="944702071" name=""/>
+                    <pic:cNvPicPr/>
+                  </pic:nvPicPr>
+                  <pic:blipFill>
+                    <a:blip r:embed="rId56" cstate="print">
+                      <a:extLst>
+                        <a:ext uri="{28A0092B-C50C-407E-A947-70E740481C1C}">
+                          <a14:useLocalDpi xmlns:a14="http://schemas.microsoft.com/office/drawing/2010/main" val="0"/>
+                        </a:ext>
+                      </a:extLst>
+                    </a:blip>
+                    <a:stretch>
+                      <a:fillRect/>
+                    </a:stretch>
+                  </pic:blipFill>
+                  <pic:spPr>
+                    <a:xfrm>
+                      <a:off x="0" y="0"/>
+                      <a:ext cx="1588135" cy="2720340"/>
+                    </a:xfrm>
+                    <a:prstGeom prst="rect">
+                      <a:avLst/>
+                    </a:prstGeom>
+                  </pic:spPr>
+                </pic:pic>
+              </a:graphicData>
+            </a:graphic>
+            <wp14:sizeRelH relativeFrom="margin">
+              <wp14:pctWidth>0</wp14:pctWidth>
+            </wp14:sizeRelH>
+            <wp14:sizeRelV relativeFrom="margin">
+              <wp14:pctHeight>0</wp14:pctHeight>
+            </wp14:sizeRelV>
+          </wp:anchor>
+        </w:drawing>
+      </w:r>
+      <w:r>
+        <w:t>The home page of the weba</w:t>
+      </w:r>
+      <w:r>
+        <w:t>pp</w:t>
+      </w:r>
+      <w:r>
+        <w:t xml:space="preserve"> now looks like</w:t>
+      </w:r>
+      <w:r>
+        <w:t xml:space="preserve"> this:</w:t>
+      </w:r>
+      <w:r>
+        <w:t xml:space="preserve"> </w:t>
+      </w:r>
+    </w:p>
+    <w:p>
+      <w:pPr>
+        <w:pStyle w:val="ListParagraph"/>
+      </w:pPr>
+    </w:p>
+    <w:p/>
+    <w:p/>
+    <w:p/>
+    <w:p/>
+    <w:p/>
+    <w:p/>
+    <w:p/>
+    <w:p/>
+    <w:p>
+      <w:pPr>
+        <w:rPr>
+          <w:b/>
+          <w:bCs/>
+        </w:rPr>
+      </w:pPr>
+      <w:r>
+        <w:rPr>
+          <w:b/>
+          <w:bCs/>
+        </w:rPr>
+        <w:t>6/08/2026 – Working on the settings page</w:t>
+      </w:r>
+    </w:p>
+    <w:p>
+      <w:pPr>
+        <w:pStyle w:val="ListParagraph"/>
+        <w:numPr>
+          <w:ilvl w:val="0"/>
+          <w:numId w:val="15"/>
+        </w:numPr>
+      </w:pPr>
+      <w:r>
+        <w:t xml:space="preserve">Added sliders for the settings using the example shown in the </w:t>
+      </w:r>
+      <w:proofErr w:type="spellStart"/>
+      <w:r>
+        <w:t>NiceGUI</w:t>
+      </w:r>
+      <w:proofErr w:type="spellEnd"/>
+      <w:r>
+        <w:t xml:space="preserve"> documentation</w:t>
+      </w:r>
+    </w:p>
+    <w:p>
+      <w:pPr>
+        <w:pStyle w:val="ListParagraph"/>
+      </w:pPr>
+      <w:r>
+        <w:rPr>
+          <w:noProof/>
+        </w:rPr>
+        <w:drawing>
+          <wp:inline distT="0" distB="0" distL="0" distR="0" wp14:anchorId="64710CC6" wp14:editId="2FDB793E">
+            <wp:extent cx="4059044" cy="1721474"/>
+            <wp:effectExtent l="0" t="0" r="0" b="0"/>
+            <wp:docPr id="39822307" name="Picture 1"/>
+            <wp:cNvGraphicFramePr>
+              <a:graphicFrameLocks xmlns:a="http://schemas.openxmlformats.org/drawingml/2006/main" noChangeAspect="1"/>
+            </wp:cNvGraphicFramePr>
+            <a:graphic xmlns:a="http://schemas.openxmlformats.org/drawingml/2006/main">
+              <a:graphicData uri="http://schemas.openxmlformats.org/drawingml/2006/picture">
+                <pic:pic xmlns:pic="http://schemas.openxmlformats.org/drawingml/2006/picture">
+                  <pic:nvPicPr>
+                    <pic:cNvPr id="39822307" name=""/>
+                    <pic:cNvPicPr/>
+                  </pic:nvPicPr>
+                  <pic:blipFill>
+                    <a:blip r:embed="rId57"/>
+                    <a:stretch>
+                      <a:fillRect/>
+                    </a:stretch>
+                  </pic:blipFill>
+                  <pic:spPr>
+                    <a:xfrm>
+                      <a:off x="0" y="0"/>
+                      <a:ext cx="4065582" cy="1724247"/>
+                    </a:xfrm>
+                    <a:prstGeom prst="rect">
+                      <a:avLst/>
+                    </a:prstGeom>
+                  </pic:spPr>
+                </pic:pic>
+              </a:graphicData>
+            </a:graphic>
+          </wp:inline>
+        </w:drawing>
+      </w:r>
+    </w:p>
+    <w:p>
+      <w:pPr>
+        <w:ind w:firstLine="720"/>
+      </w:pPr>
+      <w:r>
+        <w:rPr>
+          <w:noProof/>
+        </w:rPr>
+        <w:drawing>
+          <wp:inline distT="0" distB="0" distL="0" distR="0" wp14:anchorId="13A57FC3" wp14:editId="22F0A5BE">
+            <wp:extent cx="4032281" cy="2030883"/>
+            <wp:effectExtent l="0" t="0" r="6350" b="7620"/>
+            <wp:docPr id="652748182" name="Picture 1"/>
+            <wp:cNvGraphicFramePr>
+              <a:graphicFrameLocks xmlns:a="http://schemas.openxmlformats.org/drawingml/2006/main" noChangeAspect="1"/>
+            </wp:cNvGraphicFramePr>
+            <a:graphic xmlns:a="http://schemas.openxmlformats.org/drawingml/2006/main">
+              <a:graphicData uri="http://schemas.openxmlformats.org/drawingml/2006/picture">
+                <pic:pic xmlns:pic="http://schemas.openxmlformats.org/drawingml/2006/picture">
+                  <pic:nvPicPr>
+                    <pic:cNvPr id="652748182" name=""/>
+                    <pic:cNvPicPr/>
+                  </pic:nvPicPr>
+                  <pic:blipFill>
+                    <a:blip r:embed="rId58"/>
+                    <a:stretch>
+                      <a:fillRect/>
+                    </a:stretch>
+                  </pic:blipFill>
+                  <pic:spPr>
+                    <a:xfrm>
+                      <a:off x="0" y="0"/>
+                      <a:ext cx="4041347" cy="2035449"/>
+                    </a:xfrm>
+                    <a:prstGeom prst="rect">
+                      <a:avLst/>
+                    </a:prstGeom>
+                  </pic:spPr>
+                </pic:pic>
+              </a:graphicData>
+            </a:graphic>
+          </wp:inline>
+        </w:drawing>
+      </w:r>
+    </w:p>
+    <w:p>
+      <w:pPr>
+        <w:pStyle w:val="ListParagraph"/>
+        <w:numPr>
+          <w:ilvl w:val="0"/>
+          <w:numId w:val="15"/>
+        </w:numPr>
+      </w:pPr>
+      <w:r>
+        <w:t xml:space="preserve">These sliders currently do not do anything so I will </w:t>
+      </w:r>
+      <w:r>
+        <w:t>make them save their values to a JSON fil</w:t>
+      </w:r>
+      <w:r>
+        <w:t>e.</w:t>
+      </w:r>
+    </w:p>
+    <w:p>
+      <w:pPr>
+        <w:pStyle w:val="ListParagraph"/>
+        <w:numPr>
+          <w:ilvl w:val="0"/>
+          <w:numId w:val="15"/>
+        </w:numPr>
+      </w:pPr>
+      <w:r>
+        <w:t xml:space="preserve">I have created a function to update the JSON file </w:t>
+      </w:r>
+      <w:r>
+        <w:t xml:space="preserve">but I’m unsure how to </w:t>
+      </w:r>
+      <w:r>
+        <w:t>save the slider number.</w:t>
+      </w:r>
+    </w:p>
+    <w:p>
+      <w:pPr>
+        <w:pStyle w:val="ListParagraph"/>
+      </w:pPr>
+    </w:p>
+    <w:p>
+      <w:pPr>
+        <w:pStyle w:val="ListParagraph"/>
+      </w:pPr>
+      <w:r>
+        <w:rPr>
+          <w:noProof/>
+        </w:rPr>
+        <w:drawing>
+          <wp:inline distT="0" distB="0" distL="0" distR="0" wp14:anchorId="2F5C59C8" wp14:editId="7C232EA8">
+            <wp:extent cx="3095579" cy="2660703"/>
+            <wp:effectExtent l="0" t="0" r="0" b="6350"/>
+            <wp:docPr id="1444907526" name="Picture 1"/>
+            <wp:cNvGraphicFramePr>
+              <a:graphicFrameLocks xmlns:a="http://schemas.openxmlformats.org/drawingml/2006/main" noChangeAspect="1"/>
+            </wp:cNvGraphicFramePr>
+            <a:graphic xmlns:a="http://schemas.openxmlformats.org/drawingml/2006/main">
+              <a:graphicData uri="http://schemas.openxmlformats.org/drawingml/2006/picture">
+                <pic:pic xmlns:pic="http://schemas.openxmlformats.org/drawingml/2006/picture">
+                  <pic:nvPicPr>
+                    <pic:cNvPr id="1444907526" name=""/>
+                    <pic:cNvPicPr/>
+                  </pic:nvPicPr>
+                  <pic:blipFill>
+                    <a:blip r:embed="rId59"/>
+                    <a:stretch>
+                      <a:fillRect/>
+                    </a:stretch>
+                  </pic:blipFill>
+                  <pic:spPr>
+                    <a:xfrm>
+                      <a:off x="0" y="0"/>
+                      <a:ext cx="3098521" cy="2663231"/>
+                    </a:xfrm>
+                    <a:prstGeom prst="rect">
+                      <a:avLst/>
+                    </a:prstGeom>
+                  </pic:spPr>
+                </pic:pic>
+              </a:graphicData>
+            </a:graphic>
+          </wp:inline>
+        </w:drawing>
+      </w:r>
+    </w:p>
+    <w:p/>
+    <w:p>
+      <w:pPr>
+        <w:pStyle w:val="ListParagraph"/>
+        <w:numPr>
+          <w:ilvl w:val="0"/>
+          <w:numId w:val="15"/>
+        </w:numPr>
+      </w:pPr>
+      <w:r>
+        <w:t xml:space="preserve">I’ve encountered an issue with my variable for min and max </w:t>
+      </w:r>
+      <w:proofErr w:type="spellStart"/>
+      <w:r>
+        <w:t>wah</w:t>
+      </w:r>
+      <w:proofErr w:type="spellEnd"/>
+      <w:r>
+        <w:t xml:space="preserve"> being immutable, this means that I won’t be able to update it real time with my slider, so the </w:t>
+      </w:r>
+      <w:proofErr w:type="spellStart"/>
+      <w:r>
+        <w:t>wah</w:t>
+      </w:r>
+      <w:proofErr w:type="spellEnd"/>
+      <w:r>
+        <w:t xml:space="preserve"> settings wouldn’t </w:t>
+      </w:r>
+      <w:proofErr w:type="gramStart"/>
+      <w:r>
+        <w:t>actually change</w:t>
+      </w:r>
+      <w:proofErr w:type="gramEnd"/>
+      <w:r>
+        <w:t>.</w:t>
+      </w:r>
+    </w:p>
+    <w:p>
+      <w:pPr>
+        <w:pStyle w:val="ListParagraph"/>
+      </w:pPr>
+      <w:r>
+        <w:rPr>
+          <w:noProof/>
+        </w:rPr>
+        <w:drawing>
+          <wp:inline distT="0" distB="0" distL="0" distR="0" wp14:anchorId="514BB052" wp14:editId="5FB8271C">
+            <wp:extent cx="5630061" cy="800212"/>
+            <wp:effectExtent l="0" t="0" r="0" b="0"/>
+            <wp:docPr id="509491472" name="Picture 1"/>
+            <wp:cNvGraphicFramePr>
+              <a:graphicFrameLocks xmlns:a="http://schemas.openxmlformats.org/drawingml/2006/main" noChangeAspect="1"/>
+            </wp:cNvGraphicFramePr>
+            <a:graphic xmlns:a="http://schemas.openxmlformats.org/drawingml/2006/main">
+              <a:graphicData uri="http://schemas.openxmlformats.org/drawingml/2006/picture">
+                <pic:pic xmlns:pic="http://schemas.openxmlformats.org/drawingml/2006/picture">
+                  <pic:nvPicPr>
+                    <pic:cNvPr id="509491472" name=""/>
+                    <pic:cNvPicPr/>
+                  </pic:nvPicPr>
+                  <pic:blipFill>
+                    <a:blip r:embed="rId60"/>
+                    <a:stretch>
+                      <a:fillRect/>
+                    </a:stretch>
+                  </pic:blipFill>
+                  <pic:spPr>
+                    <a:xfrm>
+                      <a:off x="0" y="0"/>
+                      <a:ext cx="5630061" cy="800212"/>
+                    </a:xfrm>
+                    <a:prstGeom prst="rect">
+                      <a:avLst/>
+                    </a:prstGeom>
+                  </pic:spPr>
+                </pic:pic>
+              </a:graphicData>
+            </a:graphic>
+          </wp:inline>
+        </w:drawing>
+      </w:r>
+    </w:p>
+    <w:p>
+      <w:pPr>
+        <w:pStyle w:val="ListParagraph"/>
+        <w:numPr>
+          <w:ilvl w:val="0"/>
+          <w:numId w:val="15"/>
+        </w:numPr>
+      </w:pPr>
+      <w:r>
+        <w:t>To fix this, I’m using a dictionary to store the values because a dictionary is mutable.</w:t>
+      </w:r>
+    </w:p>
+    <w:p>
+      <w:pPr>
+        <w:pStyle w:val="ListParagraph"/>
+        <w:numPr>
+          <w:ilvl w:val="0"/>
+          <w:numId w:val="15"/>
+        </w:numPr>
+      </w:pPr>
+      <w:r>
+        <w:t>Starting by changing the function that loads the setting values</w:t>
+      </w:r>
+    </w:p>
+    <w:p>
+      <w:pPr>
+        <w:pStyle w:val="ListParagraph"/>
+      </w:pPr>
+      <w:r>
+        <w:rPr>
+          <w:noProof/>
+        </w:rPr>
+        <w:drawing>
+          <wp:inline distT="0" distB="0" distL="0" distR="0" wp14:anchorId="231ED6EA" wp14:editId="22744543">
+            <wp:extent cx="5018049" cy="1507750"/>
+            <wp:effectExtent l="0" t="0" r="0" b="0"/>
+            <wp:docPr id="1214671147" name="Picture 1"/>
+            <wp:cNvGraphicFramePr>
+              <a:graphicFrameLocks xmlns:a="http://schemas.openxmlformats.org/drawingml/2006/main" noChangeAspect="1"/>
+            </wp:cNvGraphicFramePr>
+            <a:graphic xmlns:a="http://schemas.openxmlformats.org/drawingml/2006/main">
+              <a:graphicData uri="http://schemas.openxmlformats.org/drawingml/2006/picture">
+                <pic:pic xmlns:pic="http://schemas.openxmlformats.org/drawingml/2006/picture">
+                  <pic:nvPicPr>
+                    <pic:cNvPr id="1214671147" name=""/>
+                    <pic:cNvPicPr/>
+                  </pic:nvPicPr>
+                  <pic:blipFill>
+                    <a:blip r:embed="rId61"/>
+                    <a:stretch>
+                      <a:fillRect/>
+                    </a:stretch>
+                  </pic:blipFill>
+                  <pic:spPr>
+                    <a:xfrm>
+                      <a:off x="0" y="0"/>
+                      <a:ext cx="5028991" cy="1511038"/>
+                    </a:xfrm>
+                    <a:prstGeom prst="rect">
+                      <a:avLst/>
+                    </a:prstGeom>
+                  </pic:spPr>
+                </pic:pic>
+              </a:graphicData>
+            </a:graphic>
+          </wp:inline>
+        </w:drawing>
+      </w:r>
+    </w:p>
+    <w:p>
+      <w:pPr>
+        <w:pStyle w:val="ListParagraph"/>
+        <w:numPr>
+          <w:ilvl w:val="0"/>
+          <w:numId w:val="15"/>
+        </w:numPr>
+      </w:pPr>
+      <w:r>
+        <w:t>Now it returns a dictionary instead of a tuple</w:t>
+      </w:r>
+    </w:p>
+    <w:p/>
+    <w:p/>
+    <w:p/>
+    <w:p/>
+    <w:p/>
+    <w:p>
+      <w:pPr>
+        <w:rPr>
+          <w:b/>
+          <w:bCs/>
+        </w:rPr>
+      </w:pPr>
+      <w:r>
+        <w:rPr>
+          <w:b/>
+          <w:bCs/>
+        </w:rPr>
+        <w:lastRenderedPageBreak/>
+        <w:t>7/08/2026</w:t>
+      </w:r>
+    </w:p>
+    <w:p>
+      <w:pPr>
+        <w:pStyle w:val="ListParagraph"/>
+        <w:numPr>
+          <w:ilvl w:val="0"/>
+          <w:numId w:val="15"/>
+        </w:numPr>
+      </w:pPr>
+      <w:r>
+        <w:t>Working on getting the value of the slider in real time</w:t>
+      </w:r>
+    </w:p>
+    <w:p>
+      <w:pPr>
+        <w:pStyle w:val="ListParagraph"/>
+      </w:pPr>
+      <w:r>
+        <w:drawing>
+          <wp:inline distT="0" distB="0" distL="0" distR="0" wp14:anchorId="2EE93835" wp14:editId="7FE3B513">
+            <wp:extent cx="4839630" cy="551201"/>
+            <wp:effectExtent l="0" t="0" r="0" b="1270"/>
+            <wp:docPr id="128107845" name="Picture 1"/>
+            <wp:cNvGraphicFramePr>
+              <a:graphicFrameLocks xmlns:a="http://schemas.openxmlformats.org/drawingml/2006/main" noChangeAspect="1"/>
+            </wp:cNvGraphicFramePr>
+            <a:graphic xmlns:a="http://schemas.openxmlformats.org/drawingml/2006/main">
+              <a:graphicData uri="http://schemas.openxmlformats.org/drawingml/2006/picture">
+                <pic:pic xmlns:pic="http://schemas.openxmlformats.org/drawingml/2006/picture">
+                  <pic:nvPicPr>
+                    <pic:cNvPr id="128107845" name=""/>
+                    <pic:cNvPicPr/>
+                  </pic:nvPicPr>
+                  <pic:blipFill>
+                    <a:blip r:embed="rId62"/>
+                    <a:stretch>
+                      <a:fillRect/>
+                    </a:stretch>
+                  </pic:blipFill>
+                  <pic:spPr>
+                    <a:xfrm>
+                      <a:off x="0" y="0"/>
+                      <a:ext cx="4859773" cy="553495"/>
+                    </a:xfrm>
+                    <a:prstGeom prst="rect">
+                      <a:avLst/>
+                    </a:prstGeom>
+                  </pic:spPr>
+                </pic:pic>
+              </a:graphicData>
+            </a:graphic>
+          </wp:inline>
+        </w:drawing>
+      </w:r>
+    </w:p>
+    <w:p>
+      <w:pPr>
+        <w:pStyle w:val="ListParagraph"/>
+        <w:numPr>
+          <w:ilvl w:val="0"/>
+          <w:numId w:val="15"/>
+        </w:numPr>
+      </w:pPr>
+      <w:r>
+        <w:t>I realised that it</w:t>
+      </w:r>
+      <w:r>
+        <w:t xml:space="preserve"> prints the updated value very frequently, while I only need it to </w:t>
+      </w:r>
+      <w:r>
+        <w:t xml:space="preserve">update when the user releases the slider. I </w:t>
+      </w:r>
+      <w:proofErr w:type="gramStart"/>
+      <w:r>
+        <w:t>have to</w:t>
+      </w:r>
+      <w:proofErr w:type="gramEnd"/>
+      <w:r>
+        <w:t xml:space="preserve"> change it or else it might introduce unnecessary lag while changing the settings because of all the updates that are being done to the settings.</w:t>
+      </w:r>
+    </w:p>
+    <w:p>
+      <w:pPr>
+        <w:pStyle w:val="ListParagraph"/>
+      </w:pPr>
+    </w:p>
     <w:sectPr>
       <w:pgSz w:w="11906" w:h="16838"/>
       <w:pgMar w:top="1440" w:right="1440" w:bottom="1440" w:left="1440" w:header="708" w:footer="708" w:gutter="0"/>
@@ -3038,7 +5272,7 @@
 </file>
 
 <file path=word/endnotes.xml><?xml version="1.0" encoding="utf-8"?>
-<w:endnotes xmlns:wpc="http://schemas.microsoft.com/office/word/2010/wordprocessingCanvas" xmlns:cx="http://schemas.microsoft.com/office/drawing/2014/chartex" xmlns:cx1="http://schemas.microsoft.com/office/drawing/2015/9/8/chartex" xmlns:cx2="http://schemas.microsoft.com/office/drawing/2015/10/21/chartex" xmlns:cx3="http://schemas.microsoft.com/office/drawing/2016/5/9/chartex" xmlns:cx4="http://schemas.microsoft.com/office/drawing/2016/5/10/chartex" xmlns:cx5="http://schemas.microsoft.com/office/drawing/2016/5/11/chartex" xmlns:cx6="http://schemas.microsoft.com/office/drawing/2016/5/12/chartex" xmlns:cx7="http://schemas.microsoft.com/office/drawing/2016/5/13/chartex" xmlns:cx8="http://schemas.microsoft.com/office/drawing/2016/5/14/chartex" xmlns:mc="http://schemas.openxmlformats.org/markup-compatibility/2006" xmlns:aink="http://schemas.microsoft.com/office/drawing/2016/ink" xmlns:am3d="http://schemas.microsoft.com/office/drawing/2017/model3d" xmlns:o="urn:schemas-microsoft-com:office:office" xmlns:oel="http://schemas.microsoft.com/office/2019/extlst" xmlns:r="http://schemas.openxmlformats.org/officeDocument/2006/relationships" xmlns:m="http://schemas.openxmlformats.org/officeDocument/2006/math" xmlns:v="urn:schemas-microsoft-com:vml" xmlns:wp14="http://schemas.microsoft.com/office/word/2010/wordprocessingDrawing" xmlns:wp="http://schemas.openxmlformats.org/drawingml/2006/wordprocessingDrawing" xmlns:w10="urn:schemas-microsoft-com:office:word" xmlns:w="http://schemas.openxmlformats.org/wordprocessingml/2006/main" xmlns:w14="http://schemas.microsoft.com/office/word/2010/wordml" xmlns:w15="http://schemas.microsoft.com/office/word/2012/wordml" xmlns:w16cex="http://schemas.microsoft.com/office/word/2018/wordml/cex" xmlns:w16cid="http://schemas.microsoft.com/office/word/2016/wordml/cid" xmlns:w16="http://schemas.microsoft.com/office/word/2018/wordml" xmlns:w16du="http://schemas.microsoft.com/office/word/2023/wordml/word16du" xmlns:w16sdtdh="http://schemas.microsoft.com/office/word/2020/wordml/sdtdatahash" xmlns:w16sdtfl="http://schemas.microsoft.com/office/word/2024/wordml/sdtformatlock" xmlns:w16se="http://schemas.microsoft.com/office/word/2015/wordml/symex" xmlns:wpg="http://schemas.microsoft.com/office/word/2010/wordprocessingGroup" xmlns:wpi="http://schemas.microsoft.com/office/word/2010/wordprocessingInk" xmlns:wne="http://schemas.microsoft.com/office/word/2006/wordml" xmlns:wps="http://schemas.microsoft.com/office/word/2010/wordprocessingShape" mc:Ignorable="w14 w15 w16se w16cid w16 w16cex w16sdtdh w16sdtfl w16du wp14">
+<w:endnotes xmlns:wpc="http://schemas.microsoft.com/office/word/2010/wordprocessingCanvas" xmlns:cx="http://schemas.microsoft.com/office/drawing/2014/chartex" xmlns:cx1="http://schemas.microsoft.com/office/drawing/2015/9/8/chartex" xmlns:cx2="http://schemas.microsoft.com/office/drawing/2015/10/21/chartex" xmlns:cx3="http://schemas.microsoft.com/office/drawing/2016/5/9/chartex" xmlns:cx4="http://schemas.microsoft.com/office/drawing/2016/5/10/chartex" xmlns:cx5="http://schemas.microsoft.com/office/drawing/2016/5/11/chartex" xmlns:cx6="http://schemas.microsoft.com/office/drawing/2016/5/12/chartex" xmlns:cx7="http://schemas.microsoft.com/office/drawing/2016/5/13/chartex" xmlns:cx8="http://schemas.microsoft.com/office/drawing/2016/5/14/chartex" xmlns:mc="http://schemas.openxmlformats.org/markup-compatibility/2006" xmlns:aink="http://schemas.microsoft.com/office/drawing/2016/ink" xmlns:am3d="http://schemas.microsoft.com/office/drawing/2017/model3d" xmlns:o="urn:schemas-microsoft-com:office:office" xmlns:oel="http://schemas.microsoft.com/office/2019/extlst" xmlns:r="http://schemas.openxmlformats.org/officeDocument/2006/relationships" xmlns:m="http://schemas.openxmlformats.org/officeDocument/2006/math" xmlns:v="urn:schemas-microsoft-com:vml" xmlns:wp14="http://schemas.microsoft.com/office/word/2010/wordprocessingDrawing" xmlns:wp="http://schemas.openxmlformats.org/drawingml/2006/wordprocessingDrawing" xmlns:w10="urn:schemas-microsoft-com:office:word" xmlns:w="http://schemas.openxmlformats.org/wordprocessingml/2006/main" xmlns:w14="http://schemas.microsoft.com/office/word/2010/wordml" xmlns:w15="http://schemas.microsoft.com/office/word/2012/wordml" xmlns:w16cei="http://schemas.microsoft.com/office/word/2026/wordml/cei" xmlns:w16cex="http://schemas.microsoft.com/office/word/2018/wordml/cex" xmlns:w16cid="http://schemas.microsoft.com/office/word/2016/wordml/cid" xmlns:w16="http://schemas.microsoft.com/office/word/2018/wordml" xmlns:w16du="http://schemas.microsoft.com/office/word/2023/wordml/word16du" xmlns:w16sdtdh="http://schemas.microsoft.com/office/word/2020/wordml/sdtdatahash" xmlns:w16sdtfl="http://schemas.microsoft.com/office/word/2024/wordml/sdtformatlock" xmlns:w16se="http://schemas.microsoft.com/office/word/2015/wordml/symex" xmlns:wpg="http://schemas.microsoft.com/office/word/2010/wordprocessingGroup" xmlns:wpi="http://schemas.microsoft.com/office/word/2010/wordprocessingInk" xmlns:wne="http://schemas.microsoft.com/office/word/2006/wordml" xmlns:wps="http://schemas.microsoft.com/office/word/2010/wordprocessingShape" mc:Ignorable="w14 w15 w16se w16cid w16 w16cex w16sdtdh w16sdtfl w16du wp14">
   <w:endnote w:type="separator" w:id="-1">
     <w:p>
       <w:pPr>
@@ -3063,7 +5297,7 @@
 </file>
 
 <file path=word/footnotes.xml><?xml version="1.0" encoding="utf-8"?>
-<w:footnotes xmlns:wpc="http://schemas.microsoft.com/office/word/2010/wordprocessingCanvas" xmlns:cx="http://schemas.microsoft.com/office/drawing/2014/chartex" xmlns:cx1="http://schemas.microsoft.com/office/drawing/2015/9/8/chartex" xmlns:cx2="http://schemas.microsoft.com/office/drawing/2015/10/21/chartex" xmlns:cx3="http://schemas.microsoft.com/office/drawing/2016/5/9/chartex" xmlns:cx4="http://schemas.microsoft.com/office/drawing/2016/5/10/chartex" xmlns:cx5="http://schemas.microsoft.com/office/drawing/2016/5/11/chartex" xmlns:cx6="http://schemas.microsoft.com/office/drawing/2016/5/12/chartex" xmlns:cx7="http://schemas.microsoft.com/office/drawing/2016/5/13/chartex" xmlns:cx8="http://schemas.microsoft.com/office/drawing/2016/5/14/chartex" xmlns:mc="http://schemas.openxmlformats.org/markup-compatibility/2006" xmlns:aink="http://schemas.microsoft.com/office/drawing/2016/ink" xmlns:am3d="http://schemas.microsoft.com/office/drawing/2017/model3d" xmlns:o="urn:schemas-microsoft-com:office:office" xmlns:oel="http://schemas.microsoft.com/office/2019/extlst" xmlns:r="http://schemas.openxmlformats.org/officeDocument/2006/relationships" xmlns:m="http://schemas.openxmlformats.org/officeDocument/2006/math" xmlns:v="urn:schemas-microsoft-com:vml" xmlns:wp14="http://schemas.microsoft.com/office/word/2010/wordprocessingDrawing" xmlns:wp="http://schemas.openxmlformats.org/drawingml/2006/wordprocessingDrawing" xmlns:w10="urn:schemas-microsoft-com:office:word" xmlns:w="http://schemas.openxmlformats.org/wordprocessingml/2006/main" xmlns:w14="http://schemas.microsoft.com/office/word/2010/wordml" xmlns:w15="http://schemas.microsoft.com/office/word/2012/wordml" xmlns:w16cex="http://schemas.microsoft.com/office/word/2018/wordml/cex" xmlns:w16cid="http://schemas.microsoft.com/office/word/2016/wordml/cid" xmlns:w16="http://schemas.microsoft.com/office/word/2018/wordml" xmlns:w16du="http://schemas.microsoft.com/office/word/2023/wordml/word16du" xmlns:w16sdtdh="http://schemas.microsoft.com/office/word/2020/wordml/sdtdatahash" xmlns:w16sdtfl="http://schemas.microsoft.com/office/word/2024/wordml/sdtformatlock" xmlns:w16se="http://schemas.microsoft.com/office/word/2015/wordml/symex" xmlns:wpg="http://schemas.microsoft.com/office/word/2010/wordprocessingGroup" xmlns:wpi="http://schemas.microsoft.com/office/word/2010/wordprocessingInk" xmlns:wne="http://schemas.microsoft.com/office/word/2006/wordml" xmlns:wps="http://schemas.microsoft.com/office/word/2010/wordprocessingShape" mc:Ignorable="w14 w15 w16se w16cid w16 w16cex w16sdtdh w16sdtfl w16du wp14">
+<w:footnotes xmlns:wpc="http://schemas.microsoft.com/office/word/2010/wordprocessingCanvas" xmlns:cx="http://schemas.microsoft.com/office/drawing/2014/chartex" xmlns:cx1="http://schemas.microsoft.com/office/drawing/2015/9/8/chartex" xmlns:cx2="http://schemas.microsoft.com/office/drawing/2015/10/21/chartex" xmlns:cx3="http://schemas.microsoft.com/office/drawing/2016/5/9/chartex" xmlns:cx4="http://schemas.microsoft.com/office/drawing/2016/5/10/chartex" xmlns:cx5="http://schemas.microsoft.com/office/drawing/2016/5/11/chartex" xmlns:cx6="http://schemas.microsoft.com/office/drawing/2016/5/12/chartex" xmlns:cx7="http://schemas.microsoft.com/office/drawing/2016/5/13/chartex" xmlns:cx8="http://schemas.microsoft.com/office/drawing/2016/5/14/chartex" xmlns:mc="http://schemas.openxmlformats.org/markup-compatibility/2006" xmlns:aink="http://schemas.microsoft.com/office/drawing/2016/ink" xmlns:am3d="http://schemas.microsoft.com/office/drawing/2017/model3d" xmlns:o="urn:schemas-microsoft-com:office:office" xmlns:oel="http://schemas.microsoft.com/office/2019/extlst" xmlns:r="http://schemas.openxmlformats.org/officeDocument/2006/relationships" xmlns:m="http://schemas.openxmlformats.org/officeDocument/2006/math" xmlns:v="urn:schemas-microsoft-com:vml" xmlns:wp14="http://schemas.microsoft.com/office/word/2010/wordprocessingDrawing" xmlns:wp="http://schemas.openxmlformats.org/drawingml/2006/wordprocessingDrawing" xmlns:w10="urn:schemas-microsoft-com:office:word" xmlns:w="http://schemas.openxmlformats.org/wordprocessingml/2006/main" xmlns:w14="http://schemas.microsoft.com/office/word/2010/wordml" xmlns:w15="http://schemas.microsoft.com/office/word/2012/wordml" xmlns:w16cei="http://schemas.microsoft.com/office/word/2026/wordml/cei" xmlns:w16cex="http://schemas.microsoft.com/office/word/2018/wordml/cex" xmlns:w16cid="http://schemas.microsoft.com/office/word/2016/wordml/cid" xmlns:w16="http://schemas.microsoft.com/office/word/2018/wordml" xmlns:w16du="http://schemas.microsoft.com/office/word/2023/wordml/word16du" xmlns:w16sdtdh="http://schemas.microsoft.com/office/word/2020/wordml/sdtdatahash" xmlns:w16sdtfl="http://schemas.microsoft.com/office/word/2024/wordml/sdtformatlock" xmlns:w16se="http://schemas.microsoft.com/office/word/2015/wordml/symex" xmlns:wpg="http://schemas.microsoft.com/office/word/2010/wordprocessingGroup" xmlns:wpi="http://schemas.microsoft.com/office/word/2010/wordprocessingInk" xmlns:wne="http://schemas.microsoft.com/office/word/2006/wordml" xmlns:wps="http://schemas.microsoft.com/office/word/2010/wordprocessingShape" mc:Ignorable="w14 w15 w16se w16cid w16 w16cex w16sdtdh w16sdtfl w16du wp14">
   <w:footnote w:type="separator" w:id="-1">
     <w:p>
       <w:pPr>
@@ -3088,8 +5322,234 @@
 </file>
 
 <file path=word/numbering.xml><?xml version="1.0" encoding="utf-8"?>
-<w:numbering xmlns:wpc="http://schemas.microsoft.com/office/word/2010/wordprocessingCanvas" xmlns:cx="http://schemas.microsoft.com/office/drawing/2014/chartex" xmlns:cx1="http://schemas.microsoft.com/office/drawing/2015/9/8/chartex" xmlns:cx2="http://schemas.microsoft.com/office/drawing/2015/10/21/chartex" xmlns:cx3="http://schemas.microsoft.com/office/drawing/2016/5/9/chartex" xmlns:cx4="http://schemas.microsoft.com/office/drawing/2016/5/10/chartex" xmlns:cx5="http://schemas.microsoft.com/office/drawing/2016/5/11/chartex" xmlns:cx6="http://schemas.microsoft.com/office/drawing/2016/5/12/chartex" xmlns:cx7="http://schemas.microsoft.com/office/drawing/2016/5/13/chartex" xmlns:cx8="http://schemas.microsoft.com/office/drawing/2016/5/14/chartex" xmlns:mc="http://schemas.openxmlformats.org/markup-compatibility/2006" xmlns:aink="http://schemas.microsoft.com/office/drawing/2016/ink" xmlns:am3d="http://schemas.microsoft.com/office/drawing/2017/model3d" xmlns:o="urn:schemas-microsoft-com:office:office" xmlns:oel="http://schemas.microsoft.com/office/2019/extlst" xmlns:r="http://schemas.openxmlformats.org/officeDocument/2006/relationships" xmlns:m="http://schemas.openxmlformats.org/officeDocument/2006/math" xmlns:v="urn:schemas-microsoft-com:vml" xmlns:wp14="http://schemas.microsoft.com/office/word/2010/wordprocessingDrawing" xmlns:wp="http://schemas.openxmlformats.org/drawingml/2006/wordprocessingDrawing" xmlns:w10="urn:schemas-microsoft-com:office:word" xmlns:w="http://schemas.openxmlformats.org/wordprocessingml/2006/main" xmlns:w14="http://schemas.microsoft.com/office/word/2010/wordml" xmlns:w15="http://schemas.microsoft.com/office/word/2012/wordml" xmlns:w16cex="http://schemas.microsoft.com/office/word/2018/wordml/cex" xmlns:w16cid="http://schemas.microsoft.com/office/word/2016/wordml/cid" xmlns:w16="http://schemas.microsoft.com/office/word/2018/wordml" xmlns:w16du="http://schemas.microsoft.com/office/word/2023/wordml/word16du" xmlns:w16sdtdh="http://schemas.microsoft.com/office/word/2020/wordml/sdtdatahash" xmlns:w16sdtfl="http://schemas.microsoft.com/office/word/2024/wordml/sdtformatlock" xmlns:w16se="http://schemas.microsoft.com/office/word/2015/wordml/symex" xmlns:wpg="http://schemas.microsoft.com/office/word/2010/wordprocessingGroup" xmlns:wpi="http://schemas.microsoft.com/office/word/2010/wordprocessingInk" xmlns:wne="http://schemas.microsoft.com/office/word/2006/wordml" xmlns:wps="http://schemas.microsoft.com/office/word/2010/wordprocessingShape" mc:Ignorable="w14 w15 w16se w16cid w16 w16cex w16sdtdh w16sdtfl w16du wp14">
+<w:numbering xmlns:wpc="http://schemas.microsoft.com/office/word/2010/wordprocessingCanvas" xmlns:cx="http://schemas.microsoft.com/office/drawing/2014/chartex" xmlns:cx1="http://schemas.microsoft.com/office/drawing/2015/9/8/chartex" xmlns:cx2="http://schemas.microsoft.com/office/drawing/2015/10/21/chartex" xmlns:cx3="http://schemas.microsoft.com/office/drawing/2016/5/9/chartex" xmlns:cx4="http://schemas.microsoft.com/office/drawing/2016/5/10/chartex" xmlns:cx5="http://schemas.microsoft.com/office/drawing/2016/5/11/chartex" xmlns:cx6="http://schemas.microsoft.com/office/drawing/2016/5/12/chartex" xmlns:cx7="http://schemas.microsoft.com/office/drawing/2016/5/13/chartex" xmlns:cx8="http://schemas.microsoft.com/office/drawing/2016/5/14/chartex" xmlns:mc="http://schemas.openxmlformats.org/markup-compatibility/2006" xmlns:aink="http://schemas.microsoft.com/office/drawing/2016/ink" xmlns:am3d="http://schemas.microsoft.com/office/drawing/2017/model3d" xmlns:o="urn:schemas-microsoft-com:office:office" xmlns:oel="http://schemas.microsoft.com/office/2019/extlst" xmlns:r="http://schemas.openxmlformats.org/officeDocument/2006/relationships" xmlns:m="http://schemas.openxmlformats.org/officeDocument/2006/math" xmlns:v="urn:schemas-microsoft-com:vml" xmlns:wp14="http://schemas.microsoft.com/office/word/2010/wordprocessingDrawing" xmlns:wp="http://schemas.openxmlformats.org/drawingml/2006/wordprocessingDrawing" xmlns:w10="urn:schemas-microsoft-com:office:word" xmlns:w="http://schemas.openxmlformats.org/wordprocessingml/2006/main" xmlns:w14="http://schemas.microsoft.com/office/word/2010/wordml" xmlns:w15="http://schemas.microsoft.com/office/word/2012/wordml" xmlns:w16cei="http://schemas.microsoft.com/office/word/2026/wordml/cei" xmlns:w16cex="http://schemas.microsoft.com/office/word/2018/wordml/cex" xmlns:w16cid="http://schemas.microsoft.com/office/word/2016/wordml/cid" xmlns:w16="http://schemas.microsoft.com/office/word/2018/wordml" xmlns:w16du="http://schemas.microsoft.com/office/word/2023/wordml/word16du" xmlns:w16sdtdh="http://schemas.microsoft.com/office/word/2020/wordml/sdtdatahash" xmlns:w16sdtfl="http://schemas.microsoft.com/office/word/2024/wordml/sdtformatlock" xmlns:w16se="http://schemas.microsoft.com/office/word/2015/wordml/symex" xmlns:wpg="http://schemas.microsoft.com/office/word/2010/wordprocessingGroup" xmlns:wpi="http://schemas.microsoft.com/office/word/2010/wordprocessingInk" xmlns:wne="http://schemas.microsoft.com/office/word/2006/wordml" xmlns:wps="http://schemas.microsoft.com/office/word/2010/wordprocessingShape" mc:Ignorable="w14 w15 w16se w16cid w16 w16cex w16sdtdh w16sdtfl w16du wp14">
   <w:abstractNum w:abstractNumId="0" w15:restartNumberingAfterBreak="0">
+    <w:nsid w:val="05B63B47"/>
+    <w:multiLevelType w:val="hybridMultilevel"/>
+    <w:tmpl w:val="C6949A5C"/>
+    <w:lvl w:ilvl="0" w:tplc="14090001">
+      <w:start w:val="1"/>
+      <w:numFmt w:val="bullet"/>
+      <w:lvlText w:val=""/>
+      <w:lvlJc w:val="left"/>
+      <w:pPr>
+        <w:ind w:left="720" w:hanging="360"/>
+      </w:pPr>
+      <w:rPr>
+        <w:rFonts w:ascii="Symbol" w:hAnsi="Symbol" w:hint="default"/>
+      </w:rPr>
+    </w:lvl>
+    <w:lvl w:ilvl="1" w:tplc="14090003" w:tentative="1">
+      <w:start w:val="1"/>
+      <w:numFmt w:val="bullet"/>
+      <w:lvlText w:val="o"/>
+      <w:lvlJc w:val="left"/>
+      <w:pPr>
+        <w:ind w:left="1440" w:hanging="360"/>
+      </w:pPr>
+      <w:rPr>
+        <w:rFonts w:ascii="Courier New" w:hAnsi="Courier New" w:cs="Courier New" w:hint="default"/>
+      </w:rPr>
+    </w:lvl>
+    <w:lvl w:ilvl="2" w:tplc="14090005" w:tentative="1">
+      <w:start w:val="1"/>
+      <w:numFmt w:val="bullet"/>
+      <w:lvlText w:val=""/>
+      <w:lvlJc w:val="left"/>
+      <w:pPr>
+        <w:ind w:left="2160" w:hanging="360"/>
+      </w:pPr>
+      <w:rPr>
+        <w:rFonts w:ascii="Wingdings" w:hAnsi="Wingdings" w:hint="default"/>
+      </w:rPr>
+    </w:lvl>
+    <w:lvl w:ilvl="3" w:tplc="14090001" w:tentative="1">
+      <w:start w:val="1"/>
+      <w:numFmt w:val="bullet"/>
+      <w:lvlText w:val=""/>
+      <w:lvlJc w:val="left"/>
+      <w:pPr>
+        <w:ind w:left="2880" w:hanging="360"/>
+      </w:pPr>
+      <w:rPr>
+        <w:rFonts w:ascii="Symbol" w:hAnsi="Symbol" w:hint="default"/>
+      </w:rPr>
+    </w:lvl>
+    <w:lvl w:ilvl="4" w:tplc="14090003" w:tentative="1">
+      <w:start w:val="1"/>
+      <w:numFmt w:val="bullet"/>
+      <w:lvlText w:val="o"/>
+      <w:lvlJc w:val="left"/>
+      <w:pPr>
+        <w:ind w:left="3600" w:hanging="360"/>
+      </w:pPr>
+      <w:rPr>
+        <w:rFonts w:ascii="Courier New" w:hAnsi="Courier New" w:cs="Courier New" w:hint="default"/>
+      </w:rPr>
+    </w:lvl>
+    <w:lvl w:ilvl="5" w:tplc="14090005" w:tentative="1">
+      <w:start w:val="1"/>
+      <w:numFmt w:val="bullet"/>
+      <w:lvlText w:val=""/>
+      <w:lvlJc w:val="left"/>
+      <w:pPr>
+        <w:ind w:left="4320" w:hanging="360"/>
+      </w:pPr>
+      <w:rPr>
+        <w:rFonts w:ascii="Wingdings" w:hAnsi="Wingdings" w:hint="default"/>
+      </w:rPr>
+    </w:lvl>
+    <w:lvl w:ilvl="6" w:tplc="14090001" w:tentative="1">
+      <w:start w:val="1"/>
+      <w:numFmt w:val="bullet"/>
+      <w:lvlText w:val=""/>
+      <w:lvlJc w:val="left"/>
+      <w:pPr>
+        <w:ind w:left="5040" w:hanging="360"/>
+      </w:pPr>
+      <w:rPr>
+        <w:rFonts w:ascii="Symbol" w:hAnsi="Symbol" w:hint="default"/>
+      </w:rPr>
+    </w:lvl>
+    <w:lvl w:ilvl="7" w:tplc="14090003" w:tentative="1">
+      <w:start w:val="1"/>
+      <w:numFmt w:val="bullet"/>
+      <w:lvlText w:val="o"/>
+      <w:lvlJc w:val="left"/>
+      <w:pPr>
+        <w:ind w:left="5760" w:hanging="360"/>
+      </w:pPr>
+      <w:rPr>
+        <w:rFonts w:ascii="Courier New" w:hAnsi="Courier New" w:cs="Courier New" w:hint="default"/>
+      </w:rPr>
+    </w:lvl>
+    <w:lvl w:ilvl="8" w:tplc="14090005" w:tentative="1">
+      <w:start w:val="1"/>
+      <w:numFmt w:val="bullet"/>
+      <w:lvlText w:val=""/>
+      <w:lvlJc w:val="left"/>
+      <w:pPr>
+        <w:ind w:left="6480" w:hanging="360"/>
+      </w:pPr>
+      <w:rPr>
+        <w:rFonts w:ascii="Wingdings" w:hAnsi="Wingdings" w:hint="default"/>
+      </w:rPr>
+    </w:lvl>
+  </w:abstractNum>
+  <w:abstractNum w:abstractNumId="1" w15:restartNumberingAfterBreak="0">
+    <w:nsid w:val="1AE632E2"/>
+    <w:multiLevelType w:val="hybridMultilevel"/>
+    <w:tmpl w:val="883C0FFC"/>
+    <w:lvl w:ilvl="0" w:tplc="14090001">
+      <w:start w:val="1"/>
+      <w:numFmt w:val="bullet"/>
+      <w:lvlText w:val=""/>
+      <w:lvlJc w:val="left"/>
+      <w:pPr>
+        <w:ind w:left="720" w:hanging="360"/>
+      </w:pPr>
+      <w:rPr>
+        <w:rFonts w:ascii="Symbol" w:hAnsi="Symbol" w:hint="default"/>
+      </w:rPr>
+    </w:lvl>
+    <w:lvl w:ilvl="1" w:tplc="14090003" w:tentative="1">
+      <w:start w:val="1"/>
+      <w:numFmt w:val="bullet"/>
+      <w:lvlText w:val="o"/>
+      <w:lvlJc w:val="left"/>
+      <w:pPr>
+        <w:ind w:left="1440" w:hanging="360"/>
+      </w:pPr>
+      <w:rPr>
+        <w:rFonts w:ascii="Courier New" w:hAnsi="Courier New" w:cs="Courier New" w:hint="default"/>
+      </w:rPr>
+    </w:lvl>
+    <w:lvl w:ilvl="2" w:tplc="14090005" w:tentative="1">
+      <w:start w:val="1"/>
+      <w:numFmt w:val="bullet"/>
+      <w:lvlText w:val=""/>
+      <w:lvlJc w:val="left"/>
+      <w:pPr>
+        <w:ind w:left="2160" w:hanging="360"/>
+      </w:pPr>
+      <w:rPr>
+        <w:rFonts w:ascii="Wingdings" w:hAnsi="Wingdings" w:hint="default"/>
+      </w:rPr>
+    </w:lvl>
+    <w:lvl w:ilvl="3" w:tplc="14090001" w:tentative="1">
+      <w:start w:val="1"/>
+      <w:numFmt w:val="bullet"/>
+      <w:lvlText w:val=""/>
+      <w:lvlJc w:val="left"/>
+      <w:pPr>
+        <w:ind w:left="2880" w:hanging="360"/>
+      </w:pPr>
+      <w:rPr>
+        <w:rFonts w:ascii="Symbol" w:hAnsi="Symbol" w:hint="default"/>
+      </w:rPr>
+    </w:lvl>
+    <w:lvl w:ilvl="4" w:tplc="14090003" w:tentative="1">
+      <w:start w:val="1"/>
+      <w:numFmt w:val="bullet"/>
+      <w:lvlText w:val="o"/>
+      <w:lvlJc w:val="left"/>
+      <w:pPr>
+        <w:ind w:left="3600" w:hanging="360"/>
+      </w:pPr>
+      <w:rPr>
+        <w:rFonts w:ascii="Courier New" w:hAnsi="Courier New" w:cs="Courier New" w:hint="default"/>
+      </w:rPr>
+    </w:lvl>
+    <w:lvl w:ilvl="5" w:tplc="14090005" w:tentative="1">
+      <w:start w:val="1"/>
+      <w:numFmt w:val="bullet"/>
+      <w:lvlText w:val=""/>
+      <w:lvlJc w:val="left"/>
+      <w:pPr>
+        <w:ind w:left="4320" w:hanging="360"/>
+      </w:pPr>
+      <w:rPr>
+        <w:rFonts w:ascii="Wingdings" w:hAnsi="Wingdings" w:hint="default"/>
+      </w:rPr>
+    </w:lvl>
+    <w:lvl w:ilvl="6" w:tplc="14090001" w:tentative="1">
+      <w:start w:val="1"/>
+      <w:numFmt w:val="bullet"/>
+      <w:lvlText w:val=""/>
+      <w:lvlJc w:val="left"/>
+      <w:pPr>
+        <w:ind w:left="5040" w:hanging="360"/>
+      </w:pPr>
+      <w:rPr>
+        <w:rFonts w:ascii="Symbol" w:hAnsi="Symbol" w:hint="default"/>
+      </w:rPr>
+    </w:lvl>
+    <w:lvl w:ilvl="7" w:tplc="14090003" w:tentative="1">
+      <w:start w:val="1"/>
+      <w:numFmt w:val="bullet"/>
+      <w:lvlText w:val="o"/>
+      <w:lvlJc w:val="left"/>
+      <w:pPr>
+        <w:ind w:left="5760" w:hanging="360"/>
+      </w:pPr>
+      <w:rPr>
+        <w:rFonts w:ascii="Courier New" w:hAnsi="Courier New" w:cs="Courier New" w:hint="default"/>
+      </w:rPr>
+    </w:lvl>
+    <w:lvl w:ilvl="8" w:tplc="14090005" w:tentative="1">
+      <w:start w:val="1"/>
+      <w:numFmt w:val="bullet"/>
+      <w:lvlText w:val=""/>
+      <w:lvlJc w:val="left"/>
+      <w:pPr>
+        <w:ind w:left="6480" w:hanging="360"/>
+      </w:pPr>
+      <w:rPr>
+        <w:rFonts w:ascii="Wingdings" w:hAnsi="Wingdings" w:hint="default"/>
+      </w:rPr>
+    </w:lvl>
+  </w:abstractNum>
+  <w:abstractNum w:abstractNumId="2" w15:restartNumberingAfterBreak="0">
     <w:nsid w:val="1D9354FD"/>
     <w:multiLevelType w:val="hybridMultilevel"/>
     <w:tmpl w:val="576C5036"/>
@@ -3202,7 +5662,7 @@
       </w:rPr>
     </w:lvl>
   </w:abstractNum>
-  <w:abstractNum w:abstractNumId="1" w15:restartNumberingAfterBreak="0">
+  <w:abstractNum w:abstractNumId="3" w15:restartNumberingAfterBreak="0">
     <w:nsid w:val="22C16D65"/>
     <w:multiLevelType w:val="hybridMultilevel"/>
     <w:tmpl w:val="F1CA5DA2"/>
@@ -3315,7 +5775,7 @@
       </w:rPr>
     </w:lvl>
   </w:abstractNum>
-  <w:abstractNum w:abstractNumId="2" w15:restartNumberingAfterBreak="0">
+  <w:abstractNum w:abstractNumId="4" w15:restartNumberingAfterBreak="0">
     <w:nsid w:val="2A0D629B"/>
     <w:multiLevelType w:val="hybridMultilevel"/>
     <w:tmpl w:val="4D7ACBA4"/>
@@ -3428,7 +5888,7 @@
       </w:rPr>
     </w:lvl>
   </w:abstractNum>
-  <w:abstractNum w:abstractNumId="3" w15:restartNumberingAfterBreak="0">
+  <w:abstractNum w:abstractNumId="5" w15:restartNumberingAfterBreak="0">
     <w:nsid w:val="3A6C753C"/>
     <w:multiLevelType w:val="hybridMultilevel"/>
     <w:tmpl w:val="B29EF32E"/>
@@ -3541,7 +6001,7 @@
       </w:rPr>
     </w:lvl>
   </w:abstractNum>
-  <w:abstractNum w:abstractNumId="4" w15:restartNumberingAfterBreak="0">
+  <w:abstractNum w:abstractNumId="6" w15:restartNumberingAfterBreak="0">
     <w:nsid w:val="3BA8532B"/>
     <w:multiLevelType w:val="hybridMultilevel"/>
     <w:tmpl w:val="009842B0"/>
@@ -3654,7 +6114,7 @@
       </w:rPr>
     </w:lvl>
   </w:abstractNum>
-  <w:abstractNum w:abstractNumId="5" w15:restartNumberingAfterBreak="0">
+  <w:abstractNum w:abstractNumId="7" w15:restartNumberingAfterBreak="0">
     <w:nsid w:val="42B60321"/>
     <w:multiLevelType w:val="hybridMultilevel"/>
     <w:tmpl w:val="5C6622AC"/>
@@ -3767,7 +6227,7 @@
       </w:rPr>
     </w:lvl>
   </w:abstractNum>
-  <w:abstractNum w:abstractNumId="6" w15:restartNumberingAfterBreak="0">
+  <w:abstractNum w:abstractNumId="8" w15:restartNumberingAfterBreak="0">
     <w:nsid w:val="477D4142"/>
     <w:multiLevelType w:val="hybridMultilevel"/>
     <w:tmpl w:val="59D269A4"/>
@@ -3880,7 +6340,120 @@
       </w:rPr>
     </w:lvl>
   </w:abstractNum>
-  <w:abstractNum w:abstractNumId="7" w15:restartNumberingAfterBreak="0">
+  <w:abstractNum w:abstractNumId="9" w15:restartNumberingAfterBreak="0">
+    <w:nsid w:val="4EDB7FE4"/>
+    <w:multiLevelType w:val="hybridMultilevel"/>
+    <w:tmpl w:val="633C8518"/>
+    <w:lvl w:ilvl="0" w:tplc="14090001">
+      <w:start w:val="1"/>
+      <w:numFmt w:val="bullet"/>
+      <w:lvlText w:val=""/>
+      <w:lvlJc w:val="left"/>
+      <w:pPr>
+        <w:ind w:left="720" w:hanging="360"/>
+      </w:pPr>
+      <w:rPr>
+        <w:rFonts w:ascii="Symbol" w:hAnsi="Symbol" w:hint="default"/>
+      </w:rPr>
+    </w:lvl>
+    <w:lvl w:ilvl="1" w:tplc="14090003" w:tentative="1">
+      <w:start w:val="1"/>
+      <w:numFmt w:val="bullet"/>
+      <w:lvlText w:val="o"/>
+      <w:lvlJc w:val="left"/>
+      <w:pPr>
+        <w:ind w:left="1440" w:hanging="360"/>
+      </w:pPr>
+      <w:rPr>
+        <w:rFonts w:ascii="Courier New" w:hAnsi="Courier New" w:cs="Courier New" w:hint="default"/>
+      </w:rPr>
+    </w:lvl>
+    <w:lvl w:ilvl="2" w:tplc="14090005" w:tentative="1">
+      <w:start w:val="1"/>
+      <w:numFmt w:val="bullet"/>
+      <w:lvlText w:val=""/>
+      <w:lvlJc w:val="left"/>
+      <w:pPr>
+        <w:ind w:left="2160" w:hanging="360"/>
+      </w:pPr>
+      <w:rPr>
+        <w:rFonts w:ascii="Wingdings" w:hAnsi="Wingdings" w:hint="default"/>
+      </w:rPr>
+    </w:lvl>
+    <w:lvl w:ilvl="3" w:tplc="14090001" w:tentative="1">
+      <w:start w:val="1"/>
+      <w:numFmt w:val="bullet"/>
+      <w:lvlText w:val=""/>
+      <w:lvlJc w:val="left"/>
+      <w:pPr>
+        <w:ind w:left="2880" w:hanging="360"/>
+      </w:pPr>
+      <w:rPr>
+        <w:rFonts w:ascii="Symbol" w:hAnsi="Symbol" w:hint="default"/>
+      </w:rPr>
+    </w:lvl>
+    <w:lvl w:ilvl="4" w:tplc="14090003" w:tentative="1">
+      <w:start w:val="1"/>
+      <w:numFmt w:val="bullet"/>
+      <w:lvlText w:val="o"/>
+      <w:lvlJc w:val="left"/>
+      <w:pPr>
+        <w:ind w:left="3600" w:hanging="360"/>
+      </w:pPr>
+      <w:rPr>
+        <w:rFonts w:ascii="Courier New" w:hAnsi="Courier New" w:cs="Courier New" w:hint="default"/>
+      </w:rPr>
+    </w:lvl>
+    <w:lvl w:ilvl="5" w:tplc="14090005" w:tentative="1">
+      <w:start w:val="1"/>
+      <w:numFmt w:val="bullet"/>
+      <w:lvlText w:val=""/>
+      <w:lvlJc w:val="left"/>
+      <w:pPr>
+        <w:ind w:left="4320" w:hanging="360"/>
+      </w:pPr>
+      <w:rPr>
+        <w:rFonts w:ascii="Wingdings" w:hAnsi="Wingdings" w:hint="default"/>
+      </w:rPr>
+    </w:lvl>
+    <w:lvl w:ilvl="6" w:tplc="14090001" w:tentative="1">
+      <w:start w:val="1"/>
+      <w:numFmt w:val="bullet"/>
+      <w:lvlText w:val=""/>
+      <w:lvlJc w:val="left"/>
+      <w:pPr>
+        <w:ind w:left="5040" w:hanging="360"/>
+      </w:pPr>
+      <w:rPr>
+        <w:rFonts w:ascii="Symbol" w:hAnsi="Symbol" w:hint="default"/>
+      </w:rPr>
+    </w:lvl>
+    <w:lvl w:ilvl="7" w:tplc="14090003" w:tentative="1">
+      <w:start w:val="1"/>
+      <w:numFmt w:val="bullet"/>
+      <w:lvlText w:val="o"/>
+      <w:lvlJc w:val="left"/>
+      <w:pPr>
+        <w:ind w:left="5760" w:hanging="360"/>
+      </w:pPr>
+      <w:rPr>
+        <w:rFonts w:ascii="Courier New" w:hAnsi="Courier New" w:cs="Courier New" w:hint="default"/>
+      </w:rPr>
+    </w:lvl>
+    <w:lvl w:ilvl="8" w:tplc="14090005" w:tentative="1">
+      <w:start w:val="1"/>
+      <w:numFmt w:val="bullet"/>
+      <w:lvlText w:val=""/>
+      <w:lvlJc w:val="left"/>
+      <w:pPr>
+        <w:ind w:left="6480" w:hanging="360"/>
+      </w:pPr>
+      <w:rPr>
+        <w:rFonts w:ascii="Wingdings" w:hAnsi="Wingdings" w:hint="default"/>
+      </w:rPr>
+    </w:lvl>
+  </w:abstractNum>
+  <w:abstractNum w:abstractNumId="10" w15:restartNumberingAfterBreak="0">
     <w:nsid w:val="5C1F569D"/>
     <w:multiLevelType w:val="hybridMultilevel"/>
     <w:tmpl w:val="15C2F550"/>
@@ -3993,10 +6566,10 @@
       </w:rPr>
     </w:lvl>
   </w:abstractNum>
-  <w:abstractNum w:abstractNumId="8" w15:restartNumberingAfterBreak="0">
+  <w:abstractNum w:abstractNumId="11" w15:restartNumberingAfterBreak="0">
     <w:nsid w:val="61AD7F38"/>
     <w:multiLevelType w:val="hybridMultilevel"/>
-    <w:tmpl w:val="0D20044C"/>
+    <w:tmpl w:val="2F309E4A"/>
     <w:lvl w:ilvl="0" w:tplc="14090001">
       <w:start w:val="1"/>
       <w:numFmt w:val="bullet"/>
@@ -4106,7 +6679,120 @@
       </w:rPr>
     </w:lvl>
   </w:abstractNum>
-  <w:abstractNum w:abstractNumId="9" w15:restartNumberingAfterBreak="0">
+  <w:abstractNum w:abstractNumId="12" w15:restartNumberingAfterBreak="0">
+    <w:nsid w:val="76741100"/>
+    <w:multiLevelType w:val="hybridMultilevel"/>
+    <w:tmpl w:val="BFE68012"/>
+    <w:lvl w:ilvl="0" w:tplc="14090001">
+      <w:start w:val="1"/>
+      <w:numFmt w:val="bullet"/>
+      <w:lvlText w:val=""/>
+      <w:lvlJc w:val="left"/>
+      <w:pPr>
+        <w:ind w:left="1440" w:hanging="360"/>
+      </w:pPr>
+      <w:rPr>
+        <w:rFonts w:ascii="Symbol" w:hAnsi="Symbol" w:hint="default"/>
+      </w:rPr>
+    </w:lvl>
+    <w:lvl w:ilvl="1" w:tplc="14090003" w:tentative="1">
+      <w:start w:val="1"/>
+      <w:numFmt w:val="bullet"/>
+      <w:lvlText w:val="o"/>
+      <w:lvlJc w:val="left"/>
+      <w:pPr>
+        <w:ind w:left="2160" w:hanging="360"/>
+      </w:pPr>
+      <w:rPr>
+        <w:rFonts w:ascii="Courier New" w:hAnsi="Courier New" w:cs="Courier New" w:hint="default"/>
+      </w:rPr>
+    </w:lvl>
+    <w:lvl w:ilvl="2" w:tplc="14090005" w:tentative="1">
+      <w:start w:val="1"/>
+      <w:numFmt w:val="bullet"/>
+      <w:lvlText w:val=""/>
+      <w:lvlJc w:val="left"/>
+      <w:pPr>
+        <w:ind w:left="2880" w:hanging="360"/>
+      </w:pPr>
+      <w:rPr>
+        <w:rFonts w:ascii="Wingdings" w:hAnsi="Wingdings" w:hint="default"/>
+      </w:rPr>
+    </w:lvl>
+    <w:lvl w:ilvl="3" w:tplc="14090001" w:tentative="1">
+      <w:start w:val="1"/>
+      <w:numFmt w:val="bullet"/>
+      <w:lvlText w:val=""/>
+      <w:lvlJc w:val="left"/>
+      <w:pPr>
+        <w:ind w:left="3600" w:hanging="360"/>
+      </w:pPr>
+      <w:rPr>
+        <w:rFonts w:ascii="Symbol" w:hAnsi="Symbol" w:hint="default"/>
+      </w:rPr>
+    </w:lvl>
+    <w:lvl w:ilvl="4" w:tplc="14090003" w:tentative="1">
+      <w:start w:val="1"/>
+      <w:numFmt w:val="bullet"/>
+      <w:lvlText w:val="o"/>
+      <w:lvlJc w:val="left"/>
+      <w:pPr>
+        <w:ind w:left="4320" w:hanging="360"/>
+      </w:pPr>
+      <w:rPr>
+        <w:rFonts w:ascii="Courier New" w:hAnsi="Courier New" w:cs="Courier New" w:hint="default"/>
+      </w:rPr>
+    </w:lvl>
+    <w:lvl w:ilvl="5" w:tplc="14090005" w:tentative="1">
+      <w:start w:val="1"/>
+      <w:numFmt w:val="bullet"/>
+      <w:lvlText w:val=""/>
+      <w:lvlJc w:val="left"/>
+      <w:pPr>
+        <w:ind w:left="5040" w:hanging="360"/>
+      </w:pPr>
+      <w:rPr>
+        <w:rFonts w:ascii="Wingdings" w:hAnsi="Wingdings" w:hint="default"/>
+      </w:rPr>
+    </w:lvl>
+    <w:lvl w:ilvl="6" w:tplc="14090001" w:tentative="1">
+      <w:start w:val="1"/>
+      <w:numFmt w:val="bullet"/>
+      <w:lvlText w:val=""/>
+      <w:lvlJc w:val="left"/>
+      <w:pPr>
+        <w:ind w:left="5760" w:hanging="360"/>
+      </w:pPr>
+      <w:rPr>
+        <w:rFonts w:ascii="Symbol" w:hAnsi="Symbol" w:hint="default"/>
+      </w:rPr>
+    </w:lvl>
+    <w:lvl w:ilvl="7" w:tplc="14090003" w:tentative="1">
+      <w:start w:val="1"/>
+      <w:numFmt w:val="bullet"/>
+      <w:lvlText w:val="o"/>
+      <w:lvlJc w:val="left"/>
+      <w:pPr>
+        <w:ind w:left="6480" w:hanging="360"/>
+      </w:pPr>
+      <w:rPr>
+        <w:rFonts w:ascii="Courier New" w:hAnsi="Courier New" w:cs="Courier New" w:hint="default"/>
+      </w:rPr>
+    </w:lvl>
+    <w:lvl w:ilvl="8" w:tplc="14090005" w:tentative="1">
+      <w:start w:val="1"/>
+      <w:numFmt w:val="bullet"/>
+      <w:lvlText w:val=""/>
+      <w:lvlJc w:val="left"/>
+      <w:pPr>
+        <w:ind w:left="7200" w:hanging="360"/>
+      </w:pPr>
+      <w:rPr>
+        <w:rFonts w:ascii="Wingdings" w:hAnsi="Wingdings" w:hint="default"/>
+      </w:rPr>
+    </w:lvl>
+  </w:abstractNum>
+  <w:abstractNum w:abstractNumId="13" w15:restartNumberingAfterBreak="0">
     <w:nsid w:val="79E76769"/>
     <w:multiLevelType w:val="hybridMultilevel"/>
     <w:tmpl w:val="0114CF82"/>
@@ -4219,35 +6905,163 @@
       </w:rPr>
     </w:lvl>
   </w:abstractNum>
+  <w:abstractNum w:abstractNumId="14" w15:restartNumberingAfterBreak="0">
+    <w:nsid w:val="7F1B0B22"/>
+    <w:multiLevelType w:val="hybridMultilevel"/>
+    <w:tmpl w:val="6E4CB76E"/>
+    <w:lvl w:ilvl="0" w:tplc="14090001">
+      <w:start w:val="1"/>
+      <w:numFmt w:val="bullet"/>
+      <w:lvlText w:val=""/>
+      <w:lvlJc w:val="left"/>
+      <w:pPr>
+        <w:ind w:left="720" w:hanging="360"/>
+      </w:pPr>
+      <w:rPr>
+        <w:rFonts w:ascii="Symbol" w:hAnsi="Symbol" w:hint="default"/>
+      </w:rPr>
+    </w:lvl>
+    <w:lvl w:ilvl="1" w:tplc="14090003" w:tentative="1">
+      <w:start w:val="1"/>
+      <w:numFmt w:val="bullet"/>
+      <w:lvlText w:val="o"/>
+      <w:lvlJc w:val="left"/>
+      <w:pPr>
+        <w:ind w:left="1440" w:hanging="360"/>
+      </w:pPr>
+      <w:rPr>
+        <w:rFonts w:ascii="Courier New" w:hAnsi="Courier New" w:cs="Courier New" w:hint="default"/>
+      </w:rPr>
+    </w:lvl>
+    <w:lvl w:ilvl="2" w:tplc="14090005" w:tentative="1">
+      <w:start w:val="1"/>
+      <w:numFmt w:val="bullet"/>
+      <w:lvlText w:val=""/>
+      <w:lvlJc w:val="left"/>
+      <w:pPr>
+        <w:ind w:left="2160" w:hanging="360"/>
+      </w:pPr>
+      <w:rPr>
+        <w:rFonts w:ascii="Wingdings" w:hAnsi="Wingdings" w:hint="default"/>
+      </w:rPr>
+    </w:lvl>
+    <w:lvl w:ilvl="3" w:tplc="14090001" w:tentative="1">
+      <w:start w:val="1"/>
+      <w:numFmt w:val="bullet"/>
+      <w:lvlText w:val=""/>
+      <w:lvlJc w:val="left"/>
+      <w:pPr>
+        <w:ind w:left="2880" w:hanging="360"/>
+      </w:pPr>
+      <w:rPr>
+        <w:rFonts w:ascii="Symbol" w:hAnsi="Symbol" w:hint="default"/>
+      </w:rPr>
+    </w:lvl>
+    <w:lvl w:ilvl="4" w:tplc="14090003" w:tentative="1">
+      <w:start w:val="1"/>
+      <w:numFmt w:val="bullet"/>
+      <w:lvlText w:val="o"/>
+      <w:lvlJc w:val="left"/>
+      <w:pPr>
+        <w:ind w:left="3600" w:hanging="360"/>
+      </w:pPr>
+      <w:rPr>
+        <w:rFonts w:ascii="Courier New" w:hAnsi="Courier New" w:cs="Courier New" w:hint="default"/>
+      </w:rPr>
+    </w:lvl>
+    <w:lvl w:ilvl="5" w:tplc="14090005" w:tentative="1">
+      <w:start w:val="1"/>
+      <w:numFmt w:val="bullet"/>
+      <w:lvlText w:val=""/>
+      <w:lvlJc w:val="left"/>
+      <w:pPr>
+        <w:ind w:left="4320" w:hanging="360"/>
+      </w:pPr>
+      <w:rPr>
+        <w:rFonts w:ascii="Wingdings" w:hAnsi="Wingdings" w:hint="default"/>
+      </w:rPr>
+    </w:lvl>
+    <w:lvl w:ilvl="6" w:tplc="14090001" w:tentative="1">
+      <w:start w:val="1"/>
+      <w:numFmt w:val="bullet"/>
+      <w:lvlText w:val=""/>
+      <w:lvlJc w:val="left"/>
+      <w:pPr>
+        <w:ind w:left="5040" w:hanging="360"/>
+      </w:pPr>
+      <w:rPr>
+        <w:rFonts w:ascii="Symbol" w:hAnsi="Symbol" w:hint="default"/>
+      </w:rPr>
+    </w:lvl>
+    <w:lvl w:ilvl="7" w:tplc="14090003" w:tentative="1">
+      <w:start w:val="1"/>
+      <w:numFmt w:val="bullet"/>
+      <w:lvlText w:val="o"/>
+      <w:lvlJc w:val="left"/>
+      <w:pPr>
+        <w:ind w:left="5760" w:hanging="360"/>
+      </w:pPr>
+      <w:rPr>
+        <w:rFonts w:ascii="Courier New" w:hAnsi="Courier New" w:cs="Courier New" w:hint="default"/>
+      </w:rPr>
+    </w:lvl>
+    <w:lvl w:ilvl="8" w:tplc="14090005" w:tentative="1">
+      <w:start w:val="1"/>
+      <w:numFmt w:val="bullet"/>
+      <w:lvlText w:val=""/>
+      <w:lvlJc w:val="left"/>
+      <w:pPr>
+        <w:ind w:left="6480" w:hanging="360"/>
+      </w:pPr>
+      <w:rPr>
+        <w:rFonts w:ascii="Wingdings" w:hAnsi="Wingdings" w:hint="default"/>
+      </w:rPr>
+    </w:lvl>
+  </w:abstractNum>
   <w:num w:numId="1" w16cid:durableId="596445402">
+    <w:abstractNumId w:val="8"/>
+  </w:num>
+  <w:num w:numId="2" w16cid:durableId="1457412089">
+    <w:abstractNumId w:val="3"/>
+  </w:num>
+  <w:num w:numId="3" w16cid:durableId="488865060">
+    <w:abstractNumId w:val="2"/>
+  </w:num>
+  <w:num w:numId="4" w16cid:durableId="664623824">
+    <w:abstractNumId w:val="4"/>
+  </w:num>
+  <w:num w:numId="5" w16cid:durableId="939293695">
+    <w:abstractNumId w:val="5"/>
+  </w:num>
+  <w:num w:numId="6" w16cid:durableId="1693459636">
     <w:abstractNumId w:val="6"/>
   </w:num>
-  <w:num w:numId="2" w16cid:durableId="1457412089">
+  <w:num w:numId="7" w16cid:durableId="1237980255">
+    <w:abstractNumId w:val="7"/>
+  </w:num>
+  <w:num w:numId="8" w16cid:durableId="1992253218">
+    <w:abstractNumId w:val="10"/>
+  </w:num>
+  <w:num w:numId="9" w16cid:durableId="595749450">
+    <w:abstractNumId w:val="13"/>
+  </w:num>
+  <w:num w:numId="10" w16cid:durableId="234168157">
+    <w:abstractNumId w:val="11"/>
+  </w:num>
+  <w:num w:numId="11" w16cid:durableId="409234688">
+    <w:abstractNumId w:val="12"/>
+  </w:num>
+  <w:num w:numId="12" w16cid:durableId="1179470404">
+    <w:abstractNumId w:val="9"/>
+  </w:num>
+  <w:num w:numId="13" w16cid:durableId="913852851">
     <w:abstractNumId w:val="1"/>
   </w:num>
-  <w:num w:numId="3" w16cid:durableId="488865060">
+  <w:num w:numId="14" w16cid:durableId="1577083509">
+    <w:abstractNumId w:val="14"/>
+  </w:num>
+  <w:num w:numId="15" w16cid:durableId="977882550">
     <w:abstractNumId w:val="0"/>
-  </w:num>
-  <w:num w:numId="4" w16cid:durableId="664623824">
-    <w:abstractNumId w:val="2"/>
-  </w:num>
-  <w:num w:numId="5" w16cid:durableId="939293695">
-    <w:abstractNumId w:val="3"/>
-  </w:num>
-  <w:num w:numId="6" w16cid:durableId="1693459636">
-    <w:abstractNumId w:val="4"/>
-  </w:num>
-  <w:num w:numId="7" w16cid:durableId="1237980255">
-    <w:abstractNumId w:val="5"/>
-  </w:num>
-  <w:num w:numId="8" w16cid:durableId="1992253218">
-    <w:abstractNumId w:val="7"/>
-  </w:num>
-  <w:num w:numId="9" w16cid:durableId="595749450">
-    <w:abstractNumId w:val="9"/>
-  </w:num>
-  <w:num w:numId="10" w16cid:durableId="234168157">
-    <w:abstractNumId w:val="8"/>
   </w:num>
 </w:numbering>
 </file>

</xml_diff>

<commit_message>
Webapp combined with face tracking and MIDI. Gauge, media queries, UI in general is still a work in progress. Settings page is also non-functional.
</commit_message>
<xml_diff>
--- a/Logs.docx
+++ b/Logs.docx
@@ -302,15 +302,7 @@
         </w:numPr>
       </w:pPr>
       <w:r>
-        <w:t xml:space="preserve">Have it </w:t>
-      </w:r>
-      <w:proofErr w:type="gramStart"/>
-      <w:r>
-        <w:t>be</w:t>
-      </w:r>
-      <w:proofErr w:type="gramEnd"/>
-      <w:r>
-        <w:t xml:space="preserve"> educational</w:t>
+        <w:t>Have it be educational</w:t>
       </w:r>
     </w:p>
     <w:p>
@@ -536,13 +528,8 @@
         </w:numPr>
       </w:pPr>
       <w:r>
-        <w:t xml:space="preserve">Able to send a MIDI </w:t>
-      </w:r>
-      <w:proofErr w:type="gramStart"/>
-      <w:r>
-        <w:t>CC(</w:t>
-      </w:r>
-      <w:proofErr w:type="gramEnd"/>
+        <w:t>Able to send a MIDI CC(</w:t>
+      </w:r>
       <w:r>
         <w:t>control change</w:t>
       </w:r>
@@ -696,15 +683,7 @@
         <w:t>The layout of the</w:t>
       </w:r>
       <w:r>
-        <w:t xml:space="preserve"> web app will change depending on what device is using it. Desktops with a horizontal screen will have </w:t>
-      </w:r>
-      <w:proofErr w:type="gramStart"/>
-      <w:r>
-        <w:t>all of</w:t>
-      </w:r>
-      <w:proofErr w:type="gramEnd"/>
-      <w:r>
-        <w:t xml:space="preserve"> the functions and settings on one page, whereas people using </w:t>
+        <w:t xml:space="preserve"> web app will change depending on what device is using it. Desktops with a horizontal screen will have all of the functions and settings on one page, whereas people using </w:t>
       </w:r>
       <w:r>
         <w:t>phones will be shown a navigation bar on the bottom leading to each page.</w:t>
@@ -724,8 +703,48 @@
         </w:numPr>
       </w:pPr>
       <w:r>
-        <w:t>External</w:t>
-      </w:r>
+        <w:t xml:space="preserve">JSON data files </w:t>
+      </w:r>
+      <w:r>
+        <w:t>–</w:t>
+      </w:r>
+      <w:r>
+        <w:t xml:space="preserve"> </w:t>
+      </w:r>
+      <w:r>
+        <w:t xml:space="preserve">Settings for the webapp will be saved in a JSON file so that they </w:t>
+      </w:r>
+      <w:r>
+        <w:t>stay the same after closing the app. Each time the user changes a setting, it’s new value will be written to the JSON file.</w:t>
+      </w:r>
+    </w:p>
+    <w:p>
+      <w:pPr>
+        <w:pStyle w:val="ListParagraph"/>
+      </w:pPr>
+    </w:p>
+    <w:p>
+      <w:pPr>
+        <w:pStyle w:val="ListParagraph"/>
+        <w:numPr>
+          <w:ilvl w:val="0"/>
+          <w:numId w:val="14"/>
+        </w:numPr>
+      </w:pPr>
+      <w:r>
+        <w:t>CSS Grid – Used to create identically sized buttons in the navigation bar which scale according to the screen width.</w:t>
+      </w:r>
+      <w:r>
+        <w:t xml:space="preserve"> Also used to display everything on one screen, side by side on a desktop screen.</w:t>
+      </w:r>
+    </w:p>
+    <w:p>
+      <w:pPr>
+        <w:rPr>
+          <w:b/>
+          <w:bCs/>
+        </w:rPr>
+      </w:pPr>
     </w:p>
     <w:p>
       <w:pPr>
@@ -829,7 +848,6 @@
         </w:rPr>
         <w:t xml:space="preserve">Setting up </w:t>
       </w:r>
-      <w:proofErr w:type="spellStart"/>
       <w:r>
         <w:rPr>
           <w:b/>
@@ -842,15 +860,7 @@
           <w:b/>
           <w:bCs/>
         </w:rPr>
-        <w:t>ediapipe</w:t>
-      </w:r>
-      <w:proofErr w:type="spellEnd"/>
-      <w:r>
-        <w:rPr>
-          <w:b/>
-          <w:bCs/>
-        </w:rPr>
-        <w:t xml:space="preserve"> for face-tracking</w:t>
+        <w:t>ediapipe for face-tracking</w:t>
       </w:r>
       <w:r>
         <w:rPr>
@@ -869,26 +879,10 @@
         </w:numPr>
       </w:pPr>
       <w:r>
-        <w:t xml:space="preserve">I will be using </w:t>
-      </w:r>
-      <w:proofErr w:type="spellStart"/>
-      <w:r>
-        <w:t>Mediapipe</w:t>
-      </w:r>
-      <w:proofErr w:type="spellEnd"/>
-      <w:r>
-        <w:t xml:space="preserve"> tasks with the face </w:t>
-      </w:r>
-      <w:proofErr w:type="spellStart"/>
-      <w:r>
-        <w:t>landmark</w:t>
-      </w:r>
-      <w:r>
-        <w:t>er</w:t>
-      </w:r>
-      <w:proofErr w:type="spellEnd"/>
-      <w:r>
-        <w:t xml:space="preserve"> model to allow the tracking of the lips.</w:t>
+        <w:t>I will be using Mediapipe tasks with the face landmark</w:t>
+      </w:r>
+      <w:r>
+        <w:t>er model to allow the tracking of the lips.</w:t>
       </w:r>
     </w:p>
     <w:p>
@@ -896,7 +890,6 @@
         <w:rPr>
           <w:noProof/>
         </w:rPr>
-        <w:lastRenderedPageBreak/>
         <w:t xml:space="preserve"> </w:t>
       </w:r>
       <w:r>
@@ -1108,13 +1101,8 @@
         </w:numPr>
       </w:pPr>
       <w:r>
-        <w:t>Mido in combination with python-</w:t>
-      </w:r>
-      <w:proofErr w:type="spellStart"/>
-      <w:r>
-        <w:t>rtmidi</w:t>
-      </w:r>
-      <w:proofErr w:type="spellEnd"/>
+        <w:t>Mido in combination with python-rtmidi</w:t>
+      </w:r>
     </w:p>
     <w:p>
       <w:pPr>
@@ -1125,13 +1113,8 @@
         </w:numPr>
       </w:pPr>
       <w:r>
-        <w:t>Just with python-</w:t>
-      </w:r>
-      <w:proofErr w:type="spellStart"/>
-      <w:r>
-        <w:t>rtmidi</w:t>
-      </w:r>
-      <w:proofErr w:type="spellEnd"/>
+        <w:t>Just with python-rtmidi</w:t>
+      </w:r>
     </w:p>
     <w:p>
       <w:pPr>
@@ -1141,13 +1124,8 @@
           <w:numId w:val="8"/>
         </w:numPr>
       </w:pPr>
-      <w:proofErr w:type="spellStart"/>
-      <w:r>
-        <w:t>Pygame’s</w:t>
-      </w:r>
-      <w:proofErr w:type="spellEnd"/>
-      <w:r>
-        <w:t xml:space="preserve"> </w:t>
+      <w:r>
+        <w:t xml:space="preserve">Pygame’s </w:t>
       </w:r>
       <w:r>
         <w:t>built in</w:t>
@@ -1174,45 +1152,20 @@
         </w:numPr>
       </w:pPr>
       <w:r>
+        <w:lastRenderedPageBreak/>
         <w:t xml:space="preserve">Mido </w:t>
       </w:r>
       <w:r>
-        <w:t>still uses python-</w:t>
-      </w:r>
-      <w:proofErr w:type="spellStart"/>
-      <w:r>
-        <w:t>rtmidi</w:t>
-      </w:r>
-      <w:proofErr w:type="spellEnd"/>
-      <w:r>
-        <w:t>, it just acts as a wrapper to make python-</w:t>
-      </w:r>
-      <w:proofErr w:type="spellStart"/>
-      <w:r>
-        <w:t>rtmidi</w:t>
-      </w:r>
-      <w:proofErr w:type="spellEnd"/>
-      <w:r>
-        <w:t xml:space="preserve"> easier to work with</w:t>
+        <w:t>still uses python-rtmidi</w:t>
+      </w:r>
+      <w:r>
+        <w:t>, it just acts as a wrapper to make python-rtmidi easier to work with</w:t>
       </w:r>
       <w:r>
         <w:t xml:space="preserve">. This and </w:t>
       </w:r>
-      <w:proofErr w:type="spellStart"/>
-      <w:r>
-        <w:t>Pygame</w:t>
-      </w:r>
-      <w:proofErr w:type="spellEnd"/>
-      <w:r>
-        <w:t xml:space="preserve"> MIDI are the simplest to use, but </w:t>
-      </w:r>
-      <w:proofErr w:type="spellStart"/>
-      <w:r>
-        <w:t>Pygame</w:t>
-      </w:r>
-      <w:proofErr w:type="spellEnd"/>
-      <w:r>
-        <w:t xml:space="preserve"> is less suited for my use case because</w:t>
+      <w:r>
+        <w:t>Pygame MIDI are the simplest to use, but Pygame is less suited for my use case because</w:t>
       </w:r>
       <w:r>
         <w:t xml:space="preserve"> it is primarily for game windows. </w:t>
@@ -1221,15 +1174,7 @@
         <w:t>So,</w:t>
       </w:r>
       <w:r>
-        <w:t xml:space="preserve"> I will use Mido and python-</w:t>
-      </w:r>
-      <w:proofErr w:type="spellStart"/>
-      <w:r>
-        <w:t>rtmidi</w:t>
-      </w:r>
-      <w:proofErr w:type="spellEnd"/>
-      <w:r>
-        <w:t xml:space="preserve"> to send MIDI signals to my guitar plugin.</w:t>
+        <w:t xml:space="preserve"> I will use Mido and python-rtmidi to send MIDI signals to my guitar plugin.</w:t>
       </w:r>
     </w:p>
     <w:p>
@@ -1286,13 +1231,8 @@
           <w:numId w:val="8"/>
         </w:numPr>
       </w:pPr>
-      <w:proofErr w:type="gramStart"/>
-      <w:r>
-        <w:t>Reaper(</w:t>
-      </w:r>
-      <w:proofErr w:type="gramEnd"/>
-      <w:r>
-        <w:t xml:space="preserve">the audio software I’m using) cannot </w:t>
+      <w:r>
+        <w:t xml:space="preserve">Reaper(the audio software I’m using) cannot </w:t>
       </w:r>
       <w:r>
         <w:t xml:space="preserve">receive MIDI signals straight from </w:t>
@@ -1301,23 +1241,7 @@
         <w:t>P</w:t>
       </w:r>
       <w:r>
-        <w:t xml:space="preserve">ython, it </w:t>
-      </w:r>
-      <w:proofErr w:type="gramStart"/>
-      <w:r>
-        <w:t>has to</w:t>
-      </w:r>
-      <w:proofErr w:type="gramEnd"/>
-      <w:r>
-        <w:t xml:space="preserve"> pass through a virtual MIDI cable first. For the virtual MIDI cable, I will be using </w:t>
-      </w:r>
-      <w:proofErr w:type="spellStart"/>
-      <w:r>
-        <w:t>loopMIDI</w:t>
-      </w:r>
-      <w:proofErr w:type="spellEnd"/>
-      <w:r>
-        <w:t>.</w:t>
+        <w:t>ython, it has to pass through a virtual MIDI cable first. For the virtual MIDI cable, I will be using loopMIDI.</w:t>
       </w:r>
     </w:p>
     <w:p>
@@ -1455,15 +1379,7 @@
         <w:t xml:space="preserve">Having an issue where it says </w:t>
       </w:r>
       <w:r>
-        <w:t>there is no port named ‘</w:t>
-      </w:r>
-      <w:proofErr w:type="spellStart"/>
-      <w:r>
-        <w:t>pythonmidi</w:t>
-      </w:r>
-      <w:proofErr w:type="spellEnd"/>
-      <w:r>
-        <w:t xml:space="preserve">’ even though it is exactly what I named the </w:t>
+        <w:t xml:space="preserve">there is no port named ‘pythonmidi’ even though it is exactly what I named the </w:t>
       </w:r>
       <w:r>
         <w:t>virtual MIDI cable.</w:t>
@@ -1572,23 +1488,10 @@
         </w:numPr>
       </w:pPr>
       <w:r>
-        <w:t xml:space="preserve">Got Mido to the name of every open MIDI port on my laptop. And it turns out that the port is </w:t>
-      </w:r>
-      <w:proofErr w:type="gramStart"/>
-      <w:r>
-        <w:t>actually named</w:t>
-      </w:r>
-      <w:proofErr w:type="gramEnd"/>
-      <w:r>
-        <w:t xml:space="preserve"> ‘</w:t>
-      </w:r>
-      <w:proofErr w:type="spellStart"/>
-      <w:r>
-        <w:t>pythonmidi</w:t>
-      </w:r>
-      <w:proofErr w:type="spellEnd"/>
-      <w:r>
-        <w:t xml:space="preserve"> 1’</w:t>
+        <w:t>Got Mido to the name of every open MIDI port on my laptop. And it turns out that the port is actually named</w:t>
+      </w:r>
+      <w:r>
+        <w:t xml:space="preserve"> ‘pythonmidi 1’</w:t>
       </w:r>
     </w:p>
     <w:p>
@@ -1771,15 +1674,7 @@
         </w:numPr>
       </w:pPr>
       <w:r>
-        <w:t xml:space="preserve">Picture showing </w:t>
-      </w:r>
-      <w:proofErr w:type="spellStart"/>
-      <w:r>
-        <w:t>loopMIDI</w:t>
-      </w:r>
-      <w:proofErr w:type="spellEnd"/>
-      <w:r>
-        <w:t xml:space="preserve"> detecting the MIDI messages being sent through the virtual MIDI port:</w:t>
+        <w:t>Picture showing loopMIDI detecting the MIDI messages being sent through the virtual MIDI port:</w:t>
       </w:r>
     </w:p>
     <w:p>
@@ -1953,16 +1848,11 @@
       <w:r>
         <w:t xml:space="preserve">having </w:t>
       </w:r>
-      <w:proofErr w:type="gramStart"/>
       <w:r>
         <w:t>Reaper</w:t>
       </w:r>
       <w:r>
-        <w:t>(</w:t>
-      </w:r>
-      <w:proofErr w:type="gramEnd"/>
-      <w:r>
-        <w:t>my guitar software)</w:t>
+        <w:t>(my guitar software)</w:t>
       </w:r>
       <w:r>
         <w:t xml:space="preserve"> </w:t>
@@ -2019,15 +1909,7 @@
         <w:t xml:space="preserve">he guitar plugin should automatically detect the message and map it to </w:t>
       </w:r>
       <w:r>
-        <w:t xml:space="preserve">the pedal I have </w:t>
-      </w:r>
-      <w:proofErr w:type="gramStart"/>
-      <w:r>
-        <w:t>chosen,</w:t>
-      </w:r>
-      <w:proofErr w:type="gramEnd"/>
-      <w:r>
-        <w:t xml:space="preserve"> however</w:t>
+        <w:t>the pedal I have chosen, however</w:t>
       </w:r>
       <w:r>
         <w:t>,</w:t>
@@ -2493,13 +2375,8 @@
         <w:t>Duplicated the Python file</w:t>
       </w:r>
       <w:r>
-        <w:t xml:space="preserve"> with </w:t>
-      </w:r>
-      <w:proofErr w:type="spellStart"/>
-      <w:r>
-        <w:t>mediapipe</w:t>
-      </w:r>
-      <w:proofErr w:type="spellEnd"/>
+        <w:t xml:space="preserve"> with mediapipe</w:t>
+      </w:r>
       <w:r>
         <w:t xml:space="preserve">, I will use </w:t>
       </w:r>
@@ -2691,15 +2568,7 @@
         <w:t>is not affected by the minimum lip distance</w:t>
       </w:r>
       <w:r>
-        <w:t xml:space="preserve">. </w:t>
-      </w:r>
-      <w:proofErr w:type="gramStart"/>
-      <w:r>
-        <w:t>So</w:t>
-      </w:r>
-      <w:proofErr w:type="gramEnd"/>
-      <w:r>
-        <w:t xml:space="preserve"> it’s not very helpful.</w:t>
+        <w:t>. So it’s not very helpful.</w:t>
       </w:r>
     </w:p>
     <w:p>
@@ -3217,28 +3086,10 @@
         </w:numPr>
       </w:pPr>
       <w:r>
-        <w:t xml:space="preserve">Using </w:t>
-      </w:r>
-      <w:proofErr w:type="spellStart"/>
-      <w:proofErr w:type="gramStart"/>
-      <w:r>
-        <w:t>ui.tabs</w:t>
-      </w:r>
-      <w:proofErr w:type="spellEnd"/>
-      <w:proofErr w:type="gramEnd"/>
-      <w:r>
-        <w:t xml:space="preserve"> doesn’t quite give me the </w:t>
-      </w:r>
-      <w:r>
-        <w:t xml:space="preserve">look I </w:t>
-      </w:r>
-      <w:proofErr w:type="gramStart"/>
-      <w:r>
-        <w:t>want,</w:t>
-      </w:r>
-      <w:proofErr w:type="gramEnd"/>
-      <w:r>
-        <w:t xml:space="preserve"> I’m going to switch to using buttons so I can have more control over how they look.</w:t>
+        <w:t xml:space="preserve">Using ui.tabs doesn’t quite give me the </w:t>
+      </w:r>
+      <w:r>
+        <w:t>look I want, I’m going to switch to using buttons so I can have more control over how they look.</w:t>
       </w:r>
     </w:p>
     <w:p>
@@ -3454,23 +3305,7 @@
         </w:numPr>
       </w:pPr>
       <w:r>
-        <w:t xml:space="preserve">Picked a </w:t>
-      </w:r>
-      <w:proofErr w:type="spellStart"/>
-      <w:r>
-        <w:t>color</w:t>
-      </w:r>
-      <w:proofErr w:type="spellEnd"/>
-      <w:r>
-        <w:t xml:space="preserve"> scheme and changed the background </w:t>
-      </w:r>
-      <w:proofErr w:type="spellStart"/>
-      <w:r>
-        <w:t>color</w:t>
-      </w:r>
-      <w:proofErr w:type="spellEnd"/>
-      <w:r>
-        <w:t>:</w:t>
+        <w:t>Picked a color scheme and changed the background color:</w:t>
       </w:r>
     </w:p>
     <w:p>
@@ -3576,15 +3411,7 @@
         </w:rPr>
       </w:pPr>
       <w:r>
-        <w:t xml:space="preserve">Styled the buttons – removed drop shadow, changed the </w:t>
-      </w:r>
-      <w:proofErr w:type="spellStart"/>
-      <w:r>
-        <w:t>color</w:t>
-      </w:r>
-      <w:proofErr w:type="spellEnd"/>
-      <w:r>
-        <w:t xml:space="preserve">, </w:t>
+        <w:t xml:space="preserve">Styled the buttons – removed drop shadow, changed the color, </w:t>
       </w:r>
       <w:r>
         <w:t>rounded only the top right and left button corners.</w:t>
@@ -3728,15 +3555,7 @@
         <w:t xml:space="preserve">icons have not </w:t>
       </w:r>
       <w:r>
-        <w:t xml:space="preserve">been finished </w:t>
-      </w:r>
-      <w:proofErr w:type="gramStart"/>
-      <w:r>
-        <w:t>yet</w:t>
-      </w:r>
-      <w:proofErr w:type="gramEnd"/>
-      <w:r>
-        <w:t xml:space="preserve"> so I have not added them to the nav bar.</w:t>
+        <w:t>been finished yet so I have not added them to the nav bar.</w:t>
       </w:r>
     </w:p>
     <w:p/>
@@ -3781,15 +3600,7 @@
         <w:t xml:space="preserve">I believe it would be best that I </w:t>
       </w:r>
       <w:r>
-        <w:t xml:space="preserve">use one page for all the functions rather than a separate page for each. This means that my app wouldn’t have to load a </w:t>
-      </w:r>
-      <w:proofErr w:type="gramStart"/>
-      <w:r>
-        <w:t>complete</w:t>
-      </w:r>
-      <w:proofErr w:type="gramEnd"/>
-      <w:r>
-        <w:t xml:space="preserve"> new webpage, and it will hopefully run smooth</w:t>
+        <w:t>use one page for all the functions rather than a separate page for each. This means that my app wouldn’t have to load a complete new webpage, and it will hopefully run smooth</w:t>
       </w:r>
       <w:r>
         <w:t>est</w:t>
@@ -4051,13 +3862,8 @@
         <w:t>semi-</w:t>
       </w:r>
       <w:r>
-        <w:t xml:space="preserve">circular bar that updates depending on the percent of the </w:t>
-      </w:r>
-      <w:proofErr w:type="spellStart"/>
-      <w:r>
-        <w:t>wah</w:t>
-      </w:r>
-      <w:proofErr w:type="spellEnd"/>
+        <w:t>circular bar that updates depending on the percent of the wah</w:t>
+      </w:r>
       <w:r>
         <w:t>, however, the built</w:t>
       </w:r>
@@ -4071,30 +3877,13 @@
         <w:t xml:space="preserve"> displays</w:t>
       </w:r>
       <w:r>
-        <w:t xml:space="preserve"> such as </w:t>
-      </w:r>
-      <w:proofErr w:type="spellStart"/>
-      <w:proofErr w:type="gramStart"/>
-      <w:r>
-        <w:t>ui.highchart</w:t>
-      </w:r>
-      <w:proofErr w:type="spellEnd"/>
-      <w:proofErr w:type="gramEnd"/>
+        <w:t xml:space="preserve"> such as ui.highchart</w:t>
+      </w:r>
       <w:r>
         <w:t xml:space="preserve"> </w:t>
       </w:r>
       <w:r>
-        <w:t xml:space="preserve">and </w:t>
-      </w:r>
-      <w:proofErr w:type="spellStart"/>
-      <w:proofErr w:type="gramStart"/>
-      <w:r>
-        <w:t>ui.echart</w:t>
-      </w:r>
-      <w:proofErr w:type="spellEnd"/>
-      <w:proofErr w:type="gramEnd"/>
-      <w:r>
-        <w:t xml:space="preserve"> </w:t>
+        <w:t xml:space="preserve">and ui.echart </w:t>
       </w:r>
       <w:r>
         <w:t xml:space="preserve">don’t </w:t>
@@ -4112,15 +3901,7 @@
         </w:numPr>
       </w:pPr>
       <w:r>
-        <w:t xml:space="preserve">Making it a semi-circle was too difficult for </w:t>
-      </w:r>
-      <w:proofErr w:type="gramStart"/>
-      <w:r>
-        <w:t>me,</w:t>
-      </w:r>
-      <w:proofErr w:type="gramEnd"/>
-      <w:r>
-        <w:t xml:space="preserve"> I’m going to use a full circle for the status bar to make it manageable.</w:t>
+        <w:t>Making it a semi-circle was too difficult for me, I’m going to use a full circle for the status bar to make it manageable.</w:t>
       </w:r>
     </w:p>
     <w:p>
@@ -4229,15 +4010,7 @@
       </w:pPr>
       <w:r>
         <w:lastRenderedPageBreak/>
-        <w:t xml:space="preserve">Testing it </w:t>
-      </w:r>
-      <w:proofErr w:type="gramStart"/>
-      <w:r>
-        <w:t>separately, and</w:t>
-      </w:r>
-      <w:proofErr w:type="gramEnd"/>
-      <w:r>
-        <w:t xml:space="preserve"> trying to update the value in real time.</w:t>
+        <w:t>Testing it separately, and trying to update the value in real time.</w:t>
       </w:r>
     </w:p>
     <w:p>
@@ -4343,15 +4116,7 @@
         <w:t xml:space="preserve">The lines that control the value of the gauge are </w:t>
       </w:r>
       <w:r>
-        <w:t>“stroke-</w:t>
-      </w:r>
-      <w:proofErr w:type="spellStart"/>
-      <w:r>
-        <w:t>dashoffset</w:t>
-      </w:r>
-      <w:proofErr w:type="spellEnd"/>
-      <w:r>
-        <w:t xml:space="preserve">”, </w:t>
+        <w:t xml:space="preserve">“stroke-dashoffset”, </w:t>
       </w:r>
       <w:r>
         <w:t>the line that displays the value in the middle of the gauge.</w:t>
@@ -4366,15 +4131,7 @@
         </w:numPr>
       </w:pPr>
       <w:r>
-        <w:t>Stroke-</w:t>
-      </w:r>
-      <w:proofErr w:type="spellStart"/>
-      <w:r>
-        <w:t>dashoffset</w:t>
-      </w:r>
-      <w:proofErr w:type="spellEnd"/>
-      <w:r>
-        <w:t xml:space="preserve"> has a range of </w:t>
+        <w:t xml:space="preserve">Stroke-dashoffset has a range of </w:t>
       </w:r>
       <w:r>
         <w:t>0 to 722, so I will need to make sure a value of 100 corresponds to 722.</w:t>
@@ -4805,15 +4562,7 @@
         </w:numPr>
       </w:pPr>
       <w:r>
-        <w:t xml:space="preserve">Added sliders for the settings using the example shown in the </w:t>
-      </w:r>
-      <w:proofErr w:type="spellStart"/>
-      <w:r>
-        <w:t>NiceGUI</w:t>
-      </w:r>
-      <w:proofErr w:type="spellEnd"/>
-      <w:r>
-        <w:t xml:space="preserve"> documentation</w:t>
+        <w:t>Added sliders for the settings using the example shown in the NiceGUI documentation</w:t>
       </w:r>
     </w:p>
     <w:p>
@@ -5002,31 +4751,7 @@
         </w:numPr>
       </w:pPr>
       <w:r>
-        <w:t xml:space="preserve">I’ve encountered an issue with my variable for min and max </w:t>
-      </w:r>
-      <w:proofErr w:type="spellStart"/>
-      <w:r>
-        <w:t>wah</w:t>
-      </w:r>
-      <w:proofErr w:type="spellEnd"/>
-      <w:r>
-        <w:t xml:space="preserve"> being immutable, this means that I won’t be able to update it real time with my slider, so the </w:t>
-      </w:r>
-      <w:proofErr w:type="spellStart"/>
-      <w:r>
-        <w:t>wah</w:t>
-      </w:r>
-      <w:proofErr w:type="spellEnd"/>
-      <w:r>
-        <w:t xml:space="preserve"> settings wouldn’t </w:t>
-      </w:r>
-      <w:proofErr w:type="gramStart"/>
-      <w:r>
-        <w:t>actually change</w:t>
-      </w:r>
-      <w:proofErr w:type="gramEnd"/>
-      <w:r>
-        <w:t>.</w:t>
+        <w:t>I’ve encountered an issue with my variable for min and max wah being immutable, this means that I won’t be able to update it real time with my slider, so the wah settings wouldn’t actually change.</w:t>
       </w:r>
     </w:p>
     <w:p>
@@ -5193,6 +4918,9 @@
         <w:pStyle w:val="ListParagraph"/>
       </w:pPr>
       <w:r>
+        <w:rPr>
+          <w:noProof/>
+        </w:rPr>
         <w:drawing>
           <wp:inline distT="0" distB="0" distL="0" distR="0" wp14:anchorId="2EE93835" wp14:editId="7FE3B513">
             <wp:extent cx="4839630" cy="551201"/>
@@ -5245,21 +4973,362 @@
         <w:t xml:space="preserve"> prints the updated value very frequently, while I only need it to </w:t>
       </w:r>
       <w:r>
-        <w:t xml:space="preserve">update when the user releases the slider. I </w:t>
-      </w:r>
-      <w:proofErr w:type="gramStart"/>
-      <w:r>
-        <w:t>have to</w:t>
-      </w:r>
-      <w:proofErr w:type="gramEnd"/>
-      <w:r>
-        <w:t xml:space="preserve"> change it or else it might introduce unnecessary lag while changing the settings because of all the updates that are being done to the settings.</w:t>
-      </w:r>
-    </w:p>
-    <w:p>
-      <w:pPr>
-        <w:pStyle w:val="ListParagraph"/>
-      </w:pPr>
+        <w:t>update when the user releases the slider. I have to change it or else it might introduce unnecessary lag while changing the settings because of all the updates that are being done to the settings.</w:t>
+      </w:r>
+    </w:p>
+    <w:p>
+      <w:pPr>
+        <w:pStyle w:val="ListParagraph"/>
+      </w:pPr>
+    </w:p>
+    <w:p>
+      <w:pPr>
+        <w:pStyle w:val="ListParagraph"/>
+      </w:pPr>
+    </w:p>
+    <w:p>
+      <w:pPr>
+        <w:rPr>
+          <w:b/>
+          <w:bCs/>
+        </w:rPr>
+      </w:pPr>
+      <w:r>
+        <w:rPr>
+          <w:b/>
+          <w:bCs/>
+        </w:rPr>
+        <w:t>10/08</w:t>
+      </w:r>
+      <w:r>
+        <w:rPr>
+          <w:b/>
+          <w:bCs/>
+        </w:rPr>
+        <w:t>/2026</w:t>
+      </w:r>
+    </w:p>
+    <w:p>
+      <w:pPr>
+        <w:pStyle w:val="ListParagraph"/>
+        <w:numPr>
+          <w:ilvl w:val="0"/>
+          <w:numId w:val="15"/>
+        </w:numPr>
+      </w:pPr>
+      <w:r>
+        <w:t xml:space="preserve">I’m finding it hard to make the settings without the actual wah program </w:t>
+      </w:r>
+      <w:r>
+        <w:t>code, so I will put the settings menu on hold for now to combine the webapp with the wah.</w:t>
+      </w:r>
+    </w:p>
+    <w:p>
+      <w:pPr>
+        <w:pStyle w:val="ListParagraph"/>
+        <w:numPr>
+          <w:ilvl w:val="0"/>
+          <w:numId w:val="15"/>
+        </w:numPr>
+      </w:pPr>
+      <w:r>
+        <w:t>I’m told by google that I will need to utilise threading since the while look for the face tracking will block the rest of the webapp from running.</w:t>
+      </w:r>
+    </w:p>
+    <w:p>
+      <w:pPr>
+        <w:pStyle w:val="ListParagraph"/>
+        <w:numPr>
+          <w:ilvl w:val="0"/>
+          <w:numId w:val="15"/>
+        </w:numPr>
+      </w:pPr>
+      <w:r>
+        <w:t xml:space="preserve">The face tracking and MIDI code will be put into </w:t>
+      </w:r>
+      <w:r>
+        <w:t>a function which (through the help of threads), will be constantly running in the background.</w:t>
+      </w:r>
+    </w:p>
+    <w:p>
+      <w:pPr>
+        <w:pStyle w:val="ListParagraph"/>
+      </w:pPr>
+    </w:p>
+    <w:p>
+      <w:pPr>
+        <w:pStyle w:val="ListParagraph"/>
+        <w:numPr>
+          <w:ilvl w:val="0"/>
+          <w:numId w:val="15"/>
+        </w:numPr>
+      </w:pPr>
+      <w:r>
+        <w:t>Webapp GUI now works while the face tracking runs. The function contains all of the code for the face tracking and MIDI</w:t>
+      </w:r>
+    </w:p>
+    <w:p>
+      <w:pPr>
+        <w:pStyle w:val="ListParagraph"/>
+      </w:pPr>
+      <w:r>
+        <w:rPr>
+          <w:noProof/>
+        </w:rPr>
+        <w:drawing>
+          <wp:inline distT="0" distB="0" distL="0" distR="0" wp14:anchorId="574DCB8C" wp14:editId="6EBA0985">
+            <wp:extent cx="4768262" cy="1256780"/>
+            <wp:effectExtent l="0" t="0" r="0" b="635"/>
+            <wp:docPr id="586282764" name="Picture 1"/>
+            <wp:cNvGraphicFramePr>
+              <a:graphicFrameLocks xmlns:a="http://schemas.openxmlformats.org/drawingml/2006/main" noChangeAspect="1"/>
+            </wp:cNvGraphicFramePr>
+            <a:graphic xmlns:a="http://schemas.openxmlformats.org/drawingml/2006/main">
+              <a:graphicData uri="http://schemas.openxmlformats.org/drawingml/2006/picture">
+                <pic:pic xmlns:pic="http://schemas.openxmlformats.org/drawingml/2006/picture">
+                  <pic:nvPicPr>
+                    <pic:cNvPr id="586282764" name=""/>
+                    <pic:cNvPicPr/>
+                  </pic:nvPicPr>
+                  <pic:blipFill>
+                    <a:blip r:embed="rId63"/>
+                    <a:stretch>
+                      <a:fillRect/>
+                    </a:stretch>
+                  </pic:blipFill>
+                  <pic:spPr>
+                    <a:xfrm>
+                      <a:off x="0" y="0"/>
+                      <a:ext cx="4780912" cy="1260114"/>
+                    </a:xfrm>
+                    <a:prstGeom prst="rect">
+                      <a:avLst/>
+                    </a:prstGeom>
+                  </pic:spPr>
+                </pic:pic>
+              </a:graphicData>
+            </a:graphic>
+          </wp:inline>
+        </w:drawing>
+      </w:r>
+    </w:p>
+    <w:p/>
+    <w:p>
+      <w:pPr>
+        <w:pStyle w:val="ListParagraph"/>
+        <w:numPr>
+          <w:ilvl w:val="0"/>
+          <w:numId w:val="15"/>
+        </w:numPr>
+      </w:pPr>
+      <w:r>
+        <w:t>Working on connecting the wah percentage to the gauge.</w:t>
+      </w:r>
+    </w:p>
+    <w:p>
+      <w:pPr>
+        <w:pStyle w:val="ListParagraph"/>
+        <w:numPr>
+          <w:ilvl w:val="0"/>
+          <w:numId w:val="15"/>
+        </w:numPr>
+      </w:pPr>
+      <w:r>
+        <w:t xml:space="preserve">Once again, I </w:t>
+      </w:r>
+      <w:r>
+        <w:t>have to use a dictionary to store the value of the gauge so that it is mutable</w:t>
+      </w:r>
+      <w:r>
+        <w:t>.</w:t>
+      </w:r>
+    </w:p>
+    <w:p>
+      <w:pPr>
+        <w:pStyle w:val="ListParagraph"/>
+        <w:numPr>
+          <w:ilvl w:val="0"/>
+          <w:numId w:val="15"/>
+        </w:numPr>
+      </w:pPr>
+      <w:r>
+        <w:t xml:space="preserve">It feels like no matter what I do, my </w:t>
+      </w:r>
+      <w:r>
+        <w:t>timer to update the gauge just can’t reach the updated values, so it always uses the original one I set.</w:t>
+      </w:r>
+    </w:p>
+    <w:p>
+      <w:pPr>
+        <w:pStyle w:val="ListParagraph"/>
+      </w:pPr>
+    </w:p>
+    <w:p/>
+    <w:p>
+      <w:r>
+        <w:br w:type="page"/>
+      </w:r>
+    </w:p>
+    <w:p>
+      <w:pPr>
+        <w:rPr>
+          <w:b/>
+          <w:bCs/>
+        </w:rPr>
+      </w:pPr>
+      <w:r>
+        <w:rPr>
+          <w:b/>
+          <w:bCs/>
+        </w:rPr>
+        <w:lastRenderedPageBreak/>
+        <w:t>Implementing media queries</w:t>
+      </w:r>
+    </w:p>
+    <w:p>
+      <w:pPr>
+        <w:pStyle w:val="ListParagraph"/>
+        <w:numPr>
+          <w:ilvl w:val="0"/>
+          <w:numId w:val="16"/>
+        </w:numPr>
+      </w:pPr>
+      <w:r>
+        <w:t>I want the three pages to be put side by side with each other when it is on a wide, desktop screen.</w:t>
+      </w:r>
+    </w:p>
+    <w:p>
+      <w:pPr>
+        <w:pStyle w:val="ListParagraph"/>
+        <w:numPr>
+          <w:ilvl w:val="0"/>
+          <w:numId w:val="16"/>
+        </w:numPr>
+      </w:pPr>
+      <w:r>
+        <w:t xml:space="preserve">I will be doing this with </w:t>
+      </w:r>
+      <w:r>
+        <w:t>T</w:t>
+      </w:r>
+      <w:r>
+        <w:t xml:space="preserve">ailwind </w:t>
+      </w:r>
+      <w:r>
+        <w:t>CSS media queries</w:t>
+      </w:r>
+    </w:p>
+    <w:p/>
+    <w:p>
+      <w:pPr>
+        <w:pStyle w:val="ListParagraph"/>
+        <w:numPr>
+          <w:ilvl w:val="0"/>
+          <w:numId w:val="16"/>
+        </w:numPr>
+      </w:pPr>
+      <w:r>
+        <w:t xml:space="preserve">Started by hiding the </w:t>
+      </w:r>
+      <w:r>
+        <w:t>navigation bar on desktop screens:</w:t>
+      </w:r>
+      <w:r>
+        <w:t xml:space="preserve"> </w:t>
+      </w:r>
+      <w:r>
+        <w:rPr>
+          <w:noProof/>
+        </w:rPr>
+        <w:drawing>
+          <wp:inline distT="0" distB="0" distL="0" distR="0" wp14:anchorId="26F3A90F" wp14:editId="6CA96E8D">
+            <wp:extent cx="5107259" cy="684665"/>
+            <wp:effectExtent l="0" t="0" r="0" b="1270"/>
+            <wp:docPr id="83580525" name="Picture 1"/>
+            <wp:cNvGraphicFramePr>
+              <a:graphicFrameLocks xmlns:a="http://schemas.openxmlformats.org/drawingml/2006/main" noChangeAspect="1"/>
+            </wp:cNvGraphicFramePr>
+            <a:graphic xmlns:a="http://schemas.openxmlformats.org/drawingml/2006/main">
+              <a:graphicData uri="http://schemas.openxmlformats.org/drawingml/2006/picture">
+                <pic:pic xmlns:pic="http://schemas.openxmlformats.org/drawingml/2006/picture">
+                  <pic:nvPicPr>
+                    <pic:cNvPr id="83580525" name=""/>
+                    <pic:cNvPicPr/>
+                  </pic:nvPicPr>
+                  <pic:blipFill>
+                    <a:blip r:embed="rId64"/>
+                    <a:stretch>
+                      <a:fillRect/>
+                    </a:stretch>
+                  </pic:blipFill>
+                  <pic:spPr>
+                    <a:xfrm>
+                      <a:off x="0" y="0"/>
+                      <a:ext cx="5122935" cy="686766"/>
+                    </a:xfrm>
+                    <a:prstGeom prst="rect">
+                      <a:avLst/>
+                    </a:prstGeom>
+                  </pic:spPr>
+                </pic:pic>
+              </a:graphicData>
+            </a:graphic>
+          </wp:inline>
+        </w:drawing>
+      </w:r>
+    </w:p>
+    <w:p/>
+    <w:p>
+      <w:pPr>
+        <w:pStyle w:val="ListParagraph"/>
+        <w:numPr>
+          <w:ilvl w:val="0"/>
+          <w:numId w:val="16"/>
+        </w:numPr>
+      </w:pPr>
+      <w:r>
+        <w:t>On mobile screens, the main container will have one column. And on desktop screens, the main container will have three columns for the pages.</w:t>
+      </w:r>
+      <w:r>
+        <w:rPr>
+          <w:noProof/>
+        </w:rPr>
+        <w:drawing>
+          <wp:inline distT="0" distB="0" distL="0" distR="0" wp14:anchorId="5325F500" wp14:editId="429B7F82">
+            <wp:extent cx="5267836" cy="422547"/>
+            <wp:effectExtent l="0" t="0" r="0" b="0"/>
+            <wp:docPr id="1178873030" name="Picture 1"/>
+            <wp:cNvGraphicFramePr>
+              <a:graphicFrameLocks xmlns:a="http://schemas.openxmlformats.org/drawingml/2006/main" noChangeAspect="1"/>
+            </wp:cNvGraphicFramePr>
+            <a:graphic xmlns:a="http://schemas.openxmlformats.org/drawingml/2006/main">
+              <a:graphicData uri="http://schemas.openxmlformats.org/drawingml/2006/picture">
+                <pic:pic xmlns:pic="http://schemas.openxmlformats.org/drawingml/2006/picture">
+                  <pic:nvPicPr>
+                    <pic:cNvPr id="1178873030" name=""/>
+                    <pic:cNvPicPr/>
+                  </pic:nvPicPr>
+                  <pic:blipFill>
+                    <a:blip r:embed="rId65"/>
+                    <a:stretch>
+                      <a:fillRect/>
+                    </a:stretch>
+                  </pic:blipFill>
+                  <pic:spPr>
+                    <a:xfrm>
+                      <a:off x="0" y="0"/>
+                      <a:ext cx="5286985" cy="424083"/>
+                    </a:xfrm>
+                    <a:prstGeom prst="rect">
+                      <a:avLst/>
+                    </a:prstGeom>
+                  </pic:spPr>
+                </pic:pic>
+              </a:graphicData>
+            </a:graphic>
+          </wp:inline>
+        </w:drawing>
+      </w:r>
     </w:p>
     <w:sectPr>
       <w:pgSz w:w="11906" w:h="16838"/>
@@ -5326,7 +5395,7 @@
   <w:abstractNum w:abstractNumId="0" w15:restartNumberingAfterBreak="0">
     <w:nsid w:val="05B63B47"/>
     <w:multiLevelType w:val="hybridMultilevel"/>
-    <w:tmpl w:val="C6949A5C"/>
+    <w:tmpl w:val="F4D417AE"/>
     <w:lvl w:ilvl="0" w:tplc="14090001">
       <w:start w:val="1"/>
       <w:numFmt w:val="bullet"/>
@@ -6680,6 +6749,119 @@
     </w:lvl>
   </w:abstractNum>
   <w:abstractNum w:abstractNumId="12" w15:restartNumberingAfterBreak="0">
+    <w:nsid w:val="659B44CD"/>
+    <w:multiLevelType w:val="hybridMultilevel"/>
+    <w:tmpl w:val="91E81C5E"/>
+    <w:lvl w:ilvl="0" w:tplc="14090001">
+      <w:start w:val="1"/>
+      <w:numFmt w:val="bullet"/>
+      <w:lvlText w:val=""/>
+      <w:lvlJc w:val="left"/>
+      <w:pPr>
+        <w:ind w:left="720" w:hanging="360"/>
+      </w:pPr>
+      <w:rPr>
+        <w:rFonts w:ascii="Symbol" w:hAnsi="Symbol" w:hint="default"/>
+      </w:rPr>
+    </w:lvl>
+    <w:lvl w:ilvl="1" w:tplc="14090003" w:tentative="1">
+      <w:start w:val="1"/>
+      <w:numFmt w:val="bullet"/>
+      <w:lvlText w:val="o"/>
+      <w:lvlJc w:val="left"/>
+      <w:pPr>
+        <w:ind w:left="1440" w:hanging="360"/>
+      </w:pPr>
+      <w:rPr>
+        <w:rFonts w:ascii="Courier New" w:hAnsi="Courier New" w:cs="Courier New" w:hint="default"/>
+      </w:rPr>
+    </w:lvl>
+    <w:lvl w:ilvl="2" w:tplc="14090005" w:tentative="1">
+      <w:start w:val="1"/>
+      <w:numFmt w:val="bullet"/>
+      <w:lvlText w:val=""/>
+      <w:lvlJc w:val="left"/>
+      <w:pPr>
+        <w:ind w:left="2160" w:hanging="360"/>
+      </w:pPr>
+      <w:rPr>
+        <w:rFonts w:ascii="Wingdings" w:hAnsi="Wingdings" w:hint="default"/>
+      </w:rPr>
+    </w:lvl>
+    <w:lvl w:ilvl="3" w:tplc="14090001" w:tentative="1">
+      <w:start w:val="1"/>
+      <w:numFmt w:val="bullet"/>
+      <w:lvlText w:val=""/>
+      <w:lvlJc w:val="left"/>
+      <w:pPr>
+        <w:ind w:left="2880" w:hanging="360"/>
+      </w:pPr>
+      <w:rPr>
+        <w:rFonts w:ascii="Symbol" w:hAnsi="Symbol" w:hint="default"/>
+      </w:rPr>
+    </w:lvl>
+    <w:lvl w:ilvl="4" w:tplc="14090003" w:tentative="1">
+      <w:start w:val="1"/>
+      <w:numFmt w:val="bullet"/>
+      <w:lvlText w:val="o"/>
+      <w:lvlJc w:val="left"/>
+      <w:pPr>
+        <w:ind w:left="3600" w:hanging="360"/>
+      </w:pPr>
+      <w:rPr>
+        <w:rFonts w:ascii="Courier New" w:hAnsi="Courier New" w:cs="Courier New" w:hint="default"/>
+      </w:rPr>
+    </w:lvl>
+    <w:lvl w:ilvl="5" w:tplc="14090005" w:tentative="1">
+      <w:start w:val="1"/>
+      <w:numFmt w:val="bullet"/>
+      <w:lvlText w:val=""/>
+      <w:lvlJc w:val="left"/>
+      <w:pPr>
+        <w:ind w:left="4320" w:hanging="360"/>
+      </w:pPr>
+      <w:rPr>
+        <w:rFonts w:ascii="Wingdings" w:hAnsi="Wingdings" w:hint="default"/>
+      </w:rPr>
+    </w:lvl>
+    <w:lvl w:ilvl="6" w:tplc="14090001" w:tentative="1">
+      <w:start w:val="1"/>
+      <w:numFmt w:val="bullet"/>
+      <w:lvlText w:val=""/>
+      <w:lvlJc w:val="left"/>
+      <w:pPr>
+        <w:ind w:left="5040" w:hanging="360"/>
+      </w:pPr>
+      <w:rPr>
+        <w:rFonts w:ascii="Symbol" w:hAnsi="Symbol" w:hint="default"/>
+      </w:rPr>
+    </w:lvl>
+    <w:lvl w:ilvl="7" w:tplc="14090003" w:tentative="1">
+      <w:start w:val="1"/>
+      <w:numFmt w:val="bullet"/>
+      <w:lvlText w:val="o"/>
+      <w:lvlJc w:val="left"/>
+      <w:pPr>
+        <w:ind w:left="5760" w:hanging="360"/>
+      </w:pPr>
+      <w:rPr>
+        <w:rFonts w:ascii="Courier New" w:hAnsi="Courier New" w:cs="Courier New" w:hint="default"/>
+      </w:rPr>
+    </w:lvl>
+    <w:lvl w:ilvl="8" w:tplc="14090005" w:tentative="1">
+      <w:start w:val="1"/>
+      <w:numFmt w:val="bullet"/>
+      <w:lvlText w:val=""/>
+      <w:lvlJc w:val="left"/>
+      <w:pPr>
+        <w:ind w:left="6480" w:hanging="360"/>
+      </w:pPr>
+      <w:rPr>
+        <w:rFonts w:ascii="Wingdings" w:hAnsi="Wingdings" w:hint="default"/>
+      </w:rPr>
+    </w:lvl>
+  </w:abstractNum>
+  <w:abstractNum w:abstractNumId="13" w15:restartNumberingAfterBreak="0">
     <w:nsid w:val="76741100"/>
     <w:multiLevelType w:val="hybridMultilevel"/>
     <w:tmpl w:val="BFE68012"/>
@@ -6792,7 +6974,7 @@
       </w:rPr>
     </w:lvl>
   </w:abstractNum>
-  <w:abstractNum w:abstractNumId="13" w15:restartNumberingAfterBreak="0">
+  <w:abstractNum w:abstractNumId="14" w15:restartNumberingAfterBreak="0">
     <w:nsid w:val="79E76769"/>
     <w:multiLevelType w:val="hybridMultilevel"/>
     <w:tmpl w:val="0114CF82"/>
@@ -6905,7 +7087,7 @@
       </w:rPr>
     </w:lvl>
   </w:abstractNum>
-  <w:abstractNum w:abstractNumId="14" w15:restartNumberingAfterBreak="0">
+  <w:abstractNum w:abstractNumId="15" w15:restartNumberingAfterBreak="0">
     <w:nsid w:val="7F1B0B22"/>
     <w:multiLevelType w:val="hybridMultilevel"/>
     <w:tmpl w:val="6E4CB76E"/>
@@ -7043,13 +7225,13 @@
     <w:abstractNumId w:val="10"/>
   </w:num>
   <w:num w:numId="9" w16cid:durableId="595749450">
-    <w:abstractNumId w:val="13"/>
+    <w:abstractNumId w:val="14"/>
   </w:num>
   <w:num w:numId="10" w16cid:durableId="234168157">
     <w:abstractNumId w:val="11"/>
   </w:num>
   <w:num w:numId="11" w16cid:durableId="409234688">
-    <w:abstractNumId w:val="12"/>
+    <w:abstractNumId w:val="13"/>
   </w:num>
   <w:num w:numId="12" w16cid:durableId="1179470404">
     <w:abstractNumId w:val="9"/>
@@ -7058,10 +7240,13 @@
     <w:abstractNumId w:val="1"/>
   </w:num>
   <w:num w:numId="14" w16cid:durableId="1577083509">
-    <w:abstractNumId w:val="14"/>
+    <w:abstractNumId w:val="15"/>
   </w:num>
   <w:num w:numId="15" w16cid:durableId="977882550">
     <w:abstractNumId w:val="0"/>
+  </w:num>
+  <w:num w:numId="16" w16cid:durableId="1792017753">
+    <w:abstractNumId w:val="12"/>
   </w:num>
 </w:numbering>
 </file>

</xml_diff>

<commit_message>
Media queries completed. Settings menu in progress.
</commit_message>
<xml_diff>
--- a/Logs.docx
+++ b/Logs.docx
@@ -302,7 +302,15 @@
         </w:numPr>
       </w:pPr>
       <w:r>
-        <w:t>Have it be educational</w:t>
+        <w:t xml:space="preserve">Have it </w:t>
+      </w:r>
+      <w:proofErr w:type="gramStart"/>
+      <w:r>
+        <w:t>be</w:t>
+      </w:r>
+      <w:proofErr w:type="gramEnd"/>
+      <w:r>
+        <w:t xml:space="preserve"> educational</w:t>
       </w:r>
     </w:p>
     <w:p>
@@ -528,8 +536,13 @@
         </w:numPr>
       </w:pPr>
       <w:r>
-        <w:t>Able to send a MIDI CC(</w:t>
-      </w:r>
+        <w:t xml:space="preserve">Able to send a MIDI </w:t>
+      </w:r>
+      <w:proofErr w:type="gramStart"/>
+      <w:r>
+        <w:t>CC(</w:t>
+      </w:r>
+      <w:proofErr w:type="gramEnd"/>
       <w:r>
         <w:t>control change</w:t>
       </w:r>
@@ -683,7 +696,15 @@
         <w:t>The layout of the</w:t>
       </w:r>
       <w:r>
-        <w:t xml:space="preserve"> web app will change depending on what device is using it. Desktops with a horizontal screen will have all of the functions and settings on one page, whereas people using </w:t>
+        <w:t xml:space="preserve"> web app will change depending on what device is using it. Desktops with a horizontal screen will have </w:t>
+      </w:r>
+      <w:proofErr w:type="gramStart"/>
+      <w:r>
+        <w:t>all of</w:t>
+      </w:r>
+      <w:proofErr w:type="gramEnd"/>
+      <w:r>
+        <w:t xml:space="preserve"> the functions and settings on one page, whereas people using </w:t>
       </w:r>
       <w:r>
         <w:t>phones will be shown a navigation bar on the bottom leading to each page.</w:t>
@@ -848,6 +869,7 @@
         </w:rPr>
         <w:t xml:space="preserve">Setting up </w:t>
       </w:r>
+      <w:proofErr w:type="spellStart"/>
       <w:r>
         <w:rPr>
           <w:b/>
@@ -860,7 +882,15 @@
           <w:b/>
           <w:bCs/>
         </w:rPr>
-        <w:t>ediapipe for face-tracking</w:t>
+        <w:t>ediapipe</w:t>
+      </w:r>
+      <w:proofErr w:type="spellEnd"/>
+      <w:r>
+        <w:rPr>
+          <w:b/>
+          <w:bCs/>
+        </w:rPr>
+        <w:t xml:space="preserve"> for face-tracking</w:t>
       </w:r>
       <w:r>
         <w:rPr>
@@ -879,10 +909,26 @@
         </w:numPr>
       </w:pPr>
       <w:r>
-        <w:t>I will be using Mediapipe tasks with the face landmark</w:t>
-      </w:r>
-      <w:r>
-        <w:t>er model to allow the tracking of the lips.</w:t>
+        <w:t xml:space="preserve">I will be using </w:t>
+      </w:r>
+      <w:proofErr w:type="spellStart"/>
+      <w:r>
+        <w:t>Mediapipe</w:t>
+      </w:r>
+      <w:proofErr w:type="spellEnd"/>
+      <w:r>
+        <w:t xml:space="preserve"> tasks with the face </w:t>
+      </w:r>
+      <w:proofErr w:type="spellStart"/>
+      <w:r>
+        <w:t>landmark</w:t>
+      </w:r>
+      <w:r>
+        <w:t>er</w:t>
+      </w:r>
+      <w:proofErr w:type="spellEnd"/>
+      <w:r>
+        <w:t xml:space="preserve"> model to allow the tracking of the lips.</w:t>
       </w:r>
     </w:p>
     <w:p>
@@ -1101,8 +1147,13 @@
         </w:numPr>
       </w:pPr>
       <w:r>
-        <w:t>Mido in combination with python-rtmidi</w:t>
-      </w:r>
+        <w:t>Mido in combination with python-</w:t>
+      </w:r>
+      <w:proofErr w:type="spellStart"/>
+      <w:r>
+        <w:t>rtmidi</w:t>
+      </w:r>
+      <w:proofErr w:type="spellEnd"/>
     </w:p>
     <w:p>
       <w:pPr>
@@ -1113,8 +1164,13 @@
         </w:numPr>
       </w:pPr>
       <w:r>
-        <w:t>Just with python-rtmidi</w:t>
-      </w:r>
+        <w:t>Just with python-</w:t>
+      </w:r>
+      <w:proofErr w:type="spellStart"/>
+      <w:r>
+        <w:t>rtmidi</w:t>
+      </w:r>
+      <w:proofErr w:type="spellEnd"/>
     </w:p>
     <w:p>
       <w:pPr>
@@ -1124,8 +1180,13 @@
           <w:numId w:val="8"/>
         </w:numPr>
       </w:pPr>
-      <w:r>
-        <w:t xml:space="preserve">Pygame’s </w:t>
+      <w:proofErr w:type="spellStart"/>
+      <w:r>
+        <w:t>Pygame’s</w:t>
+      </w:r>
+      <w:proofErr w:type="spellEnd"/>
+      <w:r>
+        <w:t xml:space="preserve"> </w:t>
       </w:r>
       <w:r>
         <w:t>built in</w:t>
@@ -1156,16 +1217,42 @@
         <w:t xml:space="preserve">Mido </w:t>
       </w:r>
       <w:r>
-        <w:t>still uses python-rtmidi</w:t>
-      </w:r>
-      <w:r>
-        <w:t>, it just acts as a wrapper to make python-rtmidi easier to work with</w:t>
+        <w:t>still uses python-</w:t>
+      </w:r>
+      <w:proofErr w:type="spellStart"/>
+      <w:r>
+        <w:t>rtmidi</w:t>
+      </w:r>
+      <w:proofErr w:type="spellEnd"/>
+      <w:r>
+        <w:t>, it just acts as a wrapper to make python-</w:t>
+      </w:r>
+      <w:proofErr w:type="spellStart"/>
+      <w:r>
+        <w:t>rtmidi</w:t>
+      </w:r>
+      <w:proofErr w:type="spellEnd"/>
+      <w:r>
+        <w:t xml:space="preserve"> easier to work with</w:t>
       </w:r>
       <w:r>
         <w:t xml:space="preserve">. This and </w:t>
       </w:r>
-      <w:r>
-        <w:t>Pygame MIDI are the simplest to use, but Pygame is less suited for my use case because</w:t>
+      <w:proofErr w:type="spellStart"/>
+      <w:r>
+        <w:t>Pygame</w:t>
+      </w:r>
+      <w:proofErr w:type="spellEnd"/>
+      <w:r>
+        <w:t xml:space="preserve"> MIDI are the simplest to use, but </w:t>
+      </w:r>
+      <w:proofErr w:type="spellStart"/>
+      <w:r>
+        <w:t>Pygame</w:t>
+      </w:r>
+      <w:proofErr w:type="spellEnd"/>
+      <w:r>
+        <w:t xml:space="preserve"> is less suited for my use case because</w:t>
       </w:r>
       <w:r>
         <w:t xml:space="preserve"> it is primarily for game windows. </w:t>
@@ -1174,7 +1261,15 @@
         <w:t>So,</w:t>
       </w:r>
       <w:r>
-        <w:t xml:space="preserve"> I will use Mido and python-rtmidi to send MIDI signals to my guitar plugin.</w:t>
+        <w:t xml:space="preserve"> I will use Mido and python-</w:t>
+      </w:r>
+      <w:proofErr w:type="spellStart"/>
+      <w:r>
+        <w:t>rtmidi</w:t>
+      </w:r>
+      <w:proofErr w:type="spellEnd"/>
+      <w:r>
+        <w:t xml:space="preserve"> to send MIDI signals to my guitar plugin.</w:t>
       </w:r>
     </w:p>
     <w:p>
@@ -1231,8 +1326,13 @@
           <w:numId w:val="8"/>
         </w:numPr>
       </w:pPr>
-      <w:r>
-        <w:t xml:space="preserve">Reaper(the audio software I’m using) cannot </w:t>
+      <w:proofErr w:type="gramStart"/>
+      <w:r>
+        <w:t>Reaper(</w:t>
+      </w:r>
+      <w:proofErr w:type="gramEnd"/>
+      <w:r>
+        <w:t xml:space="preserve">the audio software I’m using) cannot </w:t>
       </w:r>
       <w:r>
         <w:t xml:space="preserve">receive MIDI signals straight from </w:t>
@@ -1241,7 +1341,23 @@
         <w:t>P</w:t>
       </w:r>
       <w:r>
-        <w:t>ython, it has to pass through a virtual MIDI cable first. For the virtual MIDI cable, I will be using loopMIDI.</w:t>
+        <w:t xml:space="preserve">ython, it </w:t>
+      </w:r>
+      <w:proofErr w:type="gramStart"/>
+      <w:r>
+        <w:t>has to</w:t>
+      </w:r>
+      <w:proofErr w:type="gramEnd"/>
+      <w:r>
+        <w:t xml:space="preserve"> pass through a virtual MIDI cable first. For the virtual MIDI cable, I will be using </w:t>
+      </w:r>
+      <w:proofErr w:type="spellStart"/>
+      <w:r>
+        <w:t>loopMIDI</w:t>
+      </w:r>
+      <w:proofErr w:type="spellEnd"/>
+      <w:r>
+        <w:t>.</w:t>
       </w:r>
     </w:p>
     <w:p>
@@ -1379,7 +1495,15 @@
         <w:t xml:space="preserve">Having an issue where it says </w:t>
       </w:r>
       <w:r>
-        <w:t xml:space="preserve">there is no port named ‘pythonmidi’ even though it is exactly what I named the </w:t>
+        <w:t>there is no port named ‘</w:t>
+      </w:r>
+      <w:proofErr w:type="spellStart"/>
+      <w:r>
+        <w:t>pythonmidi</w:t>
+      </w:r>
+      <w:proofErr w:type="spellEnd"/>
+      <w:r>
+        <w:t xml:space="preserve">’ even though it is exactly what I named the </w:t>
       </w:r>
       <w:r>
         <w:t>virtual MIDI cable.</w:t>
@@ -1488,10 +1612,23 @@
         </w:numPr>
       </w:pPr>
       <w:r>
-        <w:t>Got Mido to the name of every open MIDI port on my laptop. And it turns out that the port is actually named</w:t>
-      </w:r>
-      <w:r>
-        <w:t xml:space="preserve"> ‘pythonmidi 1’</w:t>
+        <w:t xml:space="preserve">Got Mido to the name of every open MIDI port on my laptop. And it turns out that the port is </w:t>
+      </w:r>
+      <w:proofErr w:type="gramStart"/>
+      <w:r>
+        <w:t>actually named</w:t>
+      </w:r>
+      <w:proofErr w:type="gramEnd"/>
+      <w:r>
+        <w:t xml:space="preserve"> ‘</w:t>
+      </w:r>
+      <w:proofErr w:type="spellStart"/>
+      <w:r>
+        <w:t>pythonmidi</w:t>
+      </w:r>
+      <w:proofErr w:type="spellEnd"/>
+      <w:r>
+        <w:t xml:space="preserve"> 1’</w:t>
       </w:r>
     </w:p>
     <w:p>
@@ -1674,7 +1811,15 @@
         </w:numPr>
       </w:pPr>
       <w:r>
-        <w:t>Picture showing loopMIDI detecting the MIDI messages being sent through the virtual MIDI port:</w:t>
+        <w:t xml:space="preserve">Picture showing </w:t>
+      </w:r>
+      <w:proofErr w:type="spellStart"/>
+      <w:r>
+        <w:t>loopMIDI</w:t>
+      </w:r>
+      <w:proofErr w:type="spellEnd"/>
+      <w:r>
+        <w:t xml:space="preserve"> detecting the MIDI messages being sent through the virtual MIDI port:</w:t>
       </w:r>
     </w:p>
     <w:p>
@@ -1848,11 +1993,16 @@
       <w:r>
         <w:t xml:space="preserve">having </w:t>
       </w:r>
+      <w:proofErr w:type="gramStart"/>
       <w:r>
         <w:t>Reaper</w:t>
       </w:r>
       <w:r>
-        <w:t>(my guitar software)</w:t>
+        <w:t>(</w:t>
+      </w:r>
+      <w:proofErr w:type="gramEnd"/>
+      <w:r>
+        <w:t>my guitar software)</w:t>
       </w:r>
       <w:r>
         <w:t xml:space="preserve"> </w:t>
@@ -1909,7 +2059,15 @@
         <w:t xml:space="preserve">he guitar plugin should automatically detect the message and map it to </w:t>
       </w:r>
       <w:r>
-        <w:t>the pedal I have chosen, however</w:t>
+        <w:t xml:space="preserve">the pedal I have </w:t>
+      </w:r>
+      <w:proofErr w:type="gramStart"/>
+      <w:r>
+        <w:t>chosen,</w:t>
+      </w:r>
+      <w:proofErr w:type="gramEnd"/>
+      <w:r>
+        <w:t xml:space="preserve"> however</w:t>
       </w:r>
       <w:r>
         <w:t>,</w:t>
@@ -2375,8 +2533,13 @@
         <w:t>Duplicated the Python file</w:t>
       </w:r>
       <w:r>
-        <w:t xml:space="preserve"> with mediapipe</w:t>
-      </w:r>
+        <w:t xml:space="preserve"> with </w:t>
+      </w:r>
+      <w:proofErr w:type="spellStart"/>
+      <w:r>
+        <w:t>mediapipe</w:t>
+      </w:r>
+      <w:proofErr w:type="spellEnd"/>
       <w:r>
         <w:t xml:space="preserve">, I will use </w:t>
       </w:r>
@@ -2568,7 +2731,15 @@
         <w:t>is not affected by the minimum lip distance</w:t>
       </w:r>
       <w:r>
-        <w:t>. So it’s not very helpful.</w:t>
+        <w:t xml:space="preserve">. </w:t>
+      </w:r>
+      <w:proofErr w:type="gramStart"/>
+      <w:r>
+        <w:t>So</w:t>
+      </w:r>
+      <w:proofErr w:type="gramEnd"/>
+      <w:r>
+        <w:t xml:space="preserve"> it’s not very helpful.</w:t>
       </w:r>
     </w:p>
     <w:p>
@@ -3086,10 +3257,28 @@
         </w:numPr>
       </w:pPr>
       <w:r>
-        <w:t xml:space="preserve">Using ui.tabs doesn’t quite give me the </w:t>
-      </w:r>
-      <w:r>
-        <w:t>look I want, I’m going to switch to using buttons so I can have more control over how they look.</w:t>
+        <w:t xml:space="preserve">Using </w:t>
+      </w:r>
+      <w:proofErr w:type="spellStart"/>
+      <w:proofErr w:type="gramStart"/>
+      <w:r>
+        <w:t>ui.tabs</w:t>
+      </w:r>
+      <w:proofErr w:type="spellEnd"/>
+      <w:proofErr w:type="gramEnd"/>
+      <w:r>
+        <w:t xml:space="preserve"> doesn’t quite give me the </w:t>
+      </w:r>
+      <w:r>
+        <w:t xml:space="preserve">look I </w:t>
+      </w:r>
+      <w:proofErr w:type="gramStart"/>
+      <w:r>
+        <w:t>want,</w:t>
+      </w:r>
+      <w:proofErr w:type="gramEnd"/>
+      <w:r>
+        <w:t xml:space="preserve"> I’m going to switch to using buttons so I can have more control over how they look.</w:t>
       </w:r>
     </w:p>
     <w:p>
@@ -3305,7 +3494,23 @@
         </w:numPr>
       </w:pPr>
       <w:r>
-        <w:t>Picked a color scheme and changed the background color:</w:t>
+        <w:t xml:space="preserve">Picked a </w:t>
+      </w:r>
+      <w:proofErr w:type="spellStart"/>
+      <w:r>
+        <w:t>color</w:t>
+      </w:r>
+      <w:proofErr w:type="spellEnd"/>
+      <w:r>
+        <w:t xml:space="preserve"> scheme and changed the background </w:t>
+      </w:r>
+      <w:proofErr w:type="spellStart"/>
+      <w:r>
+        <w:t>color</w:t>
+      </w:r>
+      <w:proofErr w:type="spellEnd"/>
+      <w:r>
+        <w:t>:</w:t>
       </w:r>
     </w:p>
     <w:p>
@@ -3411,7 +3616,15 @@
         </w:rPr>
       </w:pPr>
       <w:r>
-        <w:t xml:space="preserve">Styled the buttons – removed drop shadow, changed the color, </w:t>
+        <w:t xml:space="preserve">Styled the buttons – removed drop shadow, changed the </w:t>
+      </w:r>
+      <w:proofErr w:type="spellStart"/>
+      <w:r>
+        <w:t>color</w:t>
+      </w:r>
+      <w:proofErr w:type="spellEnd"/>
+      <w:r>
+        <w:t xml:space="preserve">, </w:t>
       </w:r>
       <w:r>
         <w:t>rounded only the top right and left button corners.</w:t>
@@ -3555,7 +3768,15 @@
         <w:t xml:space="preserve">icons have not </w:t>
       </w:r>
       <w:r>
-        <w:t>been finished yet so I have not added them to the nav bar.</w:t>
+        <w:t xml:space="preserve">been finished </w:t>
+      </w:r>
+      <w:proofErr w:type="gramStart"/>
+      <w:r>
+        <w:t>yet</w:t>
+      </w:r>
+      <w:proofErr w:type="gramEnd"/>
+      <w:r>
+        <w:t xml:space="preserve"> so I have not added them to the nav bar.</w:t>
       </w:r>
     </w:p>
     <w:p/>
@@ -3600,7 +3821,15 @@
         <w:t xml:space="preserve">I believe it would be best that I </w:t>
       </w:r>
       <w:r>
-        <w:t>use one page for all the functions rather than a separate page for each. This means that my app wouldn’t have to load a complete new webpage, and it will hopefully run smooth</w:t>
+        <w:t xml:space="preserve">use one page for all the functions rather than a separate page for each. This means that my app wouldn’t have to load a </w:t>
+      </w:r>
+      <w:proofErr w:type="gramStart"/>
+      <w:r>
+        <w:t>complete</w:t>
+      </w:r>
+      <w:proofErr w:type="gramEnd"/>
+      <w:r>
+        <w:t xml:space="preserve"> new webpage, and it will hopefully run smooth</w:t>
       </w:r>
       <w:r>
         <w:t>est</w:t>
@@ -3862,8 +4091,13 @@
         <w:t>semi-</w:t>
       </w:r>
       <w:r>
-        <w:t>circular bar that updates depending on the percent of the wah</w:t>
-      </w:r>
+        <w:t xml:space="preserve">circular bar that updates depending on the percent of the </w:t>
+      </w:r>
+      <w:proofErr w:type="spellStart"/>
+      <w:r>
+        <w:t>wah</w:t>
+      </w:r>
+      <w:proofErr w:type="spellEnd"/>
       <w:r>
         <w:t>, however, the built</w:t>
       </w:r>
@@ -3877,13 +4111,30 @@
         <w:t xml:space="preserve"> displays</w:t>
       </w:r>
       <w:r>
-        <w:t xml:space="preserve"> such as ui.highchart</w:t>
-      </w:r>
+        <w:t xml:space="preserve"> such as </w:t>
+      </w:r>
+      <w:proofErr w:type="spellStart"/>
+      <w:proofErr w:type="gramStart"/>
+      <w:r>
+        <w:t>ui.highchart</w:t>
+      </w:r>
+      <w:proofErr w:type="spellEnd"/>
+      <w:proofErr w:type="gramEnd"/>
       <w:r>
         <w:t xml:space="preserve"> </w:t>
       </w:r>
       <w:r>
-        <w:t xml:space="preserve">and ui.echart </w:t>
+        <w:t xml:space="preserve">and </w:t>
+      </w:r>
+      <w:proofErr w:type="spellStart"/>
+      <w:proofErr w:type="gramStart"/>
+      <w:r>
+        <w:t>ui.echart</w:t>
+      </w:r>
+      <w:proofErr w:type="spellEnd"/>
+      <w:proofErr w:type="gramEnd"/>
+      <w:r>
+        <w:t xml:space="preserve"> </w:t>
       </w:r>
       <w:r>
         <w:t xml:space="preserve">don’t </w:t>
@@ -3901,7 +4152,15 @@
         </w:numPr>
       </w:pPr>
       <w:r>
-        <w:t>Making it a semi-circle was too difficult for me, I’m going to use a full circle for the status bar to make it manageable.</w:t>
+        <w:t xml:space="preserve">Making it a semi-circle was too difficult for </w:t>
+      </w:r>
+      <w:proofErr w:type="gramStart"/>
+      <w:r>
+        <w:t>me,</w:t>
+      </w:r>
+      <w:proofErr w:type="gramEnd"/>
+      <w:r>
+        <w:t xml:space="preserve"> I’m going to use a full circle for the status bar to make it manageable.</w:t>
       </w:r>
     </w:p>
     <w:p>
@@ -4010,7 +4269,15 @@
       </w:pPr>
       <w:r>
         <w:lastRenderedPageBreak/>
-        <w:t>Testing it separately, and trying to update the value in real time.</w:t>
+        <w:t xml:space="preserve">Testing it </w:t>
+      </w:r>
+      <w:proofErr w:type="gramStart"/>
+      <w:r>
+        <w:t>separately, and</w:t>
+      </w:r>
+      <w:proofErr w:type="gramEnd"/>
+      <w:r>
+        <w:t xml:space="preserve"> trying to update the value in real time.</w:t>
       </w:r>
     </w:p>
     <w:p>
@@ -4116,7 +4383,15 @@
         <w:t xml:space="preserve">The lines that control the value of the gauge are </w:t>
       </w:r>
       <w:r>
-        <w:t xml:space="preserve">“stroke-dashoffset”, </w:t>
+        <w:t>“stroke-</w:t>
+      </w:r>
+      <w:proofErr w:type="spellStart"/>
+      <w:r>
+        <w:t>dashoffset</w:t>
+      </w:r>
+      <w:proofErr w:type="spellEnd"/>
+      <w:r>
+        <w:t xml:space="preserve">”, </w:t>
       </w:r>
       <w:r>
         <w:t>the line that displays the value in the middle of the gauge.</w:t>
@@ -4131,7 +4406,15 @@
         </w:numPr>
       </w:pPr>
       <w:r>
-        <w:t xml:space="preserve">Stroke-dashoffset has a range of </w:t>
+        <w:t>Stroke-</w:t>
+      </w:r>
+      <w:proofErr w:type="spellStart"/>
+      <w:r>
+        <w:t>dashoffset</w:t>
+      </w:r>
+      <w:proofErr w:type="spellEnd"/>
+      <w:r>
+        <w:t xml:space="preserve"> has a range of </w:t>
       </w:r>
       <w:r>
         <w:t>0 to 722, so I will need to make sure a value of 100 corresponds to 722.</w:t>
@@ -4562,7 +4845,15 @@
         </w:numPr>
       </w:pPr>
       <w:r>
-        <w:t>Added sliders for the settings using the example shown in the NiceGUI documentation</w:t>
+        <w:t xml:space="preserve">Added sliders for the settings using the example shown in the </w:t>
+      </w:r>
+      <w:proofErr w:type="spellStart"/>
+      <w:r>
+        <w:t>NiceGUI</w:t>
+      </w:r>
+      <w:proofErr w:type="spellEnd"/>
+      <w:r>
+        <w:t xml:space="preserve"> documentation</w:t>
       </w:r>
     </w:p>
     <w:p>
@@ -4751,7 +5042,31 @@
         </w:numPr>
       </w:pPr>
       <w:r>
-        <w:t>I’ve encountered an issue with my variable for min and max wah being immutable, this means that I won’t be able to update it real time with my slider, so the wah settings wouldn’t actually change.</w:t>
+        <w:t xml:space="preserve">I’ve encountered an issue with my variable for min and max </w:t>
+      </w:r>
+      <w:proofErr w:type="spellStart"/>
+      <w:r>
+        <w:t>wah</w:t>
+      </w:r>
+      <w:proofErr w:type="spellEnd"/>
+      <w:r>
+        <w:t xml:space="preserve"> being immutable, this means that I won’t be able to update it real time with my slider, so the </w:t>
+      </w:r>
+      <w:proofErr w:type="spellStart"/>
+      <w:r>
+        <w:t>wah</w:t>
+      </w:r>
+      <w:proofErr w:type="spellEnd"/>
+      <w:r>
+        <w:t xml:space="preserve"> settings wouldn’t </w:t>
+      </w:r>
+      <w:proofErr w:type="gramStart"/>
+      <w:r>
+        <w:t>actually change</w:t>
+      </w:r>
+      <w:proofErr w:type="gramEnd"/>
+      <w:r>
+        <w:t>.</w:t>
       </w:r>
     </w:p>
     <w:p>
@@ -4973,7 +5288,15 @@
         <w:t xml:space="preserve"> prints the updated value very frequently, while I only need it to </w:t>
       </w:r>
       <w:r>
-        <w:t>update when the user releases the slider. I have to change it or else it might introduce unnecessary lag while changing the settings because of all the updates that are being done to the settings.</w:t>
+        <w:t xml:space="preserve">update when the user releases the slider. I </w:t>
+      </w:r>
+      <w:proofErr w:type="gramStart"/>
+      <w:r>
+        <w:t>have to</w:t>
+      </w:r>
+      <w:proofErr w:type="gramEnd"/>
+      <w:r>
+        <w:t xml:space="preserve"> change it or else it might introduce unnecessary lag while changing the settings because of all the updates that are being done to the settings.</w:t>
       </w:r>
     </w:p>
     <w:p>
@@ -5017,10 +5340,26 @@
         </w:numPr>
       </w:pPr>
       <w:r>
-        <w:t xml:space="preserve">I’m finding it hard to make the settings without the actual wah program </w:t>
-      </w:r>
-      <w:r>
-        <w:t>code, so I will put the settings menu on hold for now to combine the webapp with the wah.</w:t>
+        <w:t xml:space="preserve">I’m finding it hard to make the settings without the actual </w:t>
+      </w:r>
+      <w:proofErr w:type="spellStart"/>
+      <w:r>
+        <w:t>wah</w:t>
+      </w:r>
+      <w:proofErr w:type="spellEnd"/>
+      <w:r>
+        <w:t xml:space="preserve"> program </w:t>
+      </w:r>
+      <w:r>
+        <w:t xml:space="preserve">code, so I will put the settings menu on hold for now to combine the webapp with the </w:t>
+      </w:r>
+      <w:proofErr w:type="spellStart"/>
+      <w:r>
+        <w:t>wah</w:t>
+      </w:r>
+      <w:proofErr w:type="spellEnd"/>
+      <w:r>
+        <w:t>.</w:t>
       </w:r>
     </w:p>
     <w:p>
@@ -5064,7 +5403,15 @@
         </w:numPr>
       </w:pPr>
       <w:r>
-        <w:t>Webapp GUI now works while the face tracking runs. The function contains all of the code for the face tracking and MIDI</w:t>
+        <w:t xml:space="preserve">Webapp GUI now works while the face tracking runs. The function contains </w:t>
+      </w:r>
+      <w:proofErr w:type="gramStart"/>
+      <w:r>
+        <w:t>all of</w:t>
+      </w:r>
+      <w:proofErr w:type="gramEnd"/>
+      <w:r>
+        <w:t xml:space="preserve"> the code for the face tracking and MIDI</w:t>
       </w:r>
     </w:p>
     <w:p>
@@ -5122,7 +5469,15 @@
         </w:numPr>
       </w:pPr>
       <w:r>
-        <w:t>Working on connecting the wah percentage to the gauge.</w:t>
+        <w:t xml:space="preserve">Working on connecting the </w:t>
+      </w:r>
+      <w:proofErr w:type="spellStart"/>
+      <w:r>
+        <w:t>wah</w:t>
+      </w:r>
+      <w:proofErr w:type="spellEnd"/>
+      <w:r>
+        <w:t xml:space="preserve"> percentage to the gauge.</w:t>
       </w:r>
     </w:p>
     <w:p>
@@ -5136,8 +5491,13 @@
       <w:r>
         <w:t xml:space="preserve">Once again, I </w:t>
       </w:r>
-      <w:r>
-        <w:t>have to use a dictionary to store the value of the gauge so that it is mutable</w:t>
+      <w:proofErr w:type="gramStart"/>
+      <w:r>
+        <w:t>have to</w:t>
+      </w:r>
+      <w:proofErr w:type="gramEnd"/>
+      <w:r>
+        <w:t xml:space="preserve"> use a dictionary to store the value of the gauge so that it is mutable</w:t>
       </w:r>
       <w:r>
         <w:t>.</w:t>
@@ -5330,6 +5690,118 @@
         </w:drawing>
       </w:r>
     </w:p>
+    <w:p/>
+    <w:p>
+      <w:pPr>
+        <w:pStyle w:val="ListParagraph"/>
+        <w:numPr>
+          <w:ilvl w:val="0"/>
+          <w:numId w:val="16"/>
+        </w:numPr>
+      </w:pPr>
+      <w:r>
+        <w:t xml:space="preserve">Renders all the pages just </w:t>
+      </w:r>
+      <w:r>
+        <w:t>once and</w:t>
+      </w:r>
+      <w:r>
+        <w:t xml:space="preserve"> hide/unhide </w:t>
+      </w:r>
+      <w:r>
+        <w:t>them to switch.</w:t>
+      </w:r>
+      <w:r>
+        <w:t xml:space="preserve"> Since the main container has three columns, it will naturally stac</w:t>
+      </w:r>
+      <w:r>
+        <w:t>k side by side when on a desktop screen.</w:t>
+      </w:r>
+    </w:p>
+    <w:p>
+      <w:pPr>
+        <w:pStyle w:val="ListParagraph"/>
+      </w:pPr>
+      <w:r>
+        <w:drawing>
+          <wp:inline distT="0" distB="0" distL="0" distR="0" wp14:anchorId="17BAF9D3" wp14:editId="4C7C10B9">
+            <wp:extent cx="4443413" cy="1576314"/>
+            <wp:effectExtent l="0" t="0" r="0" b="5080"/>
+            <wp:docPr id="1900729331" name="Picture 1"/>
+            <wp:cNvGraphicFramePr>
+              <a:graphicFrameLocks xmlns:a="http://schemas.openxmlformats.org/drawingml/2006/main" noChangeAspect="1"/>
+            </wp:cNvGraphicFramePr>
+            <a:graphic xmlns:a="http://schemas.openxmlformats.org/drawingml/2006/main">
+              <a:graphicData uri="http://schemas.openxmlformats.org/drawingml/2006/picture">
+                <pic:pic xmlns:pic="http://schemas.openxmlformats.org/drawingml/2006/picture">
+                  <pic:nvPicPr>
+                    <pic:cNvPr id="1900729331" name=""/>
+                    <pic:cNvPicPr/>
+                  </pic:nvPicPr>
+                  <pic:blipFill>
+                    <a:blip r:embed="rId66"/>
+                    <a:stretch>
+                      <a:fillRect/>
+                    </a:stretch>
+                  </pic:blipFill>
+                  <pic:spPr>
+                    <a:xfrm>
+                      <a:off x="0" y="0"/>
+                      <a:ext cx="4458758" cy="1581758"/>
+                    </a:xfrm>
+                    <a:prstGeom prst="rect">
+                      <a:avLst/>
+                    </a:prstGeom>
+                  </pic:spPr>
+                </pic:pic>
+              </a:graphicData>
+            </a:graphic>
+          </wp:inline>
+        </w:drawing>
+      </w:r>
+    </w:p>
+    <w:p>
+      <w:pPr>
+        <w:ind w:firstLine="720"/>
+      </w:pPr>
+      <w:r>
+        <w:drawing>
+          <wp:inline distT="0" distB="0" distL="0" distR="0" wp14:anchorId="6F8AF5FB" wp14:editId="3ABFAA1F">
+            <wp:extent cx="2300192" cy="2290763"/>
+            <wp:effectExtent l="0" t="0" r="5080" b="0"/>
+            <wp:docPr id="1165264081" name="Picture 1"/>
+            <wp:cNvGraphicFramePr>
+              <a:graphicFrameLocks xmlns:a="http://schemas.openxmlformats.org/drawingml/2006/main" noChangeAspect="1"/>
+            </wp:cNvGraphicFramePr>
+            <a:graphic xmlns:a="http://schemas.openxmlformats.org/drawingml/2006/main">
+              <a:graphicData uri="http://schemas.openxmlformats.org/drawingml/2006/picture">
+                <pic:pic xmlns:pic="http://schemas.openxmlformats.org/drawingml/2006/picture">
+                  <pic:nvPicPr>
+                    <pic:cNvPr id="1165264081" name=""/>
+                    <pic:cNvPicPr/>
+                  </pic:nvPicPr>
+                  <pic:blipFill>
+                    <a:blip r:embed="rId67"/>
+                    <a:stretch>
+                      <a:fillRect/>
+                    </a:stretch>
+                  </pic:blipFill>
+                  <pic:spPr>
+                    <a:xfrm>
+                      <a:off x="0" y="0"/>
+                      <a:ext cx="2301894" cy="2292458"/>
+                    </a:xfrm>
+                    <a:prstGeom prst="rect">
+                      <a:avLst/>
+                    </a:prstGeom>
+                  </pic:spPr>
+                </pic:pic>
+              </a:graphicData>
+            </a:graphic>
+          </wp:inline>
+        </w:drawing>
+      </w:r>
+    </w:p>
     <w:sectPr>
       <w:pgSz w:w="11906" w:h="16838"/>
       <w:pgMar w:top="1440" w:right="1440" w:bottom="1440" w:left="1440" w:header="708" w:footer="708" w:gutter="0"/>
@@ -6751,7 +7223,7 @@
   <w:abstractNum w:abstractNumId="12" w15:restartNumberingAfterBreak="0">
     <w:nsid w:val="659B44CD"/>
     <w:multiLevelType w:val="hybridMultilevel"/>
-    <w:tmpl w:val="91E81C5E"/>
+    <w:tmpl w:val="79B0D7D4"/>
     <w:lvl w:ilvl="0" w:tplc="14090001">
       <w:start w:val="1"/>
       <w:numFmt w:val="bullet"/>

</xml_diff>

<commit_message>
Various small improvements. Includes error handling and aesthetics.
</commit_message>
<xml_diff>
--- a/Logs.docx
+++ b/Logs.docx
@@ -1,852 +1,7 @@
 
 <file path=word/document.xml><?xml version="1.0" encoding="utf-8"?>
-<w:document xmlns:wpc="http://schemas.microsoft.com/office/word/2010/wordprocessingCanvas" xmlns:cx="http://schemas.microsoft.com/office/drawing/2014/chartex" xmlns:cx1="http://schemas.microsoft.com/office/drawing/2015/9/8/chartex" xmlns:cx2="http://schemas.microsoft.com/office/drawing/2015/10/21/chartex" xmlns:cx3="http://schemas.microsoft.com/office/drawing/2016/5/9/chartex" xmlns:cx4="http://schemas.microsoft.com/office/drawing/2016/5/10/chartex" xmlns:cx5="http://schemas.microsoft.com/office/drawing/2016/5/11/chartex" xmlns:cx6="http://schemas.microsoft.com/office/drawing/2016/5/12/chartex" xmlns:cx7="http://schemas.microsoft.com/office/drawing/2016/5/13/chartex" xmlns:cx8="http://schemas.microsoft.com/office/drawing/2016/5/14/chartex" xmlns:mc="http://schemas.openxmlformats.org/markup-compatibility/2006" xmlns:aink="http://schemas.microsoft.com/office/drawing/2016/ink" xmlns:am3d="http://schemas.microsoft.com/office/drawing/2017/model3d" xmlns:o="urn:schemas-microsoft-com:office:office" xmlns:oel="http://schemas.microsoft.com/office/2019/extlst" xmlns:r="http://schemas.openxmlformats.org/officeDocument/2006/relationships" xmlns:m="http://schemas.openxmlformats.org/officeDocument/2006/math" xmlns:v="urn:schemas-microsoft-com:vml" xmlns:wp14="http://schemas.microsoft.com/office/word/2010/wordprocessingDrawing" xmlns:wp="http://schemas.openxmlformats.org/drawingml/2006/wordprocessingDrawing" xmlns:w10="urn:schemas-microsoft-com:office:word" xmlns:w="http://schemas.openxmlformats.org/wordprocessingml/2006/main" xmlns:w14="http://schemas.microsoft.com/office/word/2010/wordml" xmlns:w15="http://schemas.microsoft.com/office/word/2012/wordml" xmlns:w16cei="http://schemas.microsoft.com/office/word/2026/wordml/cei" xmlns:w16cex="http://schemas.microsoft.com/office/word/2018/wordml/cex" xmlns:w16cid="http://schemas.microsoft.com/office/word/2016/wordml/cid" xmlns:w16="http://schemas.microsoft.com/office/word/2018/wordml" xmlns:w16du="http://schemas.microsoft.com/office/word/2023/wordml/word16du" xmlns:w16sdtdh="http://schemas.microsoft.com/office/word/2020/wordml/sdtdatahash" xmlns:w16sdtfl="http://schemas.microsoft.com/office/word/2024/wordml/sdtformatlock" xmlns:w16se="http://schemas.microsoft.com/office/word/2015/wordml/symex" xmlns:wpg="http://schemas.microsoft.com/office/word/2010/wordprocessingGroup" xmlns:wpi="http://schemas.microsoft.com/office/word/2010/wordprocessingInk" xmlns:wne="http://schemas.microsoft.com/office/word/2006/wordml" xmlns:wps="http://schemas.microsoft.com/office/word/2010/wordprocessingShape" mc:Ignorable="w14 w15 w16se w16cid w16 w16cex w16sdtdh w16sdtfl w16du wp14">
+<w:document xmlns:wpc="http://schemas.microsoft.com/office/word/2010/wordprocessingCanvas" xmlns:cx="http://schemas.microsoft.com/office/drawing/2014/chartex" xmlns:cx1="http://schemas.microsoft.com/office/drawing/2015/9/8/chartex" xmlns:cx2="http://schemas.microsoft.com/office/drawing/2015/10/21/chartex" xmlns:cx3="http://schemas.microsoft.com/office/drawing/2016/5/9/chartex" xmlns:cx4="http://schemas.microsoft.com/office/drawing/2016/5/10/chartex" xmlns:cx5="http://schemas.microsoft.com/office/drawing/2016/5/11/chartex" xmlns:cx6="http://schemas.microsoft.com/office/drawing/2016/5/12/chartex" xmlns:cx7="http://schemas.microsoft.com/office/drawing/2016/5/13/chartex" xmlns:cx8="http://schemas.microsoft.com/office/drawing/2016/5/14/chartex" xmlns:mc="http://schemas.openxmlformats.org/markup-compatibility/2006" xmlns:aink="http://schemas.microsoft.com/office/drawing/2016/ink" xmlns:am3d="http://schemas.microsoft.com/office/drawing/2017/model3d" xmlns:o="urn:schemas-microsoft-com:office:office" xmlns:oel="http://schemas.microsoft.com/office/2019/extlst" xmlns:r="http://schemas.openxmlformats.org/officeDocument/2006/relationships" xmlns:m="http://schemas.openxmlformats.org/officeDocument/2006/math" xmlns:v="urn:schemas-microsoft-com:vml" xmlns:wp14="http://schemas.microsoft.com/office/word/2010/wordprocessingDrawing" xmlns:wp="http://schemas.openxmlformats.org/drawingml/2006/wordprocessingDrawing" xmlns:w10="urn:schemas-microsoft-com:office:word" xmlns:w="http://schemas.openxmlformats.org/wordprocessingml/2006/main" xmlns:w14="http://schemas.microsoft.com/office/word/2010/wordml" xmlns:w15="http://schemas.microsoft.com/office/word/2012/wordml" xmlns:w16cex="http://schemas.microsoft.com/office/word/2018/wordml/cex" xmlns:w16cid="http://schemas.microsoft.com/office/word/2016/wordml/cid" xmlns:w16="http://schemas.microsoft.com/office/word/2018/wordml" xmlns:w16du="http://schemas.microsoft.com/office/word/2023/wordml/word16du" xmlns:w16sdtdh="http://schemas.microsoft.com/office/word/2020/wordml/sdtdatahash" xmlns:w16sdtfl="http://schemas.microsoft.com/office/word/2024/wordml/sdtformatlock" xmlns:w16se="http://schemas.microsoft.com/office/word/2015/wordml/symex" xmlns:wpg="http://schemas.microsoft.com/office/word/2010/wordprocessingGroup" xmlns:wpi="http://schemas.microsoft.com/office/word/2010/wordprocessingInk" xmlns:wne="http://schemas.microsoft.com/office/word/2006/wordml" xmlns:wps="http://schemas.microsoft.com/office/word/2010/wordprocessingShape" mc:Ignorable="w14 w15 w16se w16cid w16 w16cex w16sdtdh w16sdtfl w16du wp14">
   <w:body>
-    <w:p>
-      <w:pPr>
-        <w:rPr>
-          <w:b/>
-          <w:bCs/>
-        </w:rPr>
-      </w:pPr>
-      <w:r>
-        <w:rPr>
-          <w:b/>
-          <w:bCs/>
-        </w:rPr>
-        <w:t>Potential Ideas:</w:t>
-      </w:r>
-    </w:p>
-    <w:p>
-      <w:pPr>
-        <w:rPr>
-          <w:b/>
-          <w:bCs/>
-        </w:rPr>
-      </w:pPr>
-      <w:r>
-        <w:rPr>
-          <w:b/>
-          <w:bCs/>
-        </w:rPr>
-        <w:t>Study planning app</w:t>
-      </w:r>
-    </w:p>
-    <w:p>
-      <w:pPr>
-        <w:pStyle w:val="ListParagraph"/>
-        <w:numPr>
-          <w:ilvl w:val="0"/>
-          <w:numId w:val="5"/>
-        </w:numPr>
-      </w:pPr>
-      <w:r>
-        <w:t>Help students s</w:t>
-      </w:r>
-      <w:r>
-        <w:t>chedule what to study and when to study</w:t>
-      </w:r>
-      <w:r>
-        <w:t>.</w:t>
-      </w:r>
-    </w:p>
-    <w:p>
-      <w:pPr>
-        <w:pStyle w:val="ListParagraph"/>
-        <w:numPr>
-          <w:ilvl w:val="0"/>
-          <w:numId w:val="5"/>
-        </w:numPr>
-      </w:pPr>
-      <w:r>
-        <w:t>Would be immediately useful to myself and students alike.</w:t>
-      </w:r>
-    </w:p>
-    <w:p>
-      <w:pPr>
-        <w:pStyle w:val="ListParagraph"/>
-        <w:numPr>
-          <w:ilvl w:val="0"/>
-          <w:numId w:val="5"/>
-        </w:numPr>
-      </w:pPr>
-      <w:r>
-        <w:t>Pre-defined selection of various subjects</w:t>
-      </w:r>
-      <w:r>
-        <w:t xml:space="preserve"> +</w:t>
-      </w:r>
-      <w:r>
-        <w:t xml:space="preserve"> </w:t>
-      </w:r>
-      <w:r>
-        <w:t>A</w:t>
-      </w:r>
-      <w:r>
-        <w:t>bility to name and add your own subject</w:t>
-      </w:r>
-      <w:r>
-        <w:t>s</w:t>
-      </w:r>
-      <w:r>
-        <w:t>.</w:t>
-      </w:r>
-    </w:p>
-    <w:p>
-      <w:pPr>
-        <w:pStyle w:val="ListParagraph"/>
-        <w:numPr>
-          <w:ilvl w:val="0"/>
-          <w:numId w:val="5"/>
-        </w:numPr>
-      </w:pPr>
-      <w:r>
-        <w:t xml:space="preserve">Drag and drop subjects into spaces </w:t>
-      </w:r>
-      <w:r>
-        <w:t xml:space="preserve">on </w:t>
-      </w:r>
-      <w:r>
-        <w:t>a calendar</w:t>
-      </w:r>
-      <w:r>
-        <w:t>-</w:t>
-      </w:r>
-      <w:r>
-        <w:t>like interface.</w:t>
-      </w:r>
-    </w:p>
-    <w:p>
-      <w:pPr>
-        <w:pStyle w:val="ListParagraph"/>
-        <w:numPr>
-          <w:ilvl w:val="0"/>
-          <w:numId w:val="5"/>
-        </w:numPr>
-      </w:pPr>
-      <w:r>
-        <w:t>Able to assign notes to planned subjects</w:t>
-      </w:r>
-    </w:p>
-    <w:p>
-      <w:pPr>
-        <w:pStyle w:val="ListParagraph"/>
-        <w:numPr>
-          <w:ilvl w:val="0"/>
-          <w:numId w:val="5"/>
-        </w:numPr>
-      </w:pPr>
-      <w:r>
-        <w:t>The problem is that t</w:t>
-      </w:r>
-      <w:r>
-        <w:t>here is already a large selection of free study planners that can be found online.</w:t>
-      </w:r>
-    </w:p>
-    <w:p>
-      <w:pPr>
-        <w:pStyle w:val="ListParagraph"/>
-      </w:pPr>
-    </w:p>
-    <w:p>
-      <w:pPr>
-        <w:rPr>
-          <w:b/>
-          <w:bCs/>
-        </w:rPr>
-      </w:pPr>
-      <w:r>
-        <w:rPr>
-          <w:b/>
-          <w:bCs/>
-        </w:rPr>
-        <w:t>Computer visio</w:t>
-      </w:r>
-      <w:r>
-        <w:rPr>
-          <w:b/>
-          <w:bCs/>
-        </w:rPr>
-        <w:t>n</w:t>
-      </w:r>
-    </w:p>
-    <w:p>
-      <w:pPr>
-        <w:pStyle w:val="ListParagraph"/>
-        <w:numPr>
-          <w:ilvl w:val="0"/>
-          <w:numId w:val="6"/>
-        </w:numPr>
-      </w:pPr>
-      <w:r>
-        <w:t xml:space="preserve">Track </w:t>
-      </w:r>
-      <w:r>
-        <w:t xml:space="preserve">a facial feature </w:t>
-      </w:r>
-      <w:r>
-        <w:t>to control the sound of your guitar playing</w:t>
-      </w:r>
-      <w:r>
-        <w:t>.</w:t>
-      </w:r>
-    </w:p>
-    <w:p>
-      <w:pPr>
-        <w:pStyle w:val="ListParagraph"/>
-        <w:numPr>
-          <w:ilvl w:val="0"/>
-          <w:numId w:val="6"/>
-        </w:numPr>
-      </w:pPr>
-      <w:r>
-        <w:t>Allows the use of a guitar pedal without your foot (which is how it’s usually controlled)</w:t>
-      </w:r>
-    </w:p>
-    <w:p>
-      <w:pPr>
-        <w:pStyle w:val="ListParagraph"/>
-        <w:numPr>
-          <w:ilvl w:val="0"/>
-          <w:numId w:val="6"/>
-        </w:numPr>
-      </w:pPr>
-      <w:r>
-        <w:t xml:space="preserve">Helpful for guitarists that </w:t>
-      </w:r>
-      <w:r>
-        <w:t>don’t have a pedal</w:t>
-      </w:r>
-      <w:r>
-        <w:t xml:space="preserve"> or </w:t>
-      </w:r>
-      <w:r>
-        <w:t>are unable to control one with their legs.</w:t>
-      </w:r>
-    </w:p>
-    <w:p>
-      <w:pPr>
-        <w:pStyle w:val="ListParagraph"/>
-        <w:numPr>
-          <w:ilvl w:val="0"/>
-          <w:numId w:val="6"/>
-        </w:numPr>
-      </w:pPr>
-      <w:r>
-        <w:t>Ability to calibrate the</w:t>
-      </w:r>
-      <w:r>
-        <w:t xml:space="preserve"> tracking according to the user’s facial features.</w:t>
-      </w:r>
-    </w:p>
-    <w:p>
-      <w:pPr>
-        <w:pStyle w:val="ListParagraph"/>
-        <w:numPr>
-          <w:ilvl w:val="0"/>
-          <w:numId w:val="6"/>
-        </w:numPr>
-      </w:pPr>
-      <w:r>
-        <w:t>Have not seen a similar idea on</w:t>
-      </w:r>
-      <w:r>
-        <w:t>line yet.</w:t>
-      </w:r>
-    </w:p>
-    <w:p>
-      <w:pPr>
-        <w:pStyle w:val="ListParagraph"/>
-        <w:ind w:left="360"/>
-      </w:pPr>
-    </w:p>
-    <w:p>
-      <w:pPr>
-        <w:rPr>
-          <w:b/>
-          <w:bCs/>
-        </w:rPr>
-      </w:pPr>
-      <w:r>
-        <w:rPr>
-          <w:b/>
-          <w:bCs/>
-        </w:rPr>
-        <w:t>Game development</w:t>
-      </w:r>
-    </w:p>
-    <w:p>
-      <w:pPr>
-        <w:pStyle w:val="ListParagraph"/>
-        <w:numPr>
-          <w:ilvl w:val="0"/>
-          <w:numId w:val="6"/>
-        </w:numPr>
-      </w:pPr>
-      <w:r>
-        <w:t xml:space="preserve">Create a </w:t>
-      </w:r>
-      <w:r>
-        <w:t xml:space="preserve">unique </w:t>
-      </w:r>
-      <w:r>
-        <w:t>game</w:t>
-      </w:r>
-    </w:p>
-    <w:p>
-      <w:pPr>
-        <w:pStyle w:val="ListParagraph"/>
-        <w:numPr>
-          <w:ilvl w:val="0"/>
-          <w:numId w:val="6"/>
-        </w:numPr>
-      </w:pPr>
-      <w:r>
-        <w:t xml:space="preserve">Have it </w:t>
-      </w:r>
-      <w:proofErr w:type="gramStart"/>
-      <w:r>
-        <w:t>be</w:t>
-      </w:r>
-      <w:proofErr w:type="gramEnd"/>
-      <w:r>
-        <w:t xml:space="preserve"> educational</w:t>
-      </w:r>
-    </w:p>
-    <w:p>
-      <w:pPr>
-        <w:pStyle w:val="ListParagraph"/>
-        <w:numPr>
-          <w:ilvl w:val="0"/>
-          <w:numId w:val="6"/>
-        </w:numPr>
-      </w:pPr>
-      <w:r>
-        <w:t>Simple, easy to understand UI</w:t>
-      </w:r>
-    </w:p>
-    <w:p>
-      <w:pPr>
-        <w:pStyle w:val="ListParagraph"/>
-        <w:numPr>
-          <w:ilvl w:val="0"/>
-          <w:numId w:val="6"/>
-        </w:numPr>
-      </w:pPr>
-      <w:r>
-        <w:t>Very generic idea, not very interesting.</w:t>
-      </w:r>
-    </w:p>
-    <w:p>
-      <w:pPr>
-        <w:pStyle w:val="ListParagraph"/>
-        <w:ind w:left="360"/>
-      </w:pPr>
-    </w:p>
-    <w:p>
-      <w:pPr>
-        <w:rPr>
-          <w:b/>
-          <w:bCs/>
-        </w:rPr>
-      </w:pPr>
-      <w:r>
-        <w:rPr>
-          <w:b/>
-          <w:bCs/>
-        </w:rPr>
-        <w:t xml:space="preserve">Educational </w:t>
-      </w:r>
-      <w:r>
-        <w:rPr>
-          <w:b/>
-          <w:bCs/>
-        </w:rPr>
-        <w:t>crypto investment</w:t>
-      </w:r>
-      <w:r>
-        <w:rPr>
-          <w:b/>
-          <w:bCs/>
-        </w:rPr>
-        <w:t xml:space="preserve"> app</w:t>
-      </w:r>
-    </w:p>
-    <w:p>
-      <w:pPr>
-        <w:pStyle w:val="ListParagraph"/>
-        <w:numPr>
-          <w:ilvl w:val="0"/>
-          <w:numId w:val="6"/>
-        </w:numPr>
-      </w:pPr>
-      <w:r>
-        <w:t>App to help students learn how investments work in Bitcoin, Ether</w:t>
-      </w:r>
-      <w:r>
-        <w:t>eum, and other cryptocurrencies change over time without risk of losing money.</w:t>
-      </w:r>
-    </w:p>
-    <w:p>
-      <w:pPr>
-        <w:pStyle w:val="ListParagraph"/>
-        <w:numPr>
-          <w:ilvl w:val="0"/>
-          <w:numId w:val="6"/>
-        </w:numPr>
-      </w:pPr>
-      <w:r>
-        <w:t>Uses an API to fetch real time stock data</w:t>
-      </w:r>
-      <w:r>
-        <w:t>.</w:t>
-      </w:r>
-    </w:p>
-    <w:p>
-      <w:pPr>
-        <w:pStyle w:val="ListParagraph"/>
-        <w:numPr>
-          <w:ilvl w:val="0"/>
-          <w:numId w:val="6"/>
-        </w:numPr>
-      </w:pPr>
-      <w:r>
-        <w:t>Able to invest fake money</w:t>
-      </w:r>
-      <w:r>
-        <w:t>.</w:t>
-      </w:r>
-    </w:p>
-    <w:p>
-      <w:pPr>
-        <w:pStyle w:val="ListParagraph"/>
-        <w:numPr>
-          <w:ilvl w:val="0"/>
-          <w:numId w:val="6"/>
-        </w:numPr>
-      </w:pPr>
-      <w:r>
-        <w:t>Able to see and compare</w:t>
-      </w:r>
-      <w:r>
-        <w:t xml:space="preserve"> investment values from various times.</w:t>
-      </w:r>
-    </w:p>
-    <w:p>
-      <w:pPr>
-        <w:pStyle w:val="ListParagraph"/>
-        <w:numPr>
-          <w:ilvl w:val="0"/>
-          <w:numId w:val="6"/>
-        </w:numPr>
-      </w:pPr>
-      <w:r>
-        <w:t>Although</w:t>
-      </w:r>
-      <w:r>
-        <w:t xml:space="preserve"> </w:t>
-      </w:r>
-      <w:r>
-        <w:t xml:space="preserve">websites/apps that do this already exist, the market </w:t>
-      </w:r>
-      <w:r>
-        <w:t>is not</w:t>
-      </w:r>
-      <w:r>
-        <w:t xml:space="preserve"> that large.</w:t>
-      </w:r>
-    </w:p>
-    <w:p>
-      <w:pPr>
-        <w:rPr>
-          <w:b/>
-          <w:bCs/>
-        </w:rPr>
-      </w:pPr>
-    </w:p>
-    <w:p>
-      <w:pPr>
-        <w:rPr>
-          <w:b/>
-          <w:bCs/>
-        </w:rPr>
-      </w:pPr>
-      <w:r>
-        <w:rPr>
-          <w:b/>
-          <w:bCs/>
-        </w:rPr>
-        <w:br w:type="page"/>
-      </w:r>
-    </w:p>
-    <w:p>
-      <w:pPr>
-        <w:rPr>
-          <w:b/>
-          <w:bCs/>
-        </w:rPr>
-      </w:pPr>
-      <w:r>
-        <w:rPr>
-          <w:b/>
-          <w:bCs/>
-        </w:rPr>
-        <w:lastRenderedPageBreak/>
-        <w:t>Specifications</w:t>
-      </w:r>
-      <w:r>
-        <w:rPr>
-          <w:b/>
-          <w:bCs/>
-        </w:rPr>
-        <w:t xml:space="preserve"> for computer vision guitar pedal project</w:t>
-      </w:r>
-      <w:r>
-        <w:rPr>
-          <w:b/>
-          <w:bCs/>
-        </w:rPr>
-        <w:t>:</w:t>
-      </w:r>
-    </w:p>
-    <w:p>
-      <w:pPr>
-        <w:pStyle w:val="ListParagraph"/>
-        <w:numPr>
-          <w:ilvl w:val="0"/>
-          <w:numId w:val="1"/>
-        </w:numPr>
-      </w:pPr>
-      <w:r>
-        <w:t xml:space="preserve">Able to track landmarks on the face mesh, specifically </w:t>
-      </w:r>
-      <w:r>
-        <w:t>top and bottom lips</w:t>
-      </w:r>
-      <w:r>
-        <w:t>.</w:t>
-      </w:r>
-    </w:p>
-    <w:p>
-      <w:pPr>
-        <w:pStyle w:val="ListParagraph"/>
-        <w:numPr>
-          <w:ilvl w:val="0"/>
-          <w:numId w:val="1"/>
-        </w:numPr>
-      </w:pPr>
-      <w:r>
-        <w:t xml:space="preserve">Able to send a MIDI </w:t>
-      </w:r>
-      <w:proofErr w:type="gramStart"/>
-      <w:r>
-        <w:t>CC(</w:t>
-      </w:r>
-      <w:proofErr w:type="gramEnd"/>
-      <w:r>
-        <w:t>control change</w:t>
-      </w:r>
-      <w:r>
-        <w:t>) signal to a guitar plugin</w:t>
-      </w:r>
-      <w:r>
-        <w:t>.</w:t>
-      </w:r>
-    </w:p>
-    <w:p>
-      <w:pPr>
-        <w:pStyle w:val="ListParagraph"/>
-        <w:numPr>
-          <w:ilvl w:val="0"/>
-          <w:numId w:val="1"/>
-        </w:numPr>
-      </w:pPr>
-      <w:r>
-        <w:t xml:space="preserve">Able to </w:t>
-      </w:r>
-      <w:r>
-        <w:t>translate the</w:t>
-      </w:r>
-      <w:r>
-        <w:t xml:space="preserve"> distance between the </w:t>
-      </w:r>
-      <w:r>
-        <w:t>top and bottom lips into a MIDI CC value from 0 to 127</w:t>
-      </w:r>
-      <w:r>
-        <w:t>.</w:t>
-      </w:r>
-    </w:p>
-    <w:p>
-      <w:pPr>
-        <w:pStyle w:val="ListParagraph"/>
-        <w:numPr>
-          <w:ilvl w:val="0"/>
-          <w:numId w:val="1"/>
-        </w:numPr>
-      </w:pPr>
-      <w:r>
-        <w:t>Simple</w:t>
-      </w:r>
-      <w:r>
-        <w:t xml:space="preserve">, modern looking </w:t>
-      </w:r>
-      <w:r>
-        <w:t>GUI</w:t>
-      </w:r>
-      <w:r>
-        <w:t>.</w:t>
-      </w:r>
-    </w:p>
-    <w:p>
-      <w:pPr>
-        <w:pStyle w:val="ListParagraph"/>
-        <w:numPr>
-          <w:ilvl w:val="0"/>
-          <w:numId w:val="1"/>
-        </w:numPr>
-      </w:pPr>
-      <w:r>
-        <w:t>Navigation bar</w:t>
-      </w:r>
-      <w:r>
-        <w:t xml:space="preserve"> on </w:t>
-      </w:r>
-      <w:r>
-        <w:t xml:space="preserve">the bottom of the screen with a settings button, calibration button, and a homepage button. </w:t>
-      </w:r>
-    </w:p>
-    <w:p>
-      <w:pPr>
-        <w:pStyle w:val="ListParagraph"/>
-        <w:numPr>
-          <w:ilvl w:val="0"/>
-          <w:numId w:val="1"/>
-        </w:numPr>
-      </w:pPr>
-      <w:r>
-        <w:t>User can calibrate the mouth wideness to suit their preferences</w:t>
-      </w:r>
-      <w:r>
-        <w:t>.</w:t>
-      </w:r>
-    </w:p>
-    <w:p>
-      <w:pPr>
-        <w:pStyle w:val="ListParagraph"/>
-        <w:numPr>
-          <w:ilvl w:val="0"/>
-          <w:numId w:val="1"/>
-        </w:numPr>
-      </w:pPr>
-      <w:r>
-        <w:t>User can drag a slider in the settings page to manually calibrate the mouth detection.</w:t>
-      </w:r>
-    </w:p>
-    <w:p>
-      <w:pPr>
-        <w:pStyle w:val="ListParagraph"/>
-        <w:numPr>
-          <w:ilvl w:val="0"/>
-          <w:numId w:val="1"/>
-        </w:numPr>
-      </w:pPr>
-      <w:r>
-        <w:t>Responsive design, will f</w:t>
-      </w:r>
-      <w:r>
-        <w:t>it to desktop, tablet, and phone screens</w:t>
-      </w:r>
-    </w:p>
-    <w:p>
-      <w:pPr>
-        <w:rPr>
-          <w:b/>
-          <w:bCs/>
-        </w:rPr>
-      </w:pPr>
-    </w:p>
-    <w:p>
-      <w:pPr>
-        <w:rPr>
-          <w:b/>
-          <w:bCs/>
-        </w:rPr>
-      </w:pPr>
-      <w:r>
-        <w:rPr>
-          <w:b/>
-          <w:bCs/>
-        </w:rPr>
-        <w:t>Advanced techniques:</w:t>
-      </w:r>
-    </w:p>
-    <w:p>
-      <w:pPr>
-        <w:pStyle w:val="ListParagraph"/>
-        <w:numPr>
-          <w:ilvl w:val="0"/>
-          <w:numId w:val="14"/>
-        </w:numPr>
-      </w:pPr>
-      <w:r>
-        <w:t xml:space="preserve">Media queries – </w:t>
-      </w:r>
-      <w:r>
-        <w:t>The layout of the</w:t>
-      </w:r>
-      <w:r>
-        <w:t xml:space="preserve"> web app will change depending on what device is using it. Desktops with a horizontal screen will have </w:t>
-      </w:r>
-      <w:proofErr w:type="gramStart"/>
-      <w:r>
-        <w:t>all of</w:t>
-      </w:r>
-      <w:proofErr w:type="gramEnd"/>
-      <w:r>
-        <w:t xml:space="preserve"> the functions and settings on one page, whereas people using </w:t>
-      </w:r>
-      <w:r>
-        <w:t>phones will be shown a navigation bar on the bottom leading to each page.</w:t>
-      </w:r>
-    </w:p>
-    <w:p>
-      <w:pPr>
-        <w:pStyle w:val="ListParagraph"/>
-      </w:pPr>
-    </w:p>
-    <w:p>
-      <w:pPr>
-        <w:pStyle w:val="ListParagraph"/>
-        <w:numPr>
-          <w:ilvl w:val="0"/>
-          <w:numId w:val="14"/>
-        </w:numPr>
-      </w:pPr>
-      <w:r>
-        <w:t xml:space="preserve">JSON data files </w:t>
-      </w:r>
-      <w:r>
-        <w:t>–</w:t>
-      </w:r>
-      <w:r>
-        <w:t xml:space="preserve"> </w:t>
-      </w:r>
-      <w:r>
-        <w:t xml:space="preserve">Settings for the webapp will be saved in a JSON file so that they </w:t>
-      </w:r>
-      <w:r>
-        <w:t>stay the same after closing the app. Each time the user changes a setting, it’s new value will be written to the JSON file.</w:t>
-      </w:r>
-    </w:p>
-    <w:p>
-      <w:pPr>
-        <w:pStyle w:val="ListParagraph"/>
-      </w:pPr>
-    </w:p>
-    <w:p>
-      <w:pPr>
-        <w:pStyle w:val="ListParagraph"/>
-        <w:numPr>
-          <w:ilvl w:val="0"/>
-          <w:numId w:val="14"/>
-        </w:numPr>
-      </w:pPr>
-      <w:r>
-        <w:t>CSS Grid – Used to create identically sized buttons in the navigation bar which scale according to the screen width.</w:t>
-      </w:r>
-      <w:r>
-        <w:t xml:space="preserve"> Also used to display everything on one screen, side by side on a desktop screen.</w:t>
-      </w:r>
-    </w:p>
-    <w:p>
-      <w:pPr>
-        <w:rPr>
-          <w:b/>
-          <w:bCs/>
-        </w:rPr>
-      </w:pPr>
-    </w:p>
-    <w:p>
-      <w:pPr>
-        <w:rPr>
-          <w:b/>
-          <w:bCs/>
-        </w:rPr>
-      </w:pPr>
-    </w:p>
-    <w:p>
-      <w:pPr>
-        <w:rPr>
-          <w:b/>
-          <w:bCs/>
-        </w:rPr>
-      </w:pPr>
-    </w:p>
-    <w:p>
-      <w:pPr>
-        <w:rPr>
-          <w:b/>
-          <w:bCs/>
-        </w:rPr>
-      </w:pPr>
-    </w:p>
-    <w:p>
-      <w:pPr>
-        <w:rPr>
-          <w:b/>
-          <w:bCs/>
-        </w:rPr>
-      </w:pPr>
-    </w:p>
-    <w:p>
-      <w:pPr>
-        <w:rPr>
-          <w:b/>
-          <w:bCs/>
-        </w:rPr>
-      </w:pPr>
-    </w:p>
-    <w:p>
-      <w:pPr>
-        <w:rPr>
-          <w:b/>
-          <w:bCs/>
-        </w:rPr>
-      </w:pPr>
-    </w:p>
-    <w:p>
-      <w:pPr>
-        <w:rPr>
-          <w:b/>
-          <w:bCs/>
-        </w:rPr>
-      </w:pPr>
-    </w:p>
-    <w:p>
-      <w:pPr>
-        <w:rPr>
-          <w:b/>
-          <w:bCs/>
-        </w:rPr>
-      </w:pPr>
-    </w:p>
-    <w:p>
-      <w:pPr>
-        <w:rPr>
-          <w:b/>
-          <w:bCs/>
-        </w:rPr>
-      </w:pPr>
-    </w:p>
-    <w:p>
-      <w:pPr>
-        <w:rPr>
-          <w:b/>
-          <w:bCs/>
-        </w:rPr>
-      </w:pPr>
-    </w:p>
     <w:p>
       <w:r>
         <w:rPr>
@@ -1213,73 +368,73 @@
         </w:numPr>
       </w:pPr>
       <w:r>
+        <w:t xml:space="preserve">Mido </w:t>
+      </w:r>
+      <w:r>
+        <w:t>still uses python-</w:t>
+      </w:r>
+      <w:proofErr w:type="spellStart"/>
+      <w:r>
+        <w:t>rtmidi</w:t>
+      </w:r>
+      <w:proofErr w:type="spellEnd"/>
+      <w:r>
+        <w:t>, it just acts as a wrapper to make python-</w:t>
+      </w:r>
+      <w:proofErr w:type="spellStart"/>
+      <w:r>
+        <w:t>rtmidi</w:t>
+      </w:r>
+      <w:proofErr w:type="spellEnd"/>
+      <w:r>
+        <w:t xml:space="preserve"> easier to work with</w:t>
+      </w:r>
+      <w:r>
+        <w:t xml:space="preserve">. This and </w:t>
+      </w:r>
+      <w:proofErr w:type="spellStart"/>
+      <w:r>
+        <w:t>Pygame</w:t>
+      </w:r>
+      <w:proofErr w:type="spellEnd"/>
+      <w:r>
+        <w:t xml:space="preserve"> MIDI are the simplest to use, but </w:t>
+      </w:r>
+      <w:proofErr w:type="spellStart"/>
+      <w:r>
+        <w:t>Pygame</w:t>
+      </w:r>
+      <w:proofErr w:type="spellEnd"/>
+      <w:r>
+        <w:t xml:space="preserve"> is less suited for my use case because</w:t>
+      </w:r>
+      <w:r>
+        <w:t xml:space="preserve"> it is primarily for game windows. </w:t>
+      </w:r>
+      <w:r>
+        <w:t>So,</w:t>
+      </w:r>
+      <w:r>
+        <w:t xml:space="preserve"> I will use Mido and python-</w:t>
+      </w:r>
+      <w:proofErr w:type="spellStart"/>
+      <w:r>
+        <w:t>rtmidi</w:t>
+      </w:r>
+      <w:proofErr w:type="spellEnd"/>
+      <w:r>
+        <w:t xml:space="preserve"> to send MIDI signals to my guitar plugin.</w:t>
+      </w:r>
+    </w:p>
+    <w:p>
+      <w:pPr>
+        <w:pStyle w:val="ListParagraph"/>
+      </w:pPr>
+      <w:r>
+        <w:rPr>
+          <w:noProof/>
+        </w:rPr>
         <w:lastRenderedPageBreak/>
-        <w:t xml:space="preserve">Mido </w:t>
-      </w:r>
-      <w:r>
-        <w:t>still uses python-</w:t>
-      </w:r>
-      <w:proofErr w:type="spellStart"/>
-      <w:r>
-        <w:t>rtmidi</w:t>
-      </w:r>
-      <w:proofErr w:type="spellEnd"/>
-      <w:r>
-        <w:t>, it just acts as a wrapper to make python-</w:t>
-      </w:r>
-      <w:proofErr w:type="spellStart"/>
-      <w:r>
-        <w:t>rtmidi</w:t>
-      </w:r>
-      <w:proofErr w:type="spellEnd"/>
-      <w:r>
-        <w:t xml:space="preserve"> easier to work with</w:t>
-      </w:r>
-      <w:r>
-        <w:t xml:space="preserve">. This and </w:t>
-      </w:r>
-      <w:proofErr w:type="spellStart"/>
-      <w:r>
-        <w:t>Pygame</w:t>
-      </w:r>
-      <w:proofErr w:type="spellEnd"/>
-      <w:r>
-        <w:t xml:space="preserve"> MIDI are the simplest to use, but </w:t>
-      </w:r>
-      <w:proofErr w:type="spellStart"/>
-      <w:r>
-        <w:t>Pygame</w:t>
-      </w:r>
-      <w:proofErr w:type="spellEnd"/>
-      <w:r>
-        <w:t xml:space="preserve"> is less suited for my use case because</w:t>
-      </w:r>
-      <w:r>
-        <w:t xml:space="preserve"> it is primarily for game windows. </w:t>
-      </w:r>
-      <w:r>
-        <w:t>So,</w:t>
-      </w:r>
-      <w:r>
-        <w:t xml:space="preserve"> I will use Mido and python-</w:t>
-      </w:r>
-      <w:proofErr w:type="spellStart"/>
-      <w:r>
-        <w:t>rtmidi</w:t>
-      </w:r>
-      <w:proofErr w:type="spellEnd"/>
-      <w:r>
-        <w:t xml:space="preserve"> to send MIDI signals to my guitar plugin.</w:t>
-      </w:r>
-    </w:p>
-    <w:p>
-      <w:pPr>
-        <w:pStyle w:val="ListParagraph"/>
-      </w:pPr>
-      <w:r>
-        <w:rPr>
-          <w:noProof/>
-        </w:rPr>
         <w:drawing>
           <wp:inline distT="0" distB="0" distL="0" distR="0" wp14:anchorId="4DF2595F" wp14:editId="165876F9">
             <wp:extent cx="5731510" cy="981075"/>
@@ -5723,6 +4878,9 @@
         <w:pStyle w:val="ListParagraph"/>
       </w:pPr>
       <w:r>
+        <w:rPr>
+          <w:noProof/>
+        </w:rPr>
         <w:drawing>
           <wp:inline distT="0" distB="0" distL="0" distR="0" wp14:anchorId="17BAF9D3" wp14:editId="4C7C10B9">
             <wp:extent cx="4443413" cy="1576314"/>
@@ -5765,6 +4923,9 @@
         <w:ind w:firstLine="720"/>
       </w:pPr>
       <w:r>
+        <w:rPr>
+          <w:noProof/>
+        </w:rPr>
         <w:drawing>
           <wp:inline distT="0" distB="0" distL="0" distR="0" wp14:anchorId="6F8AF5FB" wp14:editId="3ABFAA1F">
             <wp:extent cx="2300192" cy="2290763"/>
@@ -5813,7 +4974,7 @@
 </file>
 
 <file path=word/endnotes.xml><?xml version="1.0" encoding="utf-8"?>
-<w:endnotes xmlns:wpc="http://schemas.microsoft.com/office/word/2010/wordprocessingCanvas" xmlns:cx="http://schemas.microsoft.com/office/drawing/2014/chartex" xmlns:cx1="http://schemas.microsoft.com/office/drawing/2015/9/8/chartex" xmlns:cx2="http://schemas.microsoft.com/office/drawing/2015/10/21/chartex" xmlns:cx3="http://schemas.microsoft.com/office/drawing/2016/5/9/chartex" xmlns:cx4="http://schemas.microsoft.com/office/drawing/2016/5/10/chartex" xmlns:cx5="http://schemas.microsoft.com/office/drawing/2016/5/11/chartex" xmlns:cx6="http://schemas.microsoft.com/office/drawing/2016/5/12/chartex" xmlns:cx7="http://schemas.microsoft.com/office/drawing/2016/5/13/chartex" xmlns:cx8="http://schemas.microsoft.com/office/drawing/2016/5/14/chartex" xmlns:mc="http://schemas.openxmlformats.org/markup-compatibility/2006" xmlns:aink="http://schemas.microsoft.com/office/drawing/2016/ink" xmlns:am3d="http://schemas.microsoft.com/office/drawing/2017/model3d" xmlns:o="urn:schemas-microsoft-com:office:office" xmlns:oel="http://schemas.microsoft.com/office/2019/extlst" xmlns:r="http://schemas.openxmlformats.org/officeDocument/2006/relationships" xmlns:m="http://schemas.openxmlformats.org/officeDocument/2006/math" xmlns:v="urn:schemas-microsoft-com:vml" xmlns:wp14="http://schemas.microsoft.com/office/word/2010/wordprocessingDrawing" xmlns:wp="http://schemas.openxmlformats.org/drawingml/2006/wordprocessingDrawing" xmlns:w10="urn:schemas-microsoft-com:office:word" xmlns:w="http://schemas.openxmlformats.org/wordprocessingml/2006/main" xmlns:w14="http://schemas.microsoft.com/office/word/2010/wordml" xmlns:w15="http://schemas.microsoft.com/office/word/2012/wordml" xmlns:w16cei="http://schemas.microsoft.com/office/word/2026/wordml/cei" xmlns:w16cex="http://schemas.microsoft.com/office/word/2018/wordml/cex" xmlns:w16cid="http://schemas.microsoft.com/office/word/2016/wordml/cid" xmlns:w16="http://schemas.microsoft.com/office/word/2018/wordml" xmlns:w16du="http://schemas.microsoft.com/office/word/2023/wordml/word16du" xmlns:w16sdtdh="http://schemas.microsoft.com/office/word/2020/wordml/sdtdatahash" xmlns:w16sdtfl="http://schemas.microsoft.com/office/word/2024/wordml/sdtformatlock" xmlns:w16se="http://schemas.microsoft.com/office/word/2015/wordml/symex" xmlns:wpg="http://schemas.microsoft.com/office/word/2010/wordprocessingGroup" xmlns:wpi="http://schemas.microsoft.com/office/word/2010/wordprocessingInk" xmlns:wne="http://schemas.microsoft.com/office/word/2006/wordml" xmlns:wps="http://schemas.microsoft.com/office/word/2010/wordprocessingShape" mc:Ignorable="w14 w15 w16se w16cid w16 w16cex w16sdtdh w16sdtfl w16du wp14">
+<w:endnotes xmlns:wpc="http://schemas.microsoft.com/office/word/2010/wordprocessingCanvas" xmlns:cx="http://schemas.microsoft.com/office/drawing/2014/chartex" xmlns:cx1="http://schemas.microsoft.com/office/drawing/2015/9/8/chartex" xmlns:cx2="http://schemas.microsoft.com/office/drawing/2015/10/21/chartex" xmlns:cx3="http://schemas.microsoft.com/office/drawing/2016/5/9/chartex" xmlns:cx4="http://schemas.microsoft.com/office/drawing/2016/5/10/chartex" xmlns:cx5="http://schemas.microsoft.com/office/drawing/2016/5/11/chartex" xmlns:cx6="http://schemas.microsoft.com/office/drawing/2016/5/12/chartex" xmlns:cx7="http://schemas.microsoft.com/office/drawing/2016/5/13/chartex" xmlns:cx8="http://schemas.microsoft.com/office/drawing/2016/5/14/chartex" xmlns:mc="http://schemas.openxmlformats.org/markup-compatibility/2006" xmlns:aink="http://schemas.microsoft.com/office/drawing/2016/ink" xmlns:am3d="http://schemas.microsoft.com/office/drawing/2017/model3d" xmlns:o="urn:schemas-microsoft-com:office:office" xmlns:oel="http://schemas.microsoft.com/office/2019/extlst" xmlns:r="http://schemas.openxmlformats.org/officeDocument/2006/relationships" xmlns:m="http://schemas.openxmlformats.org/officeDocument/2006/math" xmlns:v="urn:schemas-microsoft-com:vml" xmlns:wp14="http://schemas.microsoft.com/office/word/2010/wordprocessingDrawing" xmlns:wp="http://schemas.openxmlformats.org/drawingml/2006/wordprocessingDrawing" xmlns:w10="urn:schemas-microsoft-com:office:word" xmlns:w="http://schemas.openxmlformats.org/wordprocessingml/2006/main" xmlns:w14="http://schemas.microsoft.com/office/word/2010/wordml" xmlns:w15="http://schemas.microsoft.com/office/word/2012/wordml" xmlns:w16cex="http://schemas.microsoft.com/office/word/2018/wordml/cex" xmlns:w16cid="http://schemas.microsoft.com/office/word/2016/wordml/cid" xmlns:w16="http://schemas.microsoft.com/office/word/2018/wordml" xmlns:w16du="http://schemas.microsoft.com/office/word/2023/wordml/word16du" xmlns:w16sdtdh="http://schemas.microsoft.com/office/word/2020/wordml/sdtdatahash" xmlns:w16sdtfl="http://schemas.microsoft.com/office/word/2024/wordml/sdtformatlock" xmlns:w16se="http://schemas.microsoft.com/office/word/2015/wordml/symex" xmlns:wpg="http://schemas.microsoft.com/office/word/2010/wordprocessingGroup" xmlns:wpi="http://schemas.microsoft.com/office/word/2010/wordprocessingInk" xmlns:wne="http://schemas.microsoft.com/office/word/2006/wordml" xmlns:wps="http://schemas.microsoft.com/office/word/2010/wordprocessingShape" mc:Ignorable="w14 w15 w16se w16cid w16 w16cex w16sdtdh w16sdtfl w16du wp14">
   <w:endnote w:type="separator" w:id="-1">
     <w:p>
       <w:pPr>
@@ -5838,7 +4999,7 @@
 </file>
 
 <file path=word/footnotes.xml><?xml version="1.0" encoding="utf-8"?>
-<w:footnotes xmlns:wpc="http://schemas.microsoft.com/office/word/2010/wordprocessingCanvas" xmlns:cx="http://schemas.microsoft.com/office/drawing/2014/chartex" xmlns:cx1="http://schemas.microsoft.com/office/drawing/2015/9/8/chartex" xmlns:cx2="http://schemas.microsoft.com/office/drawing/2015/10/21/chartex" xmlns:cx3="http://schemas.microsoft.com/office/drawing/2016/5/9/chartex" xmlns:cx4="http://schemas.microsoft.com/office/drawing/2016/5/10/chartex" xmlns:cx5="http://schemas.microsoft.com/office/drawing/2016/5/11/chartex" xmlns:cx6="http://schemas.microsoft.com/office/drawing/2016/5/12/chartex" xmlns:cx7="http://schemas.microsoft.com/office/drawing/2016/5/13/chartex" xmlns:cx8="http://schemas.microsoft.com/office/drawing/2016/5/14/chartex" xmlns:mc="http://schemas.openxmlformats.org/markup-compatibility/2006" xmlns:aink="http://schemas.microsoft.com/office/drawing/2016/ink" xmlns:am3d="http://schemas.microsoft.com/office/drawing/2017/model3d" xmlns:o="urn:schemas-microsoft-com:office:office" xmlns:oel="http://schemas.microsoft.com/office/2019/extlst" xmlns:r="http://schemas.openxmlformats.org/officeDocument/2006/relationships" xmlns:m="http://schemas.openxmlformats.org/officeDocument/2006/math" xmlns:v="urn:schemas-microsoft-com:vml" xmlns:wp14="http://schemas.microsoft.com/office/word/2010/wordprocessingDrawing" xmlns:wp="http://schemas.openxmlformats.org/drawingml/2006/wordprocessingDrawing" xmlns:w10="urn:schemas-microsoft-com:office:word" xmlns:w="http://schemas.openxmlformats.org/wordprocessingml/2006/main" xmlns:w14="http://schemas.microsoft.com/office/word/2010/wordml" xmlns:w15="http://schemas.microsoft.com/office/word/2012/wordml" xmlns:w16cei="http://schemas.microsoft.com/office/word/2026/wordml/cei" xmlns:w16cex="http://schemas.microsoft.com/office/word/2018/wordml/cex" xmlns:w16cid="http://schemas.microsoft.com/office/word/2016/wordml/cid" xmlns:w16="http://schemas.microsoft.com/office/word/2018/wordml" xmlns:w16du="http://schemas.microsoft.com/office/word/2023/wordml/word16du" xmlns:w16sdtdh="http://schemas.microsoft.com/office/word/2020/wordml/sdtdatahash" xmlns:w16sdtfl="http://schemas.microsoft.com/office/word/2024/wordml/sdtformatlock" xmlns:w16se="http://schemas.microsoft.com/office/word/2015/wordml/symex" xmlns:wpg="http://schemas.microsoft.com/office/word/2010/wordprocessingGroup" xmlns:wpi="http://schemas.microsoft.com/office/word/2010/wordprocessingInk" xmlns:wne="http://schemas.microsoft.com/office/word/2006/wordml" xmlns:wps="http://schemas.microsoft.com/office/word/2010/wordprocessingShape" mc:Ignorable="w14 w15 w16se w16cid w16 w16cex w16sdtdh w16sdtfl w16du wp14">
+<w:footnotes xmlns:wpc="http://schemas.microsoft.com/office/word/2010/wordprocessingCanvas" xmlns:cx="http://schemas.microsoft.com/office/drawing/2014/chartex" xmlns:cx1="http://schemas.microsoft.com/office/drawing/2015/9/8/chartex" xmlns:cx2="http://schemas.microsoft.com/office/drawing/2015/10/21/chartex" xmlns:cx3="http://schemas.microsoft.com/office/drawing/2016/5/9/chartex" xmlns:cx4="http://schemas.microsoft.com/office/drawing/2016/5/10/chartex" xmlns:cx5="http://schemas.microsoft.com/office/drawing/2016/5/11/chartex" xmlns:cx6="http://schemas.microsoft.com/office/drawing/2016/5/12/chartex" xmlns:cx7="http://schemas.microsoft.com/office/drawing/2016/5/13/chartex" xmlns:cx8="http://schemas.microsoft.com/office/drawing/2016/5/14/chartex" xmlns:mc="http://schemas.openxmlformats.org/markup-compatibility/2006" xmlns:aink="http://schemas.microsoft.com/office/drawing/2016/ink" xmlns:am3d="http://schemas.microsoft.com/office/drawing/2017/model3d" xmlns:o="urn:schemas-microsoft-com:office:office" xmlns:oel="http://schemas.microsoft.com/office/2019/extlst" xmlns:r="http://schemas.openxmlformats.org/officeDocument/2006/relationships" xmlns:m="http://schemas.openxmlformats.org/officeDocument/2006/math" xmlns:v="urn:schemas-microsoft-com:vml" xmlns:wp14="http://schemas.microsoft.com/office/word/2010/wordprocessingDrawing" xmlns:wp="http://schemas.openxmlformats.org/drawingml/2006/wordprocessingDrawing" xmlns:w10="urn:schemas-microsoft-com:office:word" xmlns:w="http://schemas.openxmlformats.org/wordprocessingml/2006/main" xmlns:w14="http://schemas.microsoft.com/office/word/2010/wordml" xmlns:w15="http://schemas.microsoft.com/office/word/2012/wordml" xmlns:w16cex="http://schemas.microsoft.com/office/word/2018/wordml/cex" xmlns:w16cid="http://schemas.microsoft.com/office/word/2016/wordml/cid" xmlns:w16="http://schemas.microsoft.com/office/word/2018/wordml" xmlns:w16du="http://schemas.microsoft.com/office/word/2023/wordml/word16du" xmlns:w16sdtdh="http://schemas.microsoft.com/office/word/2020/wordml/sdtdatahash" xmlns:w16sdtfl="http://schemas.microsoft.com/office/word/2024/wordml/sdtformatlock" xmlns:w16se="http://schemas.microsoft.com/office/word/2015/wordml/symex" xmlns:wpg="http://schemas.microsoft.com/office/word/2010/wordprocessingGroup" xmlns:wpi="http://schemas.microsoft.com/office/word/2010/wordprocessingInk" xmlns:wne="http://schemas.microsoft.com/office/word/2006/wordml" xmlns:wps="http://schemas.microsoft.com/office/word/2010/wordprocessingShape" mc:Ignorable="w14 w15 w16se w16cid w16 w16cex w16sdtdh w16sdtfl w16du wp14">
   <w:footnote w:type="separator" w:id="-1">
     <w:p>
       <w:pPr>
@@ -5863,7 +5024,7 @@
 </file>
 
 <file path=word/numbering.xml><?xml version="1.0" encoding="utf-8"?>
-<w:numbering xmlns:wpc="http://schemas.microsoft.com/office/word/2010/wordprocessingCanvas" xmlns:cx="http://schemas.microsoft.com/office/drawing/2014/chartex" xmlns:cx1="http://schemas.microsoft.com/office/drawing/2015/9/8/chartex" xmlns:cx2="http://schemas.microsoft.com/office/drawing/2015/10/21/chartex" xmlns:cx3="http://schemas.microsoft.com/office/drawing/2016/5/9/chartex" xmlns:cx4="http://schemas.microsoft.com/office/drawing/2016/5/10/chartex" xmlns:cx5="http://schemas.microsoft.com/office/drawing/2016/5/11/chartex" xmlns:cx6="http://schemas.microsoft.com/office/drawing/2016/5/12/chartex" xmlns:cx7="http://schemas.microsoft.com/office/drawing/2016/5/13/chartex" xmlns:cx8="http://schemas.microsoft.com/office/drawing/2016/5/14/chartex" xmlns:mc="http://schemas.openxmlformats.org/markup-compatibility/2006" xmlns:aink="http://schemas.microsoft.com/office/drawing/2016/ink" xmlns:am3d="http://schemas.microsoft.com/office/drawing/2017/model3d" xmlns:o="urn:schemas-microsoft-com:office:office" xmlns:oel="http://schemas.microsoft.com/office/2019/extlst" xmlns:r="http://schemas.openxmlformats.org/officeDocument/2006/relationships" xmlns:m="http://schemas.openxmlformats.org/officeDocument/2006/math" xmlns:v="urn:schemas-microsoft-com:vml" xmlns:wp14="http://schemas.microsoft.com/office/word/2010/wordprocessingDrawing" xmlns:wp="http://schemas.openxmlformats.org/drawingml/2006/wordprocessingDrawing" xmlns:w10="urn:schemas-microsoft-com:office:word" xmlns:w="http://schemas.openxmlformats.org/wordprocessingml/2006/main" xmlns:w14="http://schemas.microsoft.com/office/word/2010/wordml" xmlns:w15="http://schemas.microsoft.com/office/word/2012/wordml" xmlns:w16cei="http://schemas.microsoft.com/office/word/2026/wordml/cei" xmlns:w16cex="http://schemas.microsoft.com/office/word/2018/wordml/cex" xmlns:w16cid="http://schemas.microsoft.com/office/word/2016/wordml/cid" xmlns:w16="http://schemas.microsoft.com/office/word/2018/wordml" xmlns:w16du="http://schemas.microsoft.com/office/word/2023/wordml/word16du" xmlns:w16sdtdh="http://schemas.microsoft.com/office/word/2020/wordml/sdtdatahash" xmlns:w16sdtfl="http://schemas.microsoft.com/office/word/2024/wordml/sdtformatlock" xmlns:w16se="http://schemas.microsoft.com/office/word/2015/wordml/symex" xmlns:wpg="http://schemas.microsoft.com/office/word/2010/wordprocessingGroup" xmlns:wpi="http://schemas.microsoft.com/office/word/2010/wordprocessingInk" xmlns:wne="http://schemas.microsoft.com/office/word/2006/wordml" xmlns:wps="http://schemas.microsoft.com/office/word/2010/wordprocessingShape" mc:Ignorable="w14 w15 w16se w16cid w16 w16cex w16sdtdh w16sdtfl w16du wp14">
+<w:numbering xmlns:wpc="http://schemas.microsoft.com/office/word/2010/wordprocessingCanvas" xmlns:cx="http://schemas.microsoft.com/office/drawing/2014/chartex" xmlns:cx1="http://schemas.microsoft.com/office/drawing/2015/9/8/chartex" xmlns:cx2="http://schemas.microsoft.com/office/drawing/2015/10/21/chartex" xmlns:cx3="http://schemas.microsoft.com/office/drawing/2016/5/9/chartex" xmlns:cx4="http://schemas.microsoft.com/office/drawing/2016/5/10/chartex" xmlns:cx5="http://schemas.microsoft.com/office/drawing/2016/5/11/chartex" xmlns:cx6="http://schemas.microsoft.com/office/drawing/2016/5/12/chartex" xmlns:cx7="http://schemas.microsoft.com/office/drawing/2016/5/13/chartex" xmlns:cx8="http://schemas.microsoft.com/office/drawing/2016/5/14/chartex" xmlns:mc="http://schemas.openxmlformats.org/markup-compatibility/2006" xmlns:aink="http://schemas.microsoft.com/office/drawing/2016/ink" xmlns:am3d="http://schemas.microsoft.com/office/drawing/2017/model3d" xmlns:o="urn:schemas-microsoft-com:office:office" xmlns:oel="http://schemas.microsoft.com/office/2019/extlst" xmlns:r="http://schemas.openxmlformats.org/officeDocument/2006/relationships" xmlns:m="http://schemas.openxmlformats.org/officeDocument/2006/math" xmlns:v="urn:schemas-microsoft-com:vml" xmlns:wp14="http://schemas.microsoft.com/office/word/2010/wordprocessingDrawing" xmlns:wp="http://schemas.openxmlformats.org/drawingml/2006/wordprocessingDrawing" xmlns:w10="urn:schemas-microsoft-com:office:word" xmlns:w="http://schemas.openxmlformats.org/wordprocessingml/2006/main" xmlns:w14="http://schemas.microsoft.com/office/word/2010/wordml" xmlns:w15="http://schemas.microsoft.com/office/word/2012/wordml" xmlns:w16cex="http://schemas.microsoft.com/office/word/2018/wordml/cex" xmlns:w16cid="http://schemas.microsoft.com/office/word/2016/wordml/cid" xmlns:w16="http://schemas.microsoft.com/office/word/2018/wordml" xmlns:w16du="http://schemas.microsoft.com/office/word/2023/wordml/word16du" xmlns:w16sdtdh="http://schemas.microsoft.com/office/word/2020/wordml/sdtdatahash" xmlns:w16sdtfl="http://schemas.microsoft.com/office/word/2024/wordml/sdtformatlock" xmlns:w16se="http://schemas.microsoft.com/office/word/2015/wordml/symex" xmlns:wpg="http://schemas.microsoft.com/office/word/2010/wordprocessingGroup" xmlns:wpi="http://schemas.microsoft.com/office/word/2010/wordprocessingInk" xmlns:wne="http://schemas.microsoft.com/office/word/2006/wordml" xmlns:wps="http://schemas.microsoft.com/office/word/2010/wordprocessingShape" mc:Ignorable="w14 w15 w16se w16cid w16 w16cex w16sdtdh w16sdtfl w16du wp14">
   <w:abstractNum w:abstractNumId="0" w15:restartNumberingAfterBreak="0">
     <w:nsid w:val="05B63B47"/>
     <w:multiLevelType w:val="hybridMultilevel"/>

</xml_diff>